<commit_message>
Align CKA LP and LG format to match CKAD courseware
LP changes:
- Replace Method column with Slides column (actual slide numbers from CKA pptx)
- Add Course Overview and Learning Outcomes sections (15 outcomes)
- Split each day into Morning / Lunch / Afternoon session sub-tables
- Add Labs Covered table (31 labs with Domain/Topic/Title)
- Add Assessment section

LG changes:
- Promote Lab titles from Heading 2 → Heading 1 (matches CKAD)
- Promote Goal/Steps from Heading 3 → Heading 2
- Remove standalone 'Introduction' heading (content stays as normal paragraphs)
- Number Before-You-Start subsections as 0.1, 0.2
- Fix lab header separator: spaces → ' · '

Co-Authored-By: Claude Sonnet 4.6 <noreply@anthropic.com>
</commit_message>
<xml_diff>
--- a/courseware/LG-Certified-Kubernetes-Administrator-CKA.docx
+++ b/courseware/LG-Certified-Kubernetes-Administrator-CKA.docx
@@ -336,12 +336,8 @@
       </w:r>
     </w:p>
     <w:p>
-      <w:pPr>
-        <w:pStyle w:val="Heading1"/>
-      </w:pPr>
-      <w:r>
-        <w:t>Introduction</w:t>
-      </w:r>
+      <w:pPr/>
+      <w:r/>
     </w:p>
     <w:p>
       <w:r>
@@ -655,7 +651,7 @@
         <w:pStyle w:val="Heading2"/>
       </w:pPr>
       <w:r>
-        <w:t>What you need</w:t>
+        <w:t>0.1 What you need</w:t>
       </w:r>
     </w:p>
     <w:tbl>
@@ -1037,7 +1033,7 @@
         <w:pStyle w:val="Heading2"/>
       </w:pPr>
       <w:r>
-        <w:t>Exam-speed aliases — set these before every session</w:t>
+        <w:t>0.2 Exam-speed aliases — set these before every session</w:t>
       </w:r>
     </w:p>
     <w:p>
@@ -1129,58 +1125,48 @@
     </w:p>
     <w:p>
       <w:pPr>
+        <w:pStyle w:val="Heading1"/>
+      </w:pPr>
+      <w:r>
+        <w:t>Lab 1 — kubeadm Prerequisites and Container Runtime</w:t>
+      </w:r>
+    </w:p>
+    <w:p>
+      <w:r>
+        <w:rPr>
+          <w:b/>
+        </w:rPr>
+        <w:t>Domain: Cluster Architecture, Installation &amp; Configuration  ·  Topic: Cluster installation  ·  Duration: 45 min  ·  Killercoda: https://killercoda.com/playgrounds/scenario/kubeadm</w:t>
+      </w:r>
+      <w:r/>
+      <w:r>
+        <w:rPr>
+          <w:b/>
+        </w:rPr>
+      </w:r>
+      <w:r/>
+      <w:r>
+        <w:rPr>
+          <w:b/>
+        </w:rPr>
+      </w:r>
+      <w:r/>
+      <w:r>
+        <w:rPr>
+          <w:b/>
+        </w:rPr>
+      </w:r>
+      <w:r>
+        <w:rPr>
+          <w:color w:val="1F6FEB"/>
+        </w:rPr>
+      </w:r>
+    </w:p>
+    <w:p>
+      <w:pPr>
         <w:pStyle w:val="Heading2"/>
       </w:pPr>
       <w:r>
-        <w:t>Lab 1 — kubeadm Prerequisites and Container Runtime</w:t>
-      </w:r>
-    </w:p>
-    <w:p>
-      <w:r>
-        <w:rPr>
-          <w:b/>
-        </w:rPr>
-        <w:t xml:space="preserve">Domain: </w:t>
-      </w:r>
-      <w:r>
-        <w:t xml:space="preserve">Cluster Architecture, Installation &amp; Configuration   </w:t>
-      </w:r>
-      <w:r>
-        <w:rPr>
-          <w:b/>
-        </w:rPr>
-        <w:t xml:space="preserve">Topic: </w:t>
-      </w:r>
-      <w:r>
-        <w:t xml:space="preserve">Cluster installation   </w:t>
-      </w:r>
-      <w:r>
-        <w:rPr>
-          <w:b/>
-        </w:rPr>
-        <w:t xml:space="preserve">Duration: </w:t>
-      </w:r>
-      <w:r>
-        <w:t xml:space="preserve">45 min   </w:t>
-      </w:r>
-      <w:r>
-        <w:rPr>
-          <w:b/>
-        </w:rPr>
-        <w:t xml:space="preserve">Killercoda: </w:t>
-      </w:r>
-      <w:r>
-        <w:rPr>
-          <w:color w:val="1F6FEB"/>
-        </w:rPr>
-        <w:t>https://killercoda.com/playgrounds/scenario/kubeadm</w:t>
-      </w:r>
-    </w:p>
-    <w:p>
-      <w:pPr>
-        <w:pStyle w:val="Heading3"/>
-      </w:pPr>
-      <w:r>
         <w:t>Goal</w:t>
       </w:r>
     </w:p>
@@ -1191,7 +1177,7 @@
     </w:p>
     <w:p>
       <w:pPr>
-        <w:pStyle w:val="Heading3"/>
+        <w:pStyle w:val="Heading2"/>
       </w:pPr>
       <w:r>
         <w:t>What you'll build</w:t>
@@ -1204,7 +1190,7 @@
     </w:p>
     <w:p>
       <w:pPr>
-        <w:pStyle w:val="Heading3"/>
+        <w:pStyle w:val="Heading2"/>
       </w:pPr>
       <w:r>
         <w:t>Step 1 — Load kernel modules</w:t>
@@ -1303,7 +1289,7 @@
     <w:p/>
     <w:p>
       <w:pPr>
-        <w:pStyle w:val="Heading3"/>
+        <w:pStyle w:val="Heading2"/>
       </w:pPr>
       <w:r>
         <w:t>Step 2 — Set required sysctls</w:t>
@@ -1402,7 +1388,7 @@
     <w:p/>
     <w:p>
       <w:pPr>
-        <w:pStyle w:val="Heading3"/>
+        <w:pStyle w:val="Heading2"/>
       </w:pPr>
       <w:r>
         <w:t>Step 3 — Disable swap</w:t>
@@ -1441,7 +1427,7 @@
     <w:p/>
     <w:p>
       <w:pPr>
-        <w:pStyle w:val="Heading3"/>
+        <w:pStyle w:val="Heading2"/>
       </w:pPr>
       <w:r>
         <w:t>Step 4 — Install containerd</w:t>
@@ -1537,7 +1523,7 @@
     </w:p>
     <w:p>
       <w:pPr>
-        <w:pStyle w:val="Heading3"/>
+        <w:pStyle w:val="Heading2"/>
       </w:pPr>
       <w:r>
         <w:t>Step 5 — Install kubeadm, kubelet, kubectl</w:t>
@@ -1666,7 +1652,7 @@
     <w:p/>
     <w:p>
       <w:pPr>
-        <w:pStyle w:val="Heading3"/>
+        <w:pStyle w:val="Heading2"/>
       </w:pPr>
       <w:r>
         <w:t>Step 6 — Verify</w:t>
@@ -1733,58 +1719,48 @@
     <w:p/>
     <w:p>
       <w:pPr>
+        <w:pStyle w:val="Heading1"/>
+      </w:pPr>
+      <w:r>
+        <w:t>Lab 2 — kubeadm Bootstrap: init, kubeconfig, Worker Join, Cluster PKI</w:t>
+      </w:r>
+    </w:p>
+    <w:p>
+      <w:r>
+        <w:rPr>
+          <w:b/>
+        </w:rPr>
+        <w:t>Domain: Cluster Architecture, Installation &amp; Configuration  ·  Topic: Cluster installation  ·  Duration: 60 min  ·  Killercoda: https://killercoda.com/playgrounds/scenario/kubeadm</w:t>
+      </w:r>
+      <w:r/>
+      <w:r>
+        <w:rPr>
+          <w:b/>
+        </w:rPr>
+      </w:r>
+      <w:r/>
+      <w:r>
+        <w:rPr>
+          <w:b/>
+        </w:rPr>
+      </w:r>
+      <w:r/>
+      <w:r>
+        <w:rPr>
+          <w:b/>
+        </w:rPr>
+      </w:r>
+      <w:r>
+        <w:rPr>
+          <w:color w:val="1F6FEB"/>
+        </w:rPr>
+      </w:r>
+    </w:p>
+    <w:p>
+      <w:pPr>
         <w:pStyle w:val="Heading2"/>
       </w:pPr>
       <w:r>
-        <w:t>Lab 2 — kubeadm Bootstrap: init, kubeconfig, Worker Join, Cluster PKI</w:t>
-      </w:r>
-    </w:p>
-    <w:p>
-      <w:r>
-        <w:rPr>
-          <w:b/>
-        </w:rPr>
-        <w:t xml:space="preserve">Domain: </w:t>
-      </w:r>
-      <w:r>
-        <w:t xml:space="preserve">Cluster Architecture, Installation &amp; Configuration   </w:t>
-      </w:r>
-      <w:r>
-        <w:rPr>
-          <w:b/>
-        </w:rPr>
-        <w:t xml:space="preserve">Topic: </w:t>
-      </w:r>
-      <w:r>
-        <w:t xml:space="preserve">Cluster installation   </w:t>
-      </w:r>
-      <w:r>
-        <w:rPr>
-          <w:b/>
-        </w:rPr>
-        <w:t xml:space="preserve">Duration: </w:t>
-      </w:r>
-      <w:r>
-        <w:t xml:space="preserve">60 min   </w:t>
-      </w:r>
-      <w:r>
-        <w:rPr>
-          <w:b/>
-        </w:rPr>
-        <w:t xml:space="preserve">Killercoda: </w:t>
-      </w:r>
-      <w:r>
-        <w:rPr>
-          <w:color w:val="1F6FEB"/>
-        </w:rPr>
-        <w:t>https://killercoda.com/playgrounds/scenario/kubeadm</w:t>
-      </w:r>
-    </w:p>
-    <w:p>
-      <w:pPr>
-        <w:pStyle w:val="Heading3"/>
-      </w:pPr>
-      <w:r>
         <w:t>Goal</w:t>
       </w:r>
     </w:p>
@@ -1795,7 +1771,7 @@
     </w:p>
     <w:p>
       <w:pPr>
-        <w:pStyle w:val="Heading3"/>
+        <w:pStyle w:val="Heading2"/>
       </w:pPr>
       <w:r>
         <w:t>What you'll build</w:t>
@@ -1808,7 +1784,7 @@
     </w:p>
     <w:p>
       <w:pPr>
-        <w:pStyle w:val="Heading3"/>
+        <w:pStyle w:val="Heading2"/>
       </w:pPr>
       <w:r>
         <w:t>Step 1 — Initialize the control plane</w:t>
@@ -1892,7 +1868,7 @@
     <w:p/>
     <w:p>
       <w:pPr>
-        <w:pStyle w:val="Heading3"/>
+        <w:pStyle w:val="Heading2"/>
       </w:pPr>
       <w:r>
         <w:t>Step 2 — Configure kubectl</w:t>
@@ -1961,7 +1937,7 @@
     <w:p/>
     <w:p>
       <w:pPr>
-        <w:pStyle w:val="Heading3"/>
+        <w:pStyle w:val="Heading2"/>
       </w:pPr>
       <w:r>
         <w:t>Step 3 — Explore static pod manifests</w:t>
@@ -2000,7 +1976,7 @@
     <w:p/>
     <w:p>
       <w:pPr>
-        <w:pStyle w:val="Heading3"/>
+        <w:pStyle w:val="Heading2"/>
       </w:pPr>
       <w:r>
         <w:t>Step 4 — Explore cluster PKI</w:t>
@@ -2054,7 +2030,7 @@
     <w:p/>
     <w:p>
       <w:pPr>
-        <w:pStyle w:val="Heading3"/>
+        <w:pStyle w:val="Heading2"/>
       </w:pPr>
       <w:r>
         <w:t>Step 5 — Take an etcd snapshot</w:t>
@@ -2180,7 +2156,7 @@
     </w:p>
     <w:p>
       <w:pPr>
-        <w:pStyle w:val="Heading3"/>
+        <w:pStyle w:val="Heading2"/>
       </w:pPr>
       <w:r>
         <w:t>Step 6 — Join worker node</w:t>
@@ -2277,58 +2253,48 @@
     <w:p/>
     <w:p>
       <w:pPr>
+        <w:pStyle w:val="Heading1"/>
+      </w:pPr>
+      <w:r>
+        <w:t>Lab 3 — Install Calico CNI and Verify Cross-Node Pod Ping</w:t>
+      </w:r>
+    </w:p>
+    <w:p>
+      <w:r>
+        <w:rPr>
+          <w:b/>
+        </w:rPr>
+        <w:t>Domain: Cluster Architecture, Installation &amp; Configuration  ·  Topic: CNI networking  ·  Duration: 45 min  ·  Killercoda: https://killercoda.com/playgrounds/scenario/kubeadm</w:t>
+      </w:r>
+      <w:r/>
+      <w:r>
+        <w:rPr>
+          <w:b/>
+        </w:rPr>
+      </w:r>
+      <w:r/>
+      <w:r>
+        <w:rPr>
+          <w:b/>
+        </w:rPr>
+      </w:r>
+      <w:r/>
+      <w:r>
+        <w:rPr>
+          <w:b/>
+        </w:rPr>
+      </w:r>
+      <w:r>
+        <w:rPr>
+          <w:color w:val="1F6FEB"/>
+        </w:rPr>
+      </w:r>
+    </w:p>
+    <w:p>
+      <w:pPr>
         <w:pStyle w:val="Heading2"/>
       </w:pPr>
       <w:r>
-        <w:t>Lab 3 — Install Calico CNI and Verify Cross-Node Pod Ping</w:t>
-      </w:r>
-    </w:p>
-    <w:p>
-      <w:r>
-        <w:rPr>
-          <w:b/>
-        </w:rPr>
-        <w:t xml:space="preserve">Domain: </w:t>
-      </w:r>
-      <w:r>
-        <w:t xml:space="preserve">Cluster Architecture, Installation &amp; Configuration   </w:t>
-      </w:r>
-      <w:r>
-        <w:rPr>
-          <w:b/>
-        </w:rPr>
-        <w:t xml:space="preserve">Topic: </w:t>
-      </w:r>
-      <w:r>
-        <w:t xml:space="preserve">CNI networking   </w:t>
-      </w:r>
-      <w:r>
-        <w:rPr>
-          <w:b/>
-        </w:rPr>
-        <w:t xml:space="preserve">Duration: </w:t>
-      </w:r>
-      <w:r>
-        <w:t xml:space="preserve">45 min   </w:t>
-      </w:r>
-      <w:r>
-        <w:rPr>
-          <w:b/>
-        </w:rPr>
-        <w:t xml:space="preserve">Killercoda: </w:t>
-      </w:r>
-      <w:r>
-        <w:rPr>
-          <w:color w:val="1F6FEB"/>
-        </w:rPr>
-        <w:t>https://killercoda.com/playgrounds/scenario/kubeadm</w:t>
-      </w:r>
-    </w:p>
-    <w:p>
-      <w:pPr>
-        <w:pStyle w:val="Heading3"/>
-      </w:pPr>
-      <w:r>
         <w:t>Goal</w:t>
       </w:r>
     </w:p>
@@ -2339,7 +2305,7 @@
     </w:p>
     <w:p>
       <w:pPr>
-        <w:pStyle w:val="Heading3"/>
+        <w:pStyle w:val="Heading2"/>
       </w:pPr>
       <w:r>
         <w:t>What you'll build</w:t>
@@ -2352,7 +2318,7 @@
     </w:p>
     <w:p>
       <w:pPr>
-        <w:pStyle w:val="Heading3"/>
+        <w:pStyle w:val="Heading2"/>
       </w:pPr>
       <w:r>
         <w:t>Step 1 — Confirm nodes are NotReady before CNI</w:t>
@@ -2391,7 +2357,7 @@
     <w:p/>
     <w:p>
       <w:pPr>
-        <w:pStyle w:val="Heading3"/>
+        <w:pStyle w:val="Heading2"/>
       </w:pPr>
       <w:r>
         <w:t>Step 2 — Install Calico Operator</w:t>
@@ -2460,7 +2426,7 @@
     <w:p/>
     <w:p>
       <w:pPr>
-        <w:pStyle w:val="Heading3"/>
+        <w:pStyle w:val="Heading2"/>
       </w:pPr>
       <w:r>
         <w:t>Step 3 — Watch nodes transition to Ready</w:t>
@@ -2499,7 +2465,7 @@
     <w:p/>
     <w:p>
       <w:pPr>
-        <w:pStyle w:val="Heading3"/>
+        <w:pStyle w:val="Heading2"/>
       </w:pPr>
       <w:r>
         <w:t>Step 4 — Test cross-node pod ping</w:t>
@@ -2608,58 +2574,48 @@
     <w:p/>
     <w:p>
       <w:pPr>
+        <w:pStyle w:val="Heading1"/>
+      </w:pPr>
+      <w:r>
+        <w:t>Lab 4 — Cluster Upgrade: v1.34 to v1.35 with kubeadm drain/uncordon</w:t>
+      </w:r>
+    </w:p>
+    <w:p>
+      <w:r>
+        <w:rPr>
+          <w:b/>
+        </w:rPr>
+        <w:t>Domain: Cluster Architecture, Installation &amp; Configuration  ·  Topic: Cluster upgrade  ·  Duration: 60 min  ·  Killercoda: https://killercoda.com/playgrounds/scenario/kubeadm</w:t>
+      </w:r>
+      <w:r/>
+      <w:r>
+        <w:rPr>
+          <w:b/>
+        </w:rPr>
+      </w:r>
+      <w:r/>
+      <w:r>
+        <w:rPr>
+          <w:b/>
+        </w:rPr>
+      </w:r>
+      <w:r/>
+      <w:r>
+        <w:rPr>
+          <w:b/>
+        </w:rPr>
+      </w:r>
+      <w:r>
+        <w:rPr>
+          <w:color w:val="1F6FEB"/>
+        </w:rPr>
+      </w:r>
+    </w:p>
+    <w:p>
+      <w:pPr>
         <w:pStyle w:val="Heading2"/>
       </w:pPr>
       <w:r>
-        <w:t>Lab 4 — Cluster Upgrade: v1.34 to v1.35 with kubeadm drain/uncordon</w:t>
-      </w:r>
-    </w:p>
-    <w:p>
-      <w:r>
-        <w:rPr>
-          <w:b/>
-        </w:rPr>
-        <w:t xml:space="preserve">Domain: </w:t>
-      </w:r>
-      <w:r>
-        <w:t xml:space="preserve">Cluster Architecture, Installation &amp; Configuration   </w:t>
-      </w:r>
-      <w:r>
-        <w:rPr>
-          <w:b/>
-        </w:rPr>
-        <w:t xml:space="preserve">Topic: </w:t>
-      </w:r>
-      <w:r>
-        <w:t xml:space="preserve">Cluster upgrade   </w:t>
-      </w:r>
-      <w:r>
-        <w:rPr>
-          <w:b/>
-        </w:rPr>
-        <w:t xml:space="preserve">Duration: </w:t>
-      </w:r>
-      <w:r>
-        <w:t xml:space="preserve">60 min   </w:t>
-      </w:r>
-      <w:r>
-        <w:rPr>
-          <w:b/>
-        </w:rPr>
-        <w:t xml:space="preserve">Killercoda: </w:t>
-      </w:r>
-      <w:r>
-        <w:rPr>
-          <w:color w:val="1F6FEB"/>
-        </w:rPr>
-        <w:t>https://killercoda.com/playgrounds/scenario/kubeadm</w:t>
-      </w:r>
-    </w:p>
-    <w:p>
-      <w:pPr>
-        <w:pStyle w:val="Heading3"/>
-      </w:pPr>
-      <w:r>
         <w:t>Goal</w:t>
       </w:r>
     </w:p>
@@ -2670,7 +2626,7 @@
     </w:p>
     <w:p>
       <w:pPr>
-        <w:pStyle w:val="Heading3"/>
+        <w:pStyle w:val="Heading2"/>
       </w:pPr>
       <w:r>
         <w:t>What you'll build</w:t>
@@ -2683,7 +2639,7 @@
     </w:p>
     <w:p>
       <w:pPr>
-        <w:pStyle w:val="Heading3"/>
+        <w:pStyle w:val="Heading2"/>
       </w:pPr>
       <w:r>
         <w:t>Step 1 — Add v1.35 apt repository</w:t>
@@ -2737,7 +2693,7 @@
     <w:p/>
     <w:p>
       <w:pPr>
-        <w:pStyle w:val="Heading3"/>
+        <w:pStyle w:val="Heading2"/>
       </w:pPr>
       <w:r>
         <w:t>Step 2 — Upgrade kubeadm on control plane</w:t>
@@ -2806,7 +2762,7 @@
     <w:p/>
     <w:p>
       <w:pPr>
-        <w:pStyle w:val="Heading3"/>
+        <w:pStyle w:val="Heading2"/>
       </w:pPr>
       <w:r>
         <w:t>Step 3 — Run upgrade plan and apply</w:t>
@@ -2845,7 +2801,7 @@
     <w:p/>
     <w:p>
       <w:pPr>
-        <w:pStyle w:val="Heading3"/>
+        <w:pStyle w:val="Heading2"/>
       </w:pPr>
       <w:r>
         <w:t>Step 4 — Drain, upgrade kubelet, uncordon control plane</w:t>
@@ -2944,7 +2900,7 @@
     <w:p/>
     <w:p>
       <w:pPr>
-        <w:pStyle w:val="Heading3"/>
+        <w:pStyle w:val="Heading2"/>
       </w:pPr>
       <w:r>
         <w:t>Step 5 — Upgrade worker node</w:t>
@@ -3143,58 +3099,48 @@
     <w:p/>
     <w:p>
       <w:pPr>
+        <w:pStyle w:val="Heading1"/>
+      </w:pPr>
+      <w:r>
+        <w:t>Lab 5 — HA Control Plane: HAProxy + Keepalived VIP and --upload-certs</w:t>
+      </w:r>
+    </w:p>
+    <w:p>
+      <w:r>
+        <w:rPr>
+          <w:b/>
+        </w:rPr>
+        <w:t>Domain: Cluster Architecture, Installation &amp; Configuration  ·  Topic: High availability  ·  Duration: 60 min  ·  Killercoda: https://killercoda.com/playgrounds/scenario/kubeadm</w:t>
+      </w:r>
+      <w:r/>
+      <w:r>
+        <w:rPr>
+          <w:b/>
+        </w:rPr>
+      </w:r>
+      <w:r/>
+      <w:r>
+        <w:rPr>
+          <w:b/>
+        </w:rPr>
+      </w:r>
+      <w:r/>
+      <w:r>
+        <w:rPr>
+          <w:b/>
+        </w:rPr>
+      </w:r>
+      <w:r>
+        <w:rPr>
+          <w:color w:val="1F6FEB"/>
+        </w:rPr>
+      </w:r>
+    </w:p>
+    <w:p>
+      <w:pPr>
         <w:pStyle w:val="Heading2"/>
       </w:pPr>
       <w:r>
-        <w:t>Lab 5 — HA Control Plane: HAProxy + Keepalived VIP and --upload-certs</w:t>
-      </w:r>
-    </w:p>
-    <w:p>
-      <w:r>
-        <w:rPr>
-          <w:b/>
-        </w:rPr>
-        <w:t xml:space="preserve">Domain: </w:t>
-      </w:r>
-      <w:r>
-        <w:t xml:space="preserve">Cluster Architecture, Installation &amp; Configuration   </w:t>
-      </w:r>
-      <w:r>
-        <w:rPr>
-          <w:b/>
-        </w:rPr>
-        <w:t xml:space="preserve">Topic: </w:t>
-      </w:r>
-      <w:r>
-        <w:t xml:space="preserve">High availability   </w:t>
-      </w:r>
-      <w:r>
-        <w:rPr>
-          <w:b/>
-        </w:rPr>
-        <w:t xml:space="preserve">Duration: </w:t>
-      </w:r>
-      <w:r>
-        <w:t xml:space="preserve">60 min   </w:t>
-      </w:r>
-      <w:r>
-        <w:rPr>
-          <w:b/>
-        </w:rPr>
-        <w:t xml:space="preserve">Killercoda: </w:t>
-      </w:r>
-      <w:r>
-        <w:rPr>
-          <w:color w:val="1F6FEB"/>
-        </w:rPr>
-        <w:t>https://killercoda.com/playgrounds/scenario/kubeadm</w:t>
-      </w:r>
-    </w:p>
-    <w:p>
-      <w:pPr>
-        <w:pStyle w:val="Heading3"/>
-      </w:pPr>
-      <w:r>
         <w:t>Goal</w:t>
       </w:r>
     </w:p>
@@ -3205,7 +3151,7 @@
     </w:p>
     <w:p>
       <w:pPr>
-        <w:pStyle w:val="Heading3"/>
+        <w:pStyle w:val="Heading2"/>
       </w:pPr>
       <w:r>
         <w:t>What you'll build</w:t>
@@ -3218,7 +3164,7 @@
     </w:p>
     <w:p>
       <w:pPr>
-        <w:pStyle w:val="Heading3"/>
+        <w:pStyle w:val="Heading2"/>
       </w:pPr>
       <w:r>
         <w:t>Step 1 — Install and configure HAProxy</w:t>
@@ -3257,7 +3203,7 @@
     <w:p/>
     <w:p>
       <w:pPr>
-        <w:pStyle w:val="Heading3"/>
+        <w:pStyle w:val="Heading2"/>
       </w:pPr>
       <w:r>
         <w:t>Step 2 — Configure Keepalived with VIP</w:t>
@@ -3326,7 +3272,7 @@
     <w:p/>
     <w:p>
       <w:pPr>
-        <w:pStyle w:val="Heading3"/>
+        <w:pStyle w:val="Heading2"/>
       </w:pPr>
       <w:r>
         <w:t>Step 3 — Initialize first control plane with VIP</w:t>
@@ -3437,7 +3383,7 @@
     </w:p>
     <w:p>
       <w:pPr>
-        <w:pStyle w:val="Heading3"/>
+        <w:pStyle w:val="Heading2"/>
       </w:pPr>
       <w:r>
         <w:t>Step 4 — Join additional control plane nodes</w:t>
@@ -3521,7 +3467,7 @@
     <w:p/>
     <w:p>
       <w:pPr>
-        <w:pStyle w:val="Heading3"/>
+        <w:pStyle w:val="Heading2"/>
       </w:pPr>
       <w:r>
         <w:t>Step 5 — Verify etcd HA cluster</w:t>
@@ -3618,58 +3564,48 @@
     <w:p/>
     <w:p>
       <w:pPr>
+        <w:pStyle w:val="Heading1"/>
+      </w:pPr>
+      <w:r>
+        <w:t>Lab 6 — Helm: Install, Upgrade, Rollback, --set, -f values.yaml, helm template</w:t>
+      </w:r>
+    </w:p>
+    <w:p>
+      <w:r>
+        <w:rPr>
+          <w:b/>
+        </w:rPr>
+        <w:t>Domain: Cluster Architecture, Installation &amp; Configuration  ·  Topic: Helm package manager  ·  Duration: 45 min  ·  Killercoda: https://killercoda.com/playgrounds/scenario/kubernetes</w:t>
+      </w:r>
+      <w:r/>
+      <w:r>
+        <w:rPr>
+          <w:b/>
+        </w:rPr>
+      </w:r>
+      <w:r/>
+      <w:r>
+        <w:rPr>
+          <w:b/>
+        </w:rPr>
+      </w:r>
+      <w:r/>
+      <w:r>
+        <w:rPr>
+          <w:b/>
+        </w:rPr>
+      </w:r>
+      <w:r>
+        <w:rPr>
+          <w:color w:val="1F6FEB"/>
+        </w:rPr>
+      </w:r>
+    </w:p>
+    <w:p>
+      <w:pPr>
         <w:pStyle w:val="Heading2"/>
       </w:pPr>
       <w:r>
-        <w:t>Lab 6 — Helm: Install, Upgrade, Rollback, --set, -f values.yaml, helm template</w:t>
-      </w:r>
-    </w:p>
-    <w:p>
-      <w:r>
-        <w:rPr>
-          <w:b/>
-        </w:rPr>
-        <w:t xml:space="preserve">Domain: </w:t>
-      </w:r>
-      <w:r>
-        <w:t xml:space="preserve">Cluster Architecture, Installation &amp; Configuration   </w:t>
-      </w:r>
-      <w:r>
-        <w:rPr>
-          <w:b/>
-        </w:rPr>
-        <w:t xml:space="preserve">Topic: </w:t>
-      </w:r>
-      <w:r>
-        <w:t xml:space="preserve">Helm package manager   </w:t>
-      </w:r>
-      <w:r>
-        <w:rPr>
-          <w:b/>
-        </w:rPr>
-        <w:t xml:space="preserve">Duration: </w:t>
-      </w:r>
-      <w:r>
-        <w:t xml:space="preserve">45 min   </w:t>
-      </w:r>
-      <w:r>
-        <w:rPr>
-          <w:b/>
-        </w:rPr>
-        <w:t xml:space="preserve">Killercoda: </w:t>
-      </w:r>
-      <w:r>
-        <w:rPr>
-          <w:color w:val="1F6FEB"/>
-        </w:rPr>
-        <w:t>https://killercoda.com/playgrounds/scenario/kubernetes</w:t>
-      </w:r>
-    </w:p>
-    <w:p>
-      <w:pPr>
-        <w:pStyle w:val="Heading3"/>
-      </w:pPr>
-      <w:r>
         <w:t>Goal</w:t>
       </w:r>
     </w:p>
@@ -3680,7 +3616,7 @@
     </w:p>
     <w:p>
       <w:pPr>
-        <w:pStyle w:val="Heading3"/>
+        <w:pStyle w:val="Heading2"/>
       </w:pPr>
       <w:r>
         <w:t>What you'll build</w:t>
@@ -3693,7 +3629,7 @@
     </w:p>
     <w:p>
       <w:pPr>
-        <w:pStyle w:val="Heading3"/>
+        <w:pStyle w:val="Heading2"/>
       </w:pPr>
       <w:r>
         <w:t>Step 1 — Install Helm and add repos</w:t>
@@ -3762,7 +3698,7 @@
     <w:p/>
     <w:p>
       <w:pPr>
-        <w:pStyle w:val="Heading3"/>
+        <w:pStyle w:val="Heading2"/>
       </w:pPr>
       <w:r>
         <w:t>Step 2 — Install a chart with value overrides</w:t>
@@ -3861,7 +3797,7 @@
     <w:p/>
     <w:p>
       <w:pPr>
-        <w:pStyle w:val="Heading3"/>
+        <w:pStyle w:val="Heading2"/>
       </w:pPr>
       <w:r>
         <w:t>Step 3 — Upgrade with -f values.yaml</w:t>
@@ -3975,7 +3911,7 @@
     <w:p/>
     <w:p>
       <w:pPr>
-        <w:pStyle w:val="Heading3"/>
+        <w:pStyle w:val="Heading2"/>
       </w:pPr>
       <w:r>
         <w:t>Step 4 — Roll back a release</w:t>
@@ -4014,7 +3950,7 @@
     <w:p/>
     <w:p>
       <w:pPr>
-        <w:pStyle w:val="Heading3"/>
+        <w:pStyle w:val="Heading2"/>
       </w:pPr>
       <w:r>
         <w:t>Step 5 — Render manifests without installing</w:t>
@@ -4078,58 +4014,48 @@
     <w:p/>
     <w:p>
       <w:pPr>
+        <w:pStyle w:val="Heading1"/>
+      </w:pPr>
+      <w:r>
+        <w:t>Lab 7 — Kustomize: Base + Overlays, namePrefix, images, patches, kubectl apply -k</w:t>
+      </w:r>
+    </w:p>
+    <w:p>
+      <w:r>
+        <w:rPr>
+          <w:b/>
+        </w:rPr>
+        <w:t>Domain: Cluster Architecture, Installation &amp; Configuration  ·  Topic: Kustomize  ·  Duration: 45 min  ·  Killercoda: https://killercoda.com/playgrounds/scenario/kubernetes</w:t>
+      </w:r>
+      <w:r/>
+      <w:r>
+        <w:rPr>
+          <w:b/>
+        </w:rPr>
+      </w:r>
+      <w:r/>
+      <w:r>
+        <w:rPr>
+          <w:b/>
+        </w:rPr>
+      </w:r>
+      <w:r/>
+      <w:r>
+        <w:rPr>
+          <w:b/>
+        </w:rPr>
+      </w:r>
+      <w:r>
+        <w:rPr>
+          <w:color w:val="1F6FEB"/>
+        </w:rPr>
+      </w:r>
+    </w:p>
+    <w:p>
+      <w:pPr>
         <w:pStyle w:val="Heading2"/>
       </w:pPr>
       <w:r>
-        <w:t>Lab 7 — Kustomize: Base + Overlays, namePrefix, images, patches, kubectl apply -k</w:t>
-      </w:r>
-    </w:p>
-    <w:p>
-      <w:r>
-        <w:rPr>
-          <w:b/>
-        </w:rPr>
-        <w:t xml:space="preserve">Domain: </w:t>
-      </w:r>
-      <w:r>
-        <w:t xml:space="preserve">Cluster Architecture, Installation &amp; Configuration   </w:t>
-      </w:r>
-      <w:r>
-        <w:rPr>
-          <w:b/>
-        </w:rPr>
-        <w:t xml:space="preserve">Topic: </w:t>
-      </w:r>
-      <w:r>
-        <w:t xml:space="preserve">Kustomize   </w:t>
-      </w:r>
-      <w:r>
-        <w:rPr>
-          <w:b/>
-        </w:rPr>
-        <w:t xml:space="preserve">Duration: </w:t>
-      </w:r>
-      <w:r>
-        <w:t xml:space="preserve">45 min   </w:t>
-      </w:r>
-      <w:r>
-        <w:rPr>
-          <w:b/>
-        </w:rPr>
-        <w:t xml:space="preserve">Killercoda: </w:t>
-      </w:r>
-      <w:r>
-        <w:rPr>
-          <w:color w:val="1F6FEB"/>
-        </w:rPr>
-        <w:t>https://killercoda.com/playgrounds/scenario/kubernetes</w:t>
-      </w:r>
-    </w:p>
-    <w:p>
-      <w:pPr>
-        <w:pStyle w:val="Heading3"/>
-      </w:pPr>
-      <w:r>
         <w:t>Goal</w:t>
       </w:r>
     </w:p>
@@ -4140,7 +4066,7 @@
     </w:p>
     <w:p>
       <w:pPr>
-        <w:pStyle w:val="Heading3"/>
+        <w:pStyle w:val="Heading2"/>
       </w:pPr>
       <w:r>
         <w:t>What you'll build</w:t>
@@ -4153,7 +4079,7 @@
     </w:p>
     <w:p>
       <w:pPr>
-        <w:pStyle w:val="Heading3"/>
+        <w:pStyle w:val="Heading2"/>
       </w:pPr>
       <w:r>
         <w:t>Step 1 — Verify kustomize is built into kubectl</w:t>
@@ -4192,7 +4118,7 @@
     <w:p/>
     <w:p>
       <w:pPr>
-        <w:pStyle w:val="Heading3"/>
+        <w:pStyle w:val="Heading2"/>
       </w:pPr>
       <w:r>
         <w:t>Step 2 — Create base layer</w:t>
@@ -4261,7 +4187,7 @@
     <w:p/>
     <w:p>
       <w:pPr>
-        <w:pStyle w:val="Heading3"/>
+        <w:pStyle w:val="Heading2"/>
       </w:pPr>
       <w:r>
         <w:t>Step 3 — Dev overlay with namePrefix</w:t>
@@ -4420,7 +4346,7 @@
     <w:p/>
     <w:p>
       <w:pPr>
-        <w:pStyle w:val="Heading3"/>
+        <w:pStyle w:val="Heading2"/>
       </w:pPr>
       <w:r>
         <w:t>Step 4 — Apply overlays</w:t>
@@ -4489,7 +4415,7 @@
     <w:p/>
     <w:p>
       <w:pPr>
-        <w:pStyle w:val="Heading3"/>
+        <w:pStyle w:val="Heading2"/>
       </w:pPr>
       <w:r>
         <w:t>Step 5 — Preview changes before applying</w:t>
@@ -4538,58 +4464,48 @@
     <w:p/>
     <w:p>
       <w:pPr>
+        <w:pStyle w:val="Heading1"/>
+      </w:pPr>
+      <w:r>
+        <w:t>Lab 8 — RBAC: Roles, RoleBindings, ServiceAccounts, ClusterRole</w:t>
+      </w:r>
+    </w:p>
+    <w:p>
+      <w:r>
+        <w:rPr>
+          <w:b/>
+        </w:rPr>
+        <w:t>Domain: Cluster Architecture, Installation &amp; Configuration  ·  Topic: RBAC  ·  Duration: 45 min  ·  Killercoda: https://killercoda.com/playgrounds/scenario/kubernetes</w:t>
+      </w:r>
+      <w:r/>
+      <w:r>
+        <w:rPr>
+          <w:b/>
+        </w:rPr>
+      </w:r>
+      <w:r/>
+      <w:r>
+        <w:rPr>
+          <w:b/>
+        </w:rPr>
+      </w:r>
+      <w:r/>
+      <w:r>
+        <w:rPr>
+          <w:b/>
+        </w:rPr>
+      </w:r>
+      <w:r>
+        <w:rPr>
+          <w:color w:val="1F6FEB"/>
+        </w:rPr>
+      </w:r>
+    </w:p>
+    <w:p>
+      <w:pPr>
         <w:pStyle w:val="Heading2"/>
       </w:pPr>
       <w:r>
-        <w:t>Lab 8 — RBAC: Roles, RoleBindings, ServiceAccounts, ClusterRole</w:t>
-      </w:r>
-    </w:p>
-    <w:p>
-      <w:r>
-        <w:rPr>
-          <w:b/>
-        </w:rPr>
-        <w:t xml:space="preserve">Domain: </w:t>
-      </w:r>
-      <w:r>
-        <w:t xml:space="preserve">Cluster Architecture, Installation &amp; Configuration   </w:t>
-      </w:r>
-      <w:r>
-        <w:rPr>
-          <w:b/>
-        </w:rPr>
-        <w:t xml:space="preserve">Topic: </w:t>
-      </w:r>
-      <w:r>
-        <w:t xml:space="preserve">RBAC   </w:t>
-      </w:r>
-      <w:r>
-        <w:rPr>
-          <w:b/>
-        </w:rPr>
-        <w:t xml:space="preserve">Duration: </w:t>
-      </w:r>
-      <w:r>
-        <w:t xml:space="preserve">45 min   </w:t>
-      </w:r>
-      <w:r>
-        <w:rPr>
-          <w:b/>
-        </w:rPr>
-        <w:t xml:space="preserve">Killercoda: </w:t>
-      </w:r>
-      <w:r>
-        <w:rPr>
-          <w:color w:val="1F6FEB"/>
-        </w:rPr>
-        <w:t>https://killercoda.com/playgrounds/scenario/kubernetes</w:t>
-      </w:r>
-    </w:p>
-    <w:p>
-      <w:pPr>
-        <w:pStyle w:val="Heading3"/>
-      </w:pPr>
-      <w:r>
         <w:t>Goal</w:t>
       </w:r>
     </w:p>
@@ -4600,7 +4516,7 @@
     </w:p>
     <w:p>
       <w:pPr>
-        <w:pStyle w:val="Heading3"/>
+        <w:pStyle w:val="Heading2"/>
       </w:pPr>
       <w:r>
         <w:t>What you'll build</w:t>
@@ -4613,7 +4529,7 @@
     </w:p>
     <w:p>
       <w:pPr>
-        <w:pStyle w:val="Heading3"/>
+        <w:pStyle w:val="Heading2"/>
       </w:pPr>
       <w:r>
         <w:t>Step 1 — Create namespace and ServiceAccount</w:t>
@@ -4652,7 +4568,7 @@
     <w:p/>
     <w:p>
       <w:pPr>
-        <w:pStyle w:val="Heading3"/>
+        <w:pStyle w:val="Heading2"/>
       </w:pPr>
       <w:r>
         <w:t>Step 2 — Create a namespaced Role</w:t>
@@ -4721,7 +4637,7 @@
     <w:p/>
     <w:p>
       <w:pPr>
-        <w:pStyle w:val="Heading3"/>
+        <w:pStyle w:val="Heading2"/>
       </w:pPr>
       <w:r>
         <w:t>Step 3 — Bind Role to ServiceAccount</w:t>
@@ -4775,7 +4691,7 @@
     <w:p/>
     <w:p>
       <w:pPr>
-        <w:pStyle w:val="Heading3"/>
+        <w:pStyle w:val="Heading2"/>
       </w:pPr>
       <w:r>
         <w:t>Step 4 — Test with kubectl auth can-i</w:t>
@@ -4859,7 +4775,7 @@
     <w:p/>
     <w:p>
       <w:pPr>
-        <w:pStyle w:val="Heading3"/>
+        <w:pStyle w:val="Heading2"/>
       </w:pPr>
       <w:r>
         <w:t>Step 5 — ClusterRole for cluster-scoped resources</w:t>
@@ -4961,58 +4877,48 @@
     </w:p>
     <w:p>
       <w:pPr>
+        <w:pStyle w:val="Heading1"/>
+      </w:pPr>
+      <w:r>
+        <w:t>Lab 9 — CRDs and Operators: Schema Validation, cert-manager, Certificate Lifecycle</w:t>
+      </w:r>
+    </w:p>
+    <w:p>
+      <w:r>
+        <w:rPr>
+          <w:b/>
+        </w:rPr>
+        <w:t>Domain: Cluster Architecture, Installation &amp; Configuration  ·  Topic: CRDs and Operators  ·  Duration: 45 min  ·  Killercoda: https://killercoda.com/playgrounds/scenario/kubernetes</w:t>
+      </w:r>
+      <w:r/>
+      <w:r>
+        <w:rPr>
+          <w:b/>
+        </w:rPr>
+      </w:r>
+      <w:r/>
+      <w:r>
+        <w:rPr>
+          <w:b/>
+        </w:rPr>
+      </w:r>
+      <w:r/>
+      <w:r>
+        <w:rPr>
+          <w:b/>
+        </w:rPr>
+      </w:r>
+      <w:r>
+        <w:rPr>
+          <w:color w:val="1F6FEB"/>
+        </w:rPr>
+      </w:r>
+    </w:p>
+    <w:p>
+      <w:pPr>
         <w:pStyle w:val="Heading2"/>
       </w:pPr>
       <w:r>
-        <w:t>Lab 9 — CRDs and Operators: Schema Validation, cert-manager, Certificate Lifecycle</w:t>
-      </w:r>
-    </w:p>
-    <w:p>
-      <w:r>
-        <w:rPr>
-          <w:b/>
-        </w:rPr>
-        <w:t xml:space="preserve">Domain: </w:t>
-      </w:r>
-      <w:r>
-        <w:t xml:space="preserve">Cluster Architecture, Installation &amp; Configuration   </w:t>
-      </w:r>
-      <w:r>
-        <w:rPr>
-          <w:b/>
-        </w:rPr>
-        <w:t xml:space="preserve">Topic: </w:t>
-      </w:r>
-      <w:r>
-        <w:t xml:space="preserve">CRDs and Operators   </w:t>
-      </w:r>
-      <w:r>
-        <w:rPr>
-          <w:b/>
-        </w:rPr>
-        <w:t xml:space="preserve">Duration: </w:t>
-      </w:r>
-      <w:r>
-        <w:t xml:space="preserve">45 min   </w:t>
-      </w:r>
-      <w:r>
-        <w:rPr>
-          <w:b/>
-        </w:rPr>
-        <w:t xml:space="preserve">Killercoda: </w:t>
-      </w:r>
-      <w:r>
-        <w:rPr>
-          <w:color w:val="1F6FEB"/>
-        </w:rPr>
-        <w:t>https://killercoda.com/playgrounds/scenario/kubernetes</w:t>
-      </w:r>
-    </w:p>
-    <w:p>
-      <w:pPr>
-        <w:pStyle w:val="Heading3"/>
-      </w:pPr>
-      <w:r>
         <w:t>Goal</w:t>
       </w:r>
     </w:p>
@@ -5023,7 +4929,7 @@
     </w:p>
     <w:p>
       <w:pPr>
-        <w:pStyle w:val="Heading3"/>
+        <w:pStyle w:val="Heading2"/>
       </w:pPr>
       <w:r>
         <w:t>What you'll build</w:t>
@@ -5036,7 +4942,7 @@
     </w:p>
     <w:p>
       <w:pPr>
-        <w:pStyle w:val="Heading3"/>
+        <w:pStyle w:val="Heading2"/>
       </w:pPr>
       <w:r>
         <w:t>Step 1 — Define a CRD with schema validation</w:t>
@@ -5465,7 +5371,7 @@
     <w:p/>
     <w:p>
       <w:pPr>
-        <w:pStyle w:val="Heading3"/>
+        <w:pStyle w:val="Heading2"/>
       </w:pPr>
       <w:r>
         <w:t>Step 2 — Create and query custom resources</w:t>
@@ -5639,7 +5545,7 @@
     <w:p/>
     <w:p>
       <w:pPr>
-        <w:pStyle w:val="Heading3"/>
+        <w:pStyle w:val="Heading2"/>
       </w:pPr>
       <w:r>
         <w:t>Step 3 — Install cert-manager via Helm</w:t>
@@ -5723,7 +5629,7 @@
     <w:p/>
     <w:p>
       <w:pPr>
-        <w:pStyle w:val="Heading3"/>
+        <w:pStyle w:val="Heading2"/>
       </w:pPr>
       <w:r>
         <w:t>Step 4 — Create ClusterIssuer and request certificate</w:t>
@@ -5892,58 +5798,48 @@
     <w:p/>
     <w:p>
       <w:pPr>
+        <w:pStyle w:val="Heading1"/>
+      </w:pPr>
+      <w:r>
+        <w:t>Lab 10 — Extension Interfaces: CRI (crictl), CNI (/etc/cni/net.d), CSI (kubectl get csidrivers)</w:t>
+      </w:r>
+    </w:p>
+    <w:p>
+      <w:r>
+        <w:rPr>
+          <w:b/>
+        </w:rPr>
+        <w:t>Domain: Cluster Architecture, Installation &amp; Configuration  ·  Topic: CRI/CNI/CSI extension interfaces  ·  Duration: 45 min  ·  Killercoda: https://killercoda.com/playgrounds/scenario/kubernetes</w:t>
+      </w:r>
+      <w:r/>
+      <w:r>
+        <w:rPr>
+          <w:b/>
+        </w:rPr>
+      </w:r>
+      <w:r/>
+      <w:r>
+        <w:rPr>
+          <w:b/>
+        </w:rPr>
+      </w:r>
+      <w:r/>
+      <w:r>
+        <w:rPr>
+          <w:b/>
+        </w:rPr>
+      </w:r>
+      <w:r>
+        <w:rPr>
+          <w:color w:val="1F6FEB"/>
+        </w:rPr>
+      </w:r>
+    </w:p>
+    <w:p>
+      <w:pPr>
         <w:pStyle w:val="Heading2"/>
       </w:pPr>
       <w:r>
-        <w:t>Lab 10 — Extension Interfaces: CRI (crictl), CNI (/etc/cni/net.d), CSI (kubectl get csidrivers)</w:t>
-      </w:r>
-    </w:p>
-    <w:p>
-      <w:r>
-        <w:rPr>
-          <w:b/>
-        </w:rPr>
-        <w:t xml:space="preserve">Domain: </w:t>
-      </w:r>
-      <w:r>
-        <w:t xml:space="preserve">Cluster Architecture, Installation &amp; Configuration   </w:t>
-      </w:r>
-      <w:r>
-        <w:rPr>
-          <w:b/>
-        </w:rPr>
-        <w:t xml:space="preserve">Topic: </w:t>
-      </w:r>
-      <w:r>
-        <w:t xml:space="preserve">CRI/CNI/CSI extension interfaces   </w:t>
-      </w:r>
-      <w:r>
-        <w:rPr>
-          <w:b/>
-        </w:rPr>
-        <w:t xml:space="preserve">Duration: </w:t>
-      </w:r>
-      <w:r>
-        <w:t xml:space="preserve">45 min   </w:t>
-      </w:r>
-      <w:r>
-        <w:rPr>
-          <w:b/>
-        </w:rPr>
-        <w:t xml:space="preserve">Killercoda: </w:t>
-      </w:r>
-      <w:r>
-        <w:rPr>
-          <w:color w:val="1F6FEB"/>
-        </w:rPr>
-        <w:t>https://killercoda.com/playgrounds/scenario/kubernetes</w:t>
-      </w:r>
-    </w:p>
-    <w:p>
-      <w:pPr>
-        <w:pStyle w:val="Heading3"/>
-      </w:pPr>
-      <w:r>
         <w:t>Goal</w:t>
       </w:r>
     </w:p>
@@ -5954,7 +5850,7 @@
     </w:p>
     <w:p>
       <w:pPr>
-        <w:pStyle w:val="Heading3"/>
+        <w:pStyle w:val="Heading2"/>
       </w:pPr>
       <w:r>
         <w:t>What you'll build</w:t>
@@ -5967,7 +5863,7 @@
     </w:p>
     <w:p>
       <w:pPr>
-        <w:pStyle w:val="Heading3"/>
+        <w:pStyle w:val="Heading2"/>
       </w:pPr>
       <w:r>
         <w:t>Step 1 — Configure and use crictl</w:t>
@@ -6066,7 +5962,7 @@
     <w:p/>
     <w:p>
       <w:pPr>
-        <w:pStyle w:val="Heading3"/>
+        <w:pStyle w:val="Heading2"/>
       </w:pPr>
       <w:r>
         <w:t>Step 2 — Get container logs with crictl</w:t>
@@ -6120,7 +6016,7 @@
     <w:p/>
     <w:p>
       <w:pPr>
-        <w:pStyle w:val="Heading3"/>
+        <w:pStyle w:val="Heading2"/>
       </w:pPr>
       <w:r>
         <w:t>Step 3 — Inspect CNI configuration</w:t>
@@ -6174,7 +6070,7 @@
     <w:p/>
     <w:p>
       <w:pPr>
-        <w:pStyle w:val="Heading3"/>
+        <w:pStyle w:val="Heading2"/>
       </w:pPr>
       <w:r>
         <w:t>Step 4 — Inspect CSI drivers</w:t>
@@ -6253,58 +6149,48 @@
     <w:p/>
     <w:p>
       <w:pPr>
+        <w:pStyle w:val="Heading1"/>
+      </w:pPr>
+      <w:r>
+        <w:t>Lab 11 — Deployments and Rollouts: Rolling Update, Bad Image, rollout undo, pause/resume</w:t>
+      </w:r>
+    </w:p>
+    <w:p>
+      <w:r>
+        <w:rPr>
+          <w:b/>
+        </w:rPr>
+        <w:t>Domain: Workloads &amp; Scheduling  ·  Topic: Deployments and rollouts  ·  Duration: 45 min  ·  Killercoda: https://killercoda.com/playgrounds/scenario/kubernetes</w:t>
+      </w:r>
+      <w:r/>
+      <w:r>
+        <w:rPr>
+          <w:b/>
+        </w:rPr>
+      </w:r>
+      <w:r/>
+      <w:r>
+        <w:rPr>
+          <w:b/>
+        </w:rPr>
+      </w:r>
+      <w:r/>
+      <w:r>
+        <w:rPr>
+          <w:b/>
+        </w:rPr>
+      </w:r>
+      <w:r>
+        <w:rPr>
+          <w:color w:val="1F6FEB"/>
+        </w:rPr>
+      </w:r>
+    </w:p>
+    <w:p>
+      <w:pPr>
         <w:pStyle w:val="Heading2"/>
       </w:pPr>
       <w:r>
-        <w:t>Lab 11 — Deployments and Rollouts: Rolling Update, Bad Image, rollout undo, pause/resume</w:t>
-      </w:r>
-    </w:p>
-    <w:p>
-      <w:r>
-        <w:rPr>
-          <w:b/>
-        </w:rPr>
-        <w:t xml:space="preserve">Domain: </w:t>
-      </w:r>
-      <w:r>
-        <w:t xml:space="preserve">Workloads &amp; Scheduling   </w:t>
-      </w:r>
-      <w:r>
-        <w:rPr>
-          <w:b/>
-        </w:rPr>
-        <w:t xml:space="preserve">Topic: </w:t>
-      </w:r>
-      <w:r>
-        <w:t xml:space="preserve">Deployments and rollouts   </w:t>
-      </w:r>
-      <w:r>
-        <w:rPr>
-          <w:b/>
-        </w:rPr>
-        <w:t xml:space="preserve">Duration: </w:t>
-      </w:r>
-      <w:r>
-        <w:t xml:space="preserve">45 min   </w:t>
-      </w:r>
-      <w:r>
-        <w:rPr>
-          <w:b/>
-        </w:rPr>
-        <w:t xml:space="preserve">Killercoda: </w:t>
-      </w:r>
-      <w:r>
-        <w:rPr>
-          <w:color w:val="1F6FEB"/>
-        </w:rPr>
-        <w:t>https://killercoda.com/playgrounds/scenario/kubernetes</w:t>
-      </w:r>
-    </w:p>
-    <w:p>
-      <w:pPr>
-        <w:pStyle w:val="Heading3"/>
-      </w:pPr>
-      <w:r>
         <w:t>Goal</w:t>
       </w:r>
     </w:p>
@@ -6315,7 +6201,7 @@
     </w:p>
     <w:p>
       <w:pPr>
-        <w:pStyle w:val="Heading3"/>
+        <w:pStyle w:val="Heading2"/>
       </w:pPr>
       <w:r>
         <w:t>What you'll build</w:t>
@@ -6328,7 +6214,7 @@
     </w:p>
     <w:p>
       <w:pPr>
-        <w:pStyle w:val="Heading3"/>
+        <w:pStyle w:val="Heading2"/>
       </w:pPr>
       <w:r>
         <w:t>Step 1 — Create and expose Deployment</w:t>
@@ -6382,7 +6268,7 @@
     <w:p/>
     <w:p>
       <w:pPr>
-        <w:pStyle w:val="Heading3"/>
+        <w:pStyle w:val="Heading2"/>
       </w:pPr>
       <w:r>
         <w:t>Step 2 — Perform a rolling update</w:t>
@@ -6436,7 +6322,7 @@
     <w:p/>
     <w:p>
       <w:pPr>
-        <w:pStyle w:val="Heading3"/>
+        <w:pStyle w:val="Heading2"/>
       </w:pPr>
       <w:r>
         <w:t>Step 3 — Simulate a broken rollout</w:t>
@@ -6490,7 +6376,7 @@
     <w:p/>
     <w:p>
       <w:pPr>
-        <w:pStyle w:val="Heading3"/>
+        <w:pStyle w:val="Heading2"/>
       </w:pPr>
       <w:r>
         <w:t>Step 4 — Roll back</w:t>
@@ -6544,7 +6430,7 @@
     <w:p/>
     <w:p>
       <w:pPr>
-        <w:pStyle w:val="Heading3"/>
+        <w:pStyle w:val="Heading2"/>
       </w:pPr>
       <w:r>
         <w:t>Step 5 — Pause and resume a rollout</w:t>
@@ -6653,58 +6539,48 @@
     <w:p/>
     <w:p>
       <w:pPr>
+        <w:pStyle w:val="Heading1"/>
+      </w:pPr>
+      <w:r>
+        <w:t>Lab 12 — ConfigMaps: 3 Creation Methods, envFrom, Volume Mount, Live Update Semantics</w:t>
+      </w:r>
+    </w:p>
+    <w:p>
+      <w:r>
+        <w:rPr>
+          <w:b/>
+        </w:rPr>
+        <w:t>Domain: Workloads &amp; Scheduling  ·  Topic: ConfigMaps  ·  Duration: 45 min  ·  Killercoda: https://killercoda.com/playgrounds/scenario/kubernetes</w:t>
+      </w:r>
+      <w:r/>
+      <w:r>
+        <w:rPr>
+          <w:b/>
+        </w:rPr>
+      </w:r>
+      <w:r/>
+      <w:r>
+        <w:rPr>
+          <w:b/>
+        </w:rPr>
+      </w:r>
+      <w:r/>
+      <w:r>
+        <w:rPr>
+          <w:b/>
+        </w:rPr>
+      </w:r>
+      <w:r>
+        <w:rPr>
+          <w:color w:val="1F6FEB"/>
+        </w:rPr>
+      </w:r>
+    </w:p>
+    <w:p>
+      <w:pPr>
         <w:pStyle w:val="Heading2"/>
       </w:pPr>
       <w:r>
-        <w:t>Lab 12 — ConfigMaps: 3 Creation Methods, envFrom, Volume Mount, Live Update Semantics</w:t>
-      </w:r>
-    </w:p>
-    <w:p>
-      <w:r>
-        <w:rPr>
-          <w:b/>
-        </w:rPr>
-        <w:t xml:space="preserve">Domain: </w:t>
-      </w:r>
-      <w:r>
-        <w:t xml:space="preserve">Workloads &amp; Scheduling   </w:t>
-      </w:r>
-      <w:r>
-        <w:rPr>
-          <w:b/>
-        </w:rPr>
-        <w:t xml:space="preserve">Topic: </w:t>
-      </w:r>
-      <w:r>
-        <w:t xml:space="preserve">ConfigMaps   </w:t>
-      </w:r>
-      <w:r>
-        <w:rPr>
-          <w:b/>
-        </w:rPr>
-        <w:t xml:space="preserve">Duration: </w:t>
-      </w:r>
-      <w:r>
-        <w:t xml:space="preserve">45 min   </w:t>
-      </w:r>
-      <w:r>
-        <w:rPr>
-          <w:b/>
-        </w:rPr>
-        <w:t xml:space="preserve">Killercoda: </w:t>
-      </w:r>
-      <w:r>
-        <w:rPr>
-          <w:color w:val="1F6FEB"/>
-        </w:rPr>
-        <w:t>https://killercoda.com/playgrounds/scenario/kubernetes</w:t>
-      </w:r>
-    </w:p>
-    <w:p>
-      <w:pPr>
-        <w:pStyle w:val="Heading3"/>
-      </w:pPr>
-      <w:r>
         <w:t>Goal</w:t>
       </w:r>
     </w:p>
@@ -6715,7 +6591,7 @@
     </w:p>
     <w:p>
       <w:pPr>
-        <w:pStyle w:val="Heading3"/>
+        <w:pStyle w:val="Heading2"/>
       </w:pPr>
       <w:r>
         <w:t>What you'll build</w:t>
@@ -6728,7 +6604,7 @@
     </w:p>
     <w:p>
       <w:pPr>
-        <w:pStyle w:val="Heading3"/>
+        <w:pStyle w:val="Heading2"/>
       </w:pPr>
       <w:r>
         <w:t>Step 1 — Create ConfigMap three ways</w:t>
@@ -6812,7 +6688,7 @@
     <w:p/>
     <w:p>
       <w:pPr>
-        <w:pStyle w:val="Heading3"/>
+        <w:pStyle w:val="Heading2"/>
       </w:pPr>
       <w:r>
         <w:t>Step 2 — Inject with envFrom</w:t>
@@ -6911,7 +6787,7 @@
     <w:p/>
     <w:p>
       <w:pPr>
-        <w:pStyle w:val="Heading3"/>
+        <w:pStyle w:val="Heading2"/>
       </w:pPr>
       <w:r>
         <w:t>Step 3 — Mount as volume</w:t>
@@ -7070,7 +6946,7 @@
     <w:p/>
     <w:p>
       <w:pPr>
-        <w:pStyle w:val="Heading3"/>
+        <w:pStyle w:val="Heading2"/>
       </w:pPr>
       <w:r>
         <w:t>Step 4 — Live update semantics</w:t>
@@ -7194,58 +7070,48 @@
     <w:p/>
     <w:p>
       <w:pPr>
+        <w:pStyle w:val="Heading1"/>
+      </w:pPr>
+      <w:r>
+        <w:t>Lab 13 — Secrets: generic/tls/docker-registry, Env Inject, tmpfs Mount defaultMode 0400</w:t>
+      </w:r>
+    </w:p>
+    <w:p>
+      <w:r>
+        <w:rPr>
+          <w:b/>
+        </w:rPr>
+        <w:t>Domain: Workloads &amp; Scheduling  ·  Topic: Secrets  ·  Duration: 45 min  ·  Killercoda: https://killercoda.com/playgrounds/scenario/kubernetes</w:t>
+      </w:r>
+      <w:r/>
+      <w:r>
+        <w:rPr>
+          <w:b/>
+        </w:rPr>
+      </w:r>
+      <w:r/>
+      <w:r>
+        <w:rPr>
+          <w:b/>
+        </w:rPr>
+      </w:r>
+      <w:r/>
+      <w:r>
+        <w:rPr>
+          <w:b/>
+        </w:rPr>
+      </w:r>
+      <w:r>
+        <w:rPr>
+          <w:color w:val="1F6FEB"/>
+        </w:rPr>
+      </w:r>
+    </w:p>
+    <w:p>
+      <w:pPr>
         <w:pStyle w:val="Heading2"/>
       </w:pPr>
       <w:r>
-        <w:t>Lab 13 — Secrets: generic/tls/docker-registry, Env Inject, tmpfs Mount defaultMode 0400</w:t>
-      </w:r>
-    </w:p>
-    <w:p>
-      <w:r>
-        <w:rPr>
-          <w:b/>
-        </w:rPr>
-        <w:t xml:space="preserve">Domain: </w:t>
-      </w:r>
-      <w:r>
-        <w:t xml:space="preserve">Workloads &amp; Scheduling   </w:t>
-      </w:r>
-      <w:r>
-        <w:rPr>
-          <w:b/>
-        </w:rPr>
-        <w:t xml:space="preserve">Topic: </w:t>
-      </w:r>
-      <w:r>
-        <w:t xml:space="preserve">Secrets   </w:t>
-      </w:r>
-      <w:r>
-        <w:rPr>
-          <w:b/>
-        </w:rPr>
-        <w:t xml:space="preserve">Duration: </w:t>
-      </w:r>
-      <w:r>
-        <w:t xml:space="preserve">45 min   </w:t>
-      </w:r>
-      <w:r>
-        <w:rPr>
-          <w:b/>
-        </w:rPr>
-        <w:t xml:space="preserve">Killercoda: </w:t>
-      </w:r>
-      <w:r>
-        <w:rPr>
-          <w:color w:val="1F6FEB"/>
-        </w:rPr>
-        <w:t>https://killercoda.com/playgrounds/scenario/kubernetes</w:t>
-      </w:r>
-    </w:p>
-    <w:p>
-      <w:pPr>
-        <w:pStyle w:val="Heading3"/>
-      </w:pPr>
-      <w:r>
         <w:t>Goal</w:t>
       </w:r>
     </w:p>
@@ -7256,7 +7122,7 @@
     </w:p>
     <w:p>
       <w:pPr>
-        <w:pStyle w:val="Heading3"/>
+        <w:pStyle w:val="Heading2"/>
       </w:pPr>
       <w:r>
         <w:t>What you'll build</w:t>
@@ -7269,7 +7135,7 @@
     </w:p>
     <w:p>
       <w:pPr>
-        <w:pStyle w:val="Heading3"/>
+        <w:pStyle w:val="Heading2"/>
       </w:pPr>
       <w:r>
         <w:t>Step 1 — Create and decode generic secret</w:t>
@@ -7368,7 +7234,7 @@
     <w:p/>
     <w:p>
       <w:pPr>
-        <w:pStyle w:val="Heading3"/>
+        <w:pStyle w:val="Heading2"/>
       </w:pPr>
       <w:r>
         <w:t>Step 2 — Create TLS secret</w:t>
@@ -7437,7 +7303,7 @@
     <w:p/>
     <w:p>
       <w:pPr>
-        <w:pStyle w:val="Heading3"/>
+        <w:pStyle w:val="Heading2"/>
       </w:pPr>
       <w:r>
         <w:t>Step 3 — Mount as tmpfs with defaultMode 0400</w:t>
@@ -7621,58 +7487,48 @@
     <w:p/>
     <w:p>
       <w:pPr>
+        <w:pStyle w:val="Heading1"/>
+      </w:pPr>
+      <w:r>
+        <w:t>Lab 14 — HPA v2: metrics-server, HorizontalPodAutoscaler, Load Test, Watch Scale</w:t>
+      </w:r>
+    </w:p>
+    <w:p>
+      <w:r>
+        <w:rPr>
+          <w:b/>
+        </w:rPr>
+        <w:t>Domain: Workloads &amp; Scheduling  ·  Topic: Horizontal Pod Autoscaling  ·  Duration: 45 min  ·  Killercoda: https://killercoda.com/playgrounds/scenario/kubernetes</w:t>
+      </w:r>
+      <w:r/>
+      <w:r>
+        <w:rPr>
+          <w:b/>
+        </w:rPr>
+      </w:r>
+      <w:r/>
+      <w:r>
+        <w:rPr>
+          <w:b/>
+        </w:rPr>
+      </w:r>
+      <w:r/>
+      <w:r>
+        <w:rPr>
+          <w:b/>
+        </w:rPr>
+      </w:r>
+      <w:r>
+        <w:rPr>
+          <w:color w:val="1F6FEB"/>
+        </w:rPr>
+      </w:r>
+    </w:p>
+    <w:p>
+      <w:pPr>
         <w:pStyle w:val="Heading2"/>
       </w:pPr>
       <w:r>
-        <w:t>Lab 14 — HPA v2: metrics-server, HorizontalPodAutoscaler, Load Test, Watch Scale</w:t>
-      </w:r>
-    </w:p>
-    <w:p>
-      <w:r>
-        <w:rPr>
-          <w:b/>
-        </w:rPr>
-        <w:t xml:space="preserve">Domain: </w:t>
-      </w:r>
-      <w:r>
-        <w:t xml:space="preserve">Workloads &amp; Scheduling   </w:t>
-      </w:r>
-      <w:r>
-        <w:rPr>
-          <w:b/>
-        </w:rPr>
-        <w:t xml:space="preserve">Topic: </w:t>
-      </w:r>
-      <w:r>
-        <w:t xml:space="preserve">Horizontal Pod Autoscaling   </w:t>
-      </w:r>
-      <w:r>
-        <w:rPr>
-          <w:b/>
-        </w:rPr>
-        <w:t xml:space="preserve">Duration: </w:t>
-      </w:r>
-      <w:r>
-        <w:t xml:space="preserve">45 min   </w:t>
-      </w:r>
-      <w:r>
-        <w:rPr>
-          <w:b/>
-        </w:rPr>
-        <w:t xml:space="preserve">Killercoda: </w:t>
-      </w:r>
-      <w:r>
-        <w:rPr>
-          <w:color w:val="1F6FEB"/>
-        </w:rPr>
-        <w:t>https://killercoda.com/playgrounds/scenario/kubernetes</w:t>
-      </w:r>
-    </w:p>
-    <w:p>
-      <w:pPr>
-        <w:pStyle w:val="Heading3"/>
-      </w:pPr>
-      <w:r>
         <w:t>Goal</w:t>
       </w:r>
     </w:p>
@@ -7683,7 +7539,7 @@
     </w:p>
     <w:p>
       <w:pPr>
-        <w:pStyle w:val="Heading3"/>
+        <w:pStyle w:val="Heading2"/>
       </w:pPr>
       <w:r>
         <w:t>What you'll build</w:t>
@@ -7696,7 +7552,7 @@
     </w:p>
     <w:p>
       <w:pPr>
-        <w:pStyle w:val="Heading3"/>
+        <w:pStyle w:val="Heading2"/>
       </w:pPr>
       <w:r>
         <w:t>Step 1 — Install metrics-server</w:t>
@@ -7765,7 +7621,7 @@
     <w:p/>
     <w:p>
       <w:pPr>
-        <w:pStyle w:val="Heading3"/>
+        <w:pStyle w:val="Heading2"/>
       </w:pPr>
       <w:r>
         <w:t>Step 2 — Deployment with resource requests</w:t>
@@ -7819,7 +7675,7 @@
     <w:p/>
     <w:p>
       <w:pPr>
-        <w:pStyle w:val="Heading3"/>
+        <w:pStyle w:val="Heading2"/>
       </w:pPr>
       <w:r>
         <w:t>Step 3 — Create HPA</w:t>
@@ -7858,7 +7714,7 @@
     <w:p/>
     <w:p>
       <w:pPr>
-        <w:pStyle w:val="Heading3"/>
+        <w:pStyle w:val="Heading2"/>
       </w:pPr>
       <w:r>
         <w:t>Step 4 — Generate load and watch scaling</w:t>
@@ -7952,58 +7808,48 @@
     <w:p/>
     <w:p>
       <w:pPr>
+        <w:pStyle w:val="Heading1"/>
+      </w:pPr>
+      <w:r>
+        <w:t>Lab 15 — Self-Healing: Liveness/Readiness Probes, ReplicaSet, DaemonSet, StatefulSet</w:t>
+      </w:r>
+    </w:p>
+    <w:p>
+      <w:r>
+        <w:rPr>
+          <w:b/>
+        </w:rPr>
+        <w:t>Domain: Workloads &amp; Scheduling  ·  Topic: Self-healing workloads  ·  Duration: 45 min  ·  Killercoda: https://killercoda.com/playgrounds/scenario/kubernetes</w:t>
+      </w:r>
+      <w:r/>
+      <w:r>
+        <w:rPr>
+          <w:b/>
+        </w:rPr>
+      </w:r>
+      <w:r/>
+      <w:r>
+        <w:rPr>
+          <w:b/>
+        </w:rPr>
+      </w:r>
+      <w:r/>
+      <w:r>
+        <w:rPr>
+          <w:b/>
+        </w:rPr>
+      </w:r>
+      <w:r>
+        <w:rPr>
+          <w:color w:val="1F6FEB"/>
+        </w:rPr>
+      </w:r>
+    </w:p>
+    <w:p>
+      <w:pPr>
         <w:pStyle w:val="Heading2"/>
       </w:pPr>
       <w:r>
-        <w:t>Lab 15 — Self-Healing: Liveness/Readiness Probes, ReplicaSet, DaemonSet, StatefulSet</w:t>
-      </w:r>
-    </w:p>
-    <w:p>
-      <w:r>
-        <w:rPr>
-          <w:b/>
-        </w:rPr>
-        <w:t xml:space="preserve">Domain: </w:t>
-      </w:r>
-      <w:r>
-        <w:t xml:space="preserve">Workloads &amp; Scheduling   </w:t>
-      </w:r>
-      <w:r>
-        <w:rPr>
-          <w:b/>
-        </w:rPr>
-        <w:t xml:space="preserve">Topic: </w:t>
-      </w:r>
-      <w:r>
-        <w:t xml:space="preserve">Self-healing workloads   </w:t>
-      </w:r>
-      <w:r>
-        <w:rPr>
-          <w:b/>
-        </w:rPr>
-        <w:t xml:space="preserve">Duration: </w:t>
-      </w:r>
-      <w:r>
-        <w:t xml:space="preserve">45 min   </w:t>
-      </w:r>
-      <w:r>
-        <w:rPr>
-          <w:b/>
-        </w:rPr>
-        <w:t xml:space="preserve">Killercoda: </w:t>
-      </w:r>
-      <w:r>
-        <w:rPr>
-          <w:color w:val="1F6FEB"/>
-        </w:rPr>
-        <w:t>https://killercoda.com/playgrounds/scenario/kubernetes</w:t>
-      </w:r>
-    </w:p>
-    <w:p>
-      <w:pPr>
-        <w:pStyle w:val="Heading3"/>
-      </w:pPr>
-      <w:r>
         <w:t>Goal</w:t>
       </w:r>
     </w:p>
@@ -8014,7 +7860,7 @@
     </w:p>
     <w:p>
       <w:pPr>
-        <w:pStyle w:val="Heading3"/>
+        <w:pStyle w:val="Heading2"/>
       </w:pPr>
       <w:r>
         <w:t>What you'll build</w:t>
@@ -8027,7 +7873,7 @@
     </w:p>
     <w:p>
       <w:pPr>
-        <w:pStyle w:val="Heading3"/>
+        <w:pStyle w:val="Heading2"/>
       </w:pPr>
       <w:r>
         <w:t>Step 1 — Liveness probe: httpGet</w:t>
@@ -8306,7 +8152,7 @@
     <w:p/>
     <w:p>
       <w:pPr>
-        <w:pStyle w:val="Heading3"/>
+        <w:pStyle w:val="Heading2"/>
       </w:pPr>
       <w:r>
         <w:t>Step 2 — Readiness probe blocks traffic</w:t>
@@ -8405,7 +8251,7 @@
     <w:p/>
     <w:p>
       <w:pPr>
-        <w:pStyle w:val="Heading3"/>
+        <w:pStyle w:val="Heading2"/>
       </w:pPr>
       <w:r>
         <w:t>Step 3 — ReplicaSet self-healing</w:t>
@@ -8474,7 +8320,7 @@
     <w:p/>
     <w:p>
       <w:pPr>
-        <w:pStyle w:val="Heading3"/>
+        <w:pStyle w:val="Heading2"/>
       </w:pPr>
       <w:r>
         <w:t>Step 4 — DaemonSet: one pod per node</w:t>
@@ -8823,58 +8669,48 @@
     <w:p/>
     <w:p>
       <w:pPr>
+        <w:pStyle w:val="Heading1"/>
+      </w:pPr>
+      <w:r>
+        <w:t>Lab 16 — Scheduling: nodeSelector, Node Affinity, Taints + Tolerations, Resource Requests</w:t>
+      </w:r>
+    </w:p>
+    <w:p>
+      <w:r>
+        <w:rPr>
+          <w:b/>
+        </w:rPr>
+        <w:t>Domain: Workloads &amp; Scheduling  ·  Topic: Scheduling  ·  Duration: 45 min  ·  Killercoda: https://killercoda.com/playgrounds/scenario/kubernetes</w:t>
+      </w:r>
+      <w:r/>
+      <w:r>
+        <w:rPr>
+          <w:b/>
+        </w:rPr>
+      </w:r>
+      <w:r/>
+      <w:r>
+        <w:rPr>
+          <w:b/>
+        </w:rPr>
+      </w:r>
+      <w:r/>
+      <w:r>
+        <w:rPr>
+          <w:b/>
+        </w:rPr>
+      </w:r>
+      <w:r>
+        <w:rPr>
+          <w:color w:val="1F6FEB"/>
+        </w:rPr>
+      </w:r>
+    </w:p>
+    <w:p>
+      <w:pPr>
         <w:pStyle w:val="Heading2"/>
       </w:pPr>
       <w:r>
-        <w:t>Lab 16 — Scheduling: nodeSelector, Node Affinity, Taints + Tolerations, Resource Requests</w:t>
-      </w:r>
-    </w:p>
-    <w:p>
-      <w:r>
-        <w:rPr>
-          <w:b/>
-        </w:rPr>
-        <w:t xml:space="preserve">Domain: </w:t>
-      </w:r>
-      <w:r>
-        <w:t xml:space="preserve">Workloads &amp; Scheduling   </w:t>
-      </w:r>
-      <w:r>
-        <w:rPr>
-          <w:b/>
-        </w:rPr>
-        <w:t xml:space="preserve">Topic: </w:t>
-      </w:r>
-      <w:r>
-        <w:t xml:space="preserve">Scheduling   </w:t>
-      </w:r>
-      <w:r>
-        <w:rPr>
-          <w:b/>
-        </w:rPr>
-        <w:t xml:space="preserve">Duration: </w:t>
-      </w:r>
-      <w:r>
-        <w:t xml:space="preserve">45 min   </w:t>
-      </w:r>
-      <w:r>
-        <w:rPr>
-          <w:b/>
-        </w:rPr>
-        <w:t xml:space="preserve">Killercoda: </w:t>
-      </w:r>
-      <w:r>
-        <w:rPr>
-          <w:color w:val="1F6FEB"/>
-        </w:rPr>
-        <w:t>https://killercoda.com/playgrounds/scenario/kubernetes</w:t>
-      </w:r>
-    </w:p>
-    <w:p>
-      <w:pPr>
-        <w:pStyle w:val="Heading3"/>
-      </w:pPr>
-      <w:r>
         <w:t>Goal</w:t>
       </w:r>
     </w:p>
@@ -8885,7 +8721,7 @@
     </w:p>
     <w:p>
       <w:pPr>
-        <w:pStyle w:val="Heading3"/>
+        <w:pStyle w:val="Heading2"/>
       </w:pPr>
       <w:r>
         <w:t>What you'll build</w:t>
@@ -8898,7 +8734,7 @@
     </w:p>
     <w:p>
       <w:pPr>
-        <w:pStyle w:val="Heading3"/>
+        <w:pStyle w:val="Heading2"/>
       </w:pPr>
       <w:r>
         <w:t>Step 1 — nodeSelector: simple label matching</w:t>
@@ -9117,7 +8953,7 @@
     <w:p/>
     <w:p>
       <w:pPr>
-        <w:pStyle w:val="Heading3"/>
+        <w:pStyle w:val="Heading2"/>
       </w:pPr>
       <w:r>
         <w:t>Step 2 — Node Affinity</w:t>
@@ -9171,7 +9007,7 @@
     <w:p/>
     <w:p>
       <w:pPr>
-        <w:pStyle w:val="Heading3"/>
+        <w:pStyle w:val="Heading2"/>
       </w:pPr>
       <w:r>
         <w:t>Step 3 — Taints and Tolerations</w:t>
@@ -9330,7 +9166,7 @@
     <w:p/>
     <w:p>
       <w:pPr>
-        <w:pStyle w:val="Heading3"/>
+        <w:pStyle w:val="Heading2"/>
       </w:pPr>
       <w:r>
         <w:t>Step 4 — Remove taint and clean up</w:t>
@@ -9394,58 +9230,48 @@
     <w:p/>
     <w:p>
       <w:pPr>
+        <w:pStyle w:val="Heading1"/>
+      </w:pPr>
+      <w:r>
+        <w:t>Lab 17 — Pod Connectivity: Flat Pod Network, ping, curl, DNS Discovery, netshoot</w:t>
+      </w:r>
+    </w:p>
+    <w:p>
+      <w:r>
+        <w:rPr>
+          <w:b/>
+        </w:rPr>
+        <w:t>Domain: Services &amp; Networking  ·  Topic: Pod networking  ·  Duration: 45 min  ·  Killercoda: https://killercoda.com/playgrounds/scenario/kubernetes</w:t>
+      </w:r>
+      <w:r/>
+      <w:r>
+        <w:rPr>
+          <w:b/>
+        </w:rPr>
+      </w:r>
+      <w:r/>
+      <w:r>
+        <w:rPr>
+          <w:b/>
+        </w:rPr>
+      </w:r>
+      <w:r/>
+      <w:r>
+        <w:rPr>
+          <w:b/>
+        </w:rPr>
+      </w:r>
+      <w:r>
+        <w:rPr>
+          <w:color w:val="1F6FEB"/>
+        </w:rPr>
+      </w:r>
+    </w:p>
+    <w:p>
+      <w:pPr>
         <w:pStyle w:val="Heading2"/>
       </w:pPr>
       <w:r>
-        <w:t>Lab 17 — Pod Connectivity: Flat Pod Network, ping, curl, DNS Discovery, netshoot</w:t>
-      </w:r>
-    </w:p>
-    <w:p>
-      <w:r>
-        <w:rPr>
-          <w:b/>
-        </w:rPr>
-        <w:t xml:space="preserve">Domain: </w:t>
-      </w:r>
-      <w:r>
-        <w:t xml:space="preserve">Services &amp; Networking   </w:t>
-      </w:r>
-      <w:r>
-        <w:rPr>
-          <w:b/>
-        </w:rPr>
-        <w:t xml:space="preserve">Topic: </w:t>
-      </w:r>
-      <w:r>
-        <w:t xml:space="preserve">Pod networking   </w:t>
-      </w:r>
-      <w:r>
-        <w:rPr>
-          <w:b/>
-        </w:rPr>
-        <w:t xml:space="preserve">Duration: </w:t>
-      </w:r>
-      <w:r>
-        <w:t xml:space="preserve">45 min   </w:t>
-      </w:r>
-      <w:r>
-        <w:rPr>
-          <w:b/>
-        </w:rPr>
-        <w:t xml:space="preserve">Killercoda: </w:t>
-      </w:r>
-      <w:r>
-        <w:rPr>
-          <w:color w:val="1F6FEB"/>
-        </w:rPr>
-        <w:t>https://killercoda.com/playgrounds/scenario/kubernetes</w:t>
-      </w:r>
-    </w:p>
-    <w:p>
-      <w:pPr>
-        <w:pStyle w:val="Heading3"/>
-      </w:pPr>
-      <w:r>
         <w:t>Goal</w:t>
       </w:r>
     </w:p>
@@ -9456,7 +9282,7 @@
     </w:p>
     <w:p>
       <w:pPr>
-        <w:pStyle w:val="Heading3"/>
+        <w:pStyle w:val="Heading2"/>
       </w:pPr>
       <w:r>
         <w:t>What you'll build</w:t>
@@ -9469,7 +9295,7 @@
     </w:p>
     <w:p>
       <w:pPr>
-        <w:pStyle w:val="Heading3"/>
+        <w:pStyle w:val="Heading2"/>
       </w:pPr>
       <w:r>
         <w:t>Step 1 — Deploy test pods</w:t>
@@ -9538,7 +9364,7 @@
     <w:p/>
     <w:p>
       <w:pPr>
-        <w:pStyle w:val="Heading3"/>
+        <w:pStyle w:val="Heading2"/>
       </w:pPr>
       <w:r>
         <w:t>Step 2 — Ping by Pod IP</w:t>
@@ -9577,7 +9403,7 @@
     <w:p/>
     <w:p>
       <w:pPr>
-        <w:pStyle w:val="Heading3"/>
+        <w:pStyle w:val="Heading2"/>
       </w:pPr>
       <w:r>
         <w:t>Step 3 — DNS-based service discovery</w:t>
@@ -9631,7 +9457,7 @@
     <w:p/>
     <w:p>
       <w:pPr>
-        <w:pStyle w:val="Heading3"/>
+        <w:pStyle w:val="Heading2"/>
       </w:pPr>
       <w:r>
         <w:t>Step 4 — Network debugging with netshoot</w:t>
@@ -9710,58 +9536,48 @@
     <w:p/>
     <w:p>
       <w:pPr>
+        <w:pStyle w:val="Heading1"/>
+      </w:pPr>
+      <w:r>
+        <w:t>Lab 18 — Service Types: ClusterIP, NodePort, LoadBalancer (MetalLB), EndpointSlices, Selector Debug</w:t>
+      </w:r>
+    </w:p>
+    <w:p>
+      <w:r>
+        <w:rPr>
+          <w:b/>
+        </w:rPr>
+        <w:t>Domain: Services &amp; Networking  ·  Topic: Service types  ·  Duration: 45 min  ·  Killercoda: https://killercoda.com/playgrounds/scenario/kubernetes</w:t>
+      </w:r>
+      <w:r/>
+      <w:r>
+        <w:rPr>
+          <w:b/>
+        </w:rPr>
+      </w:r>
+      <w:r/>
+      <w:r>
+        <w:rPr>
+          <w:b/>
+        </w:rPr>
+      </w:r>
+      <w:r/>
+      <w:r>
+        <w:rPr>
+          <w:b/>
+        </w:rPr>
+      </w:r>
+      <w:r>
+        <w:rPr>
+          <w:color w:val="1F6FEB"/>
+        </w:rPr>
+      </w:r>
+    </w:p>
+    <w:p>
+      <w:pPr>
         <w:pStyle w:val="Heading2"/>
       </w:pPr>
       <w:r>
-        <w:t>Lab 18 — Service Types: ClusterIP, NodePort, LoadBalancer (MetalLB), EndpointSlices, Selector Debug</w:t>
-      </w:r>
-    </w:p>
-    <w:p>
-      <w:r>
-        <w:rPr>
-          <w:b/>
-        </w:rPr>
-        <w:t xml:space="preserve">Domain: </w:t>
-      </w:r>
-      <w:r>
-        <w:t xml:space="preserve">Services &amp; Networking   </w:t>
-      </w:r>
-      <w:r>
-        <w:rPr>
-          <w:b/>
-        </w:rPr>
-        <w:t xml:space="preserve">Topic: </w:t>
-      </w:r>
-      <w:r>
-        <w:t xml:space="preserve">Service types   </w:t>
-      </w:r>
-      <w:r>
-        <w:rPr>
-          <w:b/>
-        </w:rPr>
-        <w:t xml:space="preserve">Duration: </w:t>
-      </w:r>
-      <w:r>
-        <w:t xml:space="preserve">45 min   </w:t>
-      </w:r>
-      <w:r>
-        <w:rPr>
-          <w:b/>
-        </w:rPr>
-        <w:t xml:space="preserve">Killercoda: </w:t>
-      </w:r>
-      <w:r>
-        <w:rPr>
-          <w:color w:val="1F6FEB"/>
-        </w:rPr>
-        <w:t>https://killercoda.com/playgrounds/scenario/kubernetes</w:t>
-      </w:r>
-    </w:p>
-    <w:p>
-      <w:pPr>
-        <w:pStyle w:val="Heading3"/>
-      </w:pPr>
-      <w:r>
         <w:t>Goal</w:t>
       </w:r>
     </w:p>
@@ -9772,7 +9588,7 @@
     </w:p>
     <w:p>
       <w:pPr>
-        <w:pStyle w:val="Heading3"/>
+        <w:pStyle w:val="Heading2"/>
       </w:pPr>
       <w:r>
         <w:t>What you'll build</w:t>
@@ -9785,7 +9601,7 @@
     </w:p>
     <w:p>
       <w:pPr>
-        <w:pStyle w:val="Heading3"/>
+        <w:pStyle w:val="Heading2"/>
       </w:pPr>
       <w:r>
         <w:t>Step 1 — ClusterIP service</w:t>
@@ -9854,7 +9670,7 @@
     <w:p/>
     <w:p>
       <w:pPr>
-        <w:pStyle w:val="Heading3"/>
+        <w:pStyle w:val="Heading2"/>
       </w:pPr>
       <w:r>
         <w:t>Step 2 — NodePort service</w:t>
@@ -9908,7 +9724,7 @@
     <w:p/>
     <w:p>
       <w:pPr>
-        <w:pStyle w:val="Heading3"/>
+        <w:pStyle w:val="Heading2"/>
       </w:pPr>
       <w:r>
         <w:t>Step 3 — Debug: selector mismatch causing no endpoints</w:t>
@@ -10055,58 +9871,48 @@
     </w:p>
     <w:p>
       <w:pPr>
+        <w:pStyle w:val="Heading1"/>
+      </w:pPr>
+      <w:r>
+        <w:t>Lab 19 — Ingress Controller: Host Routing, TLS Termination, Path Rules, Debug</w:t>
+      </w:r>
+    </w:p>
+    <w:p>
+      <w:r>
+        <w:rPr>
+          <w:b/>
+        </w:rPr>
+        <w:t>Domain: Services &amp; Networking  ·  Topic: Ingress  ·  Duration: 45 min  ·  Killercoda: https://killercoda.com/playgrounds/scenario/kubernetes</w:t>
+      </w:r>
+      <w:r/>
+      <w:r>
+        <w:rPr>
+          <w:b/>
+        </w:rPr>
+      </w:r>
+      <w:r/>
+      <w:r>
+        <w:rPr>
+          <w:b/>
+        </w:rPr>
+      </w:r>
+      <w:r/>
+      <w:r>
+        <w:rPr>
+          <w:b/>
+        </w:rPr>
+      </w:r>
+      <w:r>
+        <w:rPr>
+          <w:color w:val="1F6FEB"/>
+        </w:rPr>
+      </w:r>
+    </w:p>
+    <w:p>
+      <w:pPr>
         <w:pStyle w:val="Heading2"/>
       </w:pPr>
       <w:r>
-        <w:t>Lab 19 — Ingress Controller: Host Routing, TLS Termination, Path Rules, Debug</w:t>
-      </w:r>
-    </w:p>
-    <w:p>
-      <w:r>
-        <w:rPr>
-          <w:b/>
-        </w:rPr>
-        <w:t xml:space="preserve">Domain: </w:t>
-      </w:r>
-      <w:r>
-        <w:t xml:space="preserve">Services &amp; Networking   </w:t>
-      </w:r>
-      <w:r>
-        <w:rPr>
-          <w:b/>
-        </w:rPr>
-        <w:t xml:space="preserve">Topic: </w:t>
-      </w:r>
-      <w:r>
-        <w:t xml:space="preserve">Ingress   </w:t>
-      </w:r>
-      <w:r>
-        <w:rPr>
-          <w:b/>
-        </w:rPr>
-        <w:t xml:space="preserve">Duration: </w:t>
-      </w:r>
-      <w:r>
-        <w:t xml:space="preserve">45 min   </w:t>
-      </w:r>
-      <w:r>
-        <w:rPr>
-          <w:b/>
-        </w:rPr>
-        <w:t xml:space="preserve">Killercoda: </w:t>
-      </w:r>
-      <w:r>
-        <w:rPr>
-          <w:color w:val="1F6FEB"/>
-        </w:rPr>
-        <w:t>https://killercoda.com/playgrounds/scenario/kubernetes</w:t>
-      </w:r>
-    </w:p>
-    <w:p>
-      <w:pPr>
-        <w:pStyle w:val="Heading3"/>
-      </w:pPr>
-      <w:r>
         <w:t>Goal</w:t>
       </w:r>
     </w:p>
@@ -10117,7 +9923,7 @@
     </w:p>
     <w:p>
       <w:pPr>
-        <w:pStyle w:val="Heading3"/>
+        <w:pStyle w:val="Heading2"/>
       </w:pPr>
       <w:r>
         <w:t>What you'll build</w:t>
@@ -10130,7 +9936,7 @@
     </w:p>
     <w:p>
       <w:pPr>
-        <w:pStyle w:val="Heading3"/>
+        <w:pStyle w:val="Heading2"/>
       </w:pPr>
       <w:r>
         <w:t>Step 1 — Install ingress-nginx</w:t>
@@ -10184,7 +9990,7 @@
     <w:p/>
     <w:p>
       <w:pPr>
-        <w:pStyle w:val="Heading3"/>
+        <w:pStyle w:val="Heading2"/>
       </w:pPr>
       <w:r>
         <w:t>Step 2 — Get NodePort for testing</w:t>
@@ -10238,7 +10044,7 @@
     <w:p/>
     <w:p>
       <w:pPr>
-        <w:pStyle w:val="Heading3"/>
+        <w:pStyle w:val="Heading2"/>
       </w:pPr>
       <w:r>
         <w:t>Step 3 — Create Ingress with host-based routing</w:t>
@@ -10562,7 +10368,7 @@
     <w:p/>
     <w:p>
       <w:pPr>
-        <w:pStyle w:val="Heading3"/>
+        <w:pStyle w:val="Heading2"/>
       </w:pPr>
       <w:r>
         <w:t>Step 4 — TLS termination</w:t>
@@ -10671,58 +10477,48 @@
     <w:p/>
     <w:p>
       <w:pPr>
+        <w:pStyle w:val="Heading1"/>
+      </w:pPr>
+      <w:r>
+        <w:t>Lab 20 — Gateway API: GatewayClass, Gateway, HTTPRoute (GA in v1.28, tested in CKA 2026)</w:t>
+      </w:r>
+    </w:p>
+    <w:p>
+      <w:r>
+        <w:rPr>
+          <w:b/>
+        </w:rPr>
+        <w:t>Domain: Services &amp; Networking  ·  Topic: Gateway API  ·  Duration: 45 min  ·  Killercoda: https://killercoda.com/playgrounds/scenario/kubernetes</w:t>
+      </w:r>
+      <w:r/>
+      <w:r>
+        <w:rPr>
+          <w:b/>
+        </w:rPr>
+      </w:r>
+      <w:r/>
+      <w:r>
+        <w:rPr>
+          <w:b/>
+        </w:rPr>
+      </w:r>
+      <w:r/>
+      <w:r>
+        <w:rPr>
+          <w:b/>
+        </w:rPr>
+      </w:r>
+      <w:r>
+        <w:rPr>
+          <w:color w:val="1F6FEB"/>
+        </w:rPr>
+      </w:r>
+    </w:p>
+    <w:p>
+      <w:pPr>
         <w:pStyle w:val="Heading2"/>
       </w:pPr>
       <w:r>
-        <w:t>Lab 20 — Gateway API: GatewayClass, Gateway, HTTPRoute (GA in v1.28, tested in CKA 2026)</w:t>
-      </w:r>
-    </w:p>
-    <w:p>
-      <w:r>
-        <w:rPr>
-          <w:b/>
-        </w:rPr>
-        <w:t xml:space="preserve">Domain: </w:t>
-      </w:r>
-      <w:r>
-        <w:t xml:space="preserve">Services &amp; Networking   </w:t>
-      </w:r>
-      <w:r>
-        <w:rPr>
-          <w:b/>
-        </w:rPr>
-        <w:t xml:space="preserve">Topic: </w:t>
-      </w:r>
-      <w:r>
-        <w:t xml:space="preserve">Gateway API   </w:t>
-      </w:r>
-      <w:r>
-        <w:rPr>
-          <w:b/>
-        </w:rPr>
-        <w:t xml:space="preserve">Duration: </w:t>
-      </w:r>
-      <w:r>
-        <w:t xml:space="preserve">45 min   </w:t>
-      </w:r>
-      <w:r>
-        <w:rPr>
-          <w:b/>
-        </w:rPr>
-        <w:t xml:space="preserve">Killercoda: </w:t>
-      </w:r>
-      <w:r>
-        <w:rPr>
-          <w:color w:val="1F6FEB"/>
-        </w:rPr>
-        <w:t>https://killercoda.com/playgrounds/scenario/kubernetes</w:t>
-      </w:r>
-    </w:p>
-    <w:p>
-      <w:pPr>
-        <w:pStyle w:val="Heading3"/>
-      </w:pPr>
-      <w:r>
         <w:t>Goal</w:t>
       </w:r>
     </w:p>
@@ -10733,7 +10529,7 @@
     </w:p>
     <w:p>
       <w:pPr>
-        <w:pStyle w:val="Heading3"/>
+        <w:pStyle w:val="Heading2"/>
       </w:pPr>
       <w:r>
         <w:t>What you'll build</w:t>
@@ -10746,7 +10542,7 @@
     </w:p>
     <w:p>
       <w:pPr>
-        <w:pStyle w:val="Heading3"/>
+        <w:pStyle w:val="Heading2"/>
       </w:pPr>
       <w:r>
         <w:t>Step 1 — Install Gateway API CRDs</w:t>
@@ -10785,7 +10581,7 @@
     <w:p/>
     <w:p>
       <w:pPr>
-        <w:pStyle w:val="Heading3"/>
+        <w:pStyle w:val="Heading2"/>
       </w:pPr>
       <w:r>
         <w:t>Step 2 — Install NGINX Gateway Fabric</w:t>
@@ -10824,7 +10620,7 @@
     <w:p/>
     <w:p>
       <w:pPr>
-        <w:pStyle w:val="Heading3"/>
+        <w:pStyle w:val="Heading2"/>
       </w:pPr>
       <w:r>
         <w:t>Step 3 — Create GatewayClass and Gateway</w:t>
@@ -11118,7 +10914,7 @@
     <w:p/>
     <w:p>
       <w:pPr>
-        <w:pStyle w:val="Heading3"/>
+        <w:pStyle w:val="Heading2"/>
       </w:pPr>
       <w:r>
         <w:t>Step 4 — Create HTTPRoute</w:t>
@@ -11407,58 +11203,48 @@
     <w:p/>
     <w:p>
       <w:pPr>
+        <w:pStyle w:val="Heading1"/>
+      </w:pPr>
+      <w:r>
+        <w:t>Lab 21 — NetworkPolicy: Default-Deny, Pod Selector, Namespace Selector, Egress Lockdown</w:t>
+      </w:r>
+    </w:p>
+    <w:p>
+      <w:r>
+        <w:rPr>
+          <w:b/>
+        </w:rPr>
+        <w:t>Domain: Services &amp; Networking  ·  Topic: Network Policies  ·  Duration: 45 min  ·  Killercoda: https://killercoda.com/playgrounds/scenario/kubernetes</w:t>
+      </w:r>
+      <w:r/>
+      <w:r>
+        <w:rPr>
+          <w:b/>
+        </w:rPr>
+      </w:r>
+      <w:r/>
+      <w:r>
+        <w:rPr>
+          <w:b/>
+        </w:rPr>
+      </w:r>
+      <w:r/>
+      <w:r>
+        <w:rPr>
+          <w:b/>
+        </w:rPr>
+      </w:r>
+      <w:r>
+        <w:rPr>
+          <w:color w:val="1F6FEB"/>
+        </w:rPr>
+      </w:r>
+    </w:p>
+    <w:p>
+      <w:pPr>
         <w:pStyle w:val="Heading2"/>
       </w:pPr>
       <w:r>
-        <w:t>Lab 21 — NetworkPolicy: Default-Deny, Pod Selector, Namespace Selector, Egress Lockdown</w:t>
-      </w:r>
-    </w:p>
-    <w:p>
-      <w:r>
-        <w:rPr>
-          <w:b/>
-        </w:rPr>
-        <w:t xml:space="preserve">Domain: </w:t>
-      </w:r>
-      <w:r>
-        <w:t xml:space="preserve">Services &amp; Networking   </w:t>
-      </w:r>
-      <w:r>
-        <w:rPr>
-          <w:b/>
-        </w:rPr>
-        <w:t xml:space="preserve">Topic: </w:t>
-      </w:r>
-      <w:r>
-        <w:t xml:space="preserve">Network Policies   </w:t>
-      </w:r>
-      <w:r>
-        <w:rPr>
-          <w:b/>
-        </w:rPr>
-        <w:t xml:space="preserve">Duration: </w:t>
-      </w:r>
-      <w:r>
-        <w:t xml:space="preserve">45 min   </w:t>
-      </w:r>
-      <w:r>
-        <w:rPr>
-          <w:b/>
-        </w:rPr>
-        <w:t xml:space="preserve">Killercoda: </w:t>
-      </w:r>
-      <w:r>
-        <w:rPr>
-          <w:color w:val="1F6FEB"/>
-        </w:rPr>
-        <w:t>https://killercoda.com/playgrounds/scenario/kubernetes</w:t>
-      </w:r>
-    </w:p>
-    <w:p>
-      <w:pPr>
-        <w:pStyle w:val="Heading3"/>
-      </w:pPr>
-      <w:r>
         <w:t>Goal</w:t>
       </w:r>
     </w:p>
@@ -11469,7 +11255,7 @@
     </w:p>
     <w:p>
       <w:pPr>
-        <w:pStyle w:val="Heading3"/>
+        <w:pStyle w:val="Heading2"/>
       </w:pPr>
       <w:r>
         <w:t>What you'll build</w:t>
@@ -11482,7 +11268,7 @@
     </w:p>
     <w:p>
       <w:pPr>
-        <w:pStyle w:val="Heading3"/>
+        <w:pStyle w:val="Heading2"/>
       </w:pPr>
       <w:r>
         <w:t>Step 1 — Create test workloads</w:t>
@@ -11596,7 +11382,7 @@
     <w:p/>
     <w:p>
       <w:pPr>
-        <w:pStyle w:val="Heading3"/>
+        <w:pStyle w:val="Heading2"/>
       </w:pPr>
       <w:r>
         <w:t>Step 2 — Apply default-deny-ingress</w:t>
@@ -11770,7 +11556,7 @@
     <w:p/>
     <w:p>
       <w:pPr>
-        <w:pStyle w:val="Heading3"/>
+        <w:pStyle w:val="Heading2"/>
       </w:pPr>
       <w:r>
         <w:t>Step 3 — Allow specific pod selector</w:t>
@@ -12104,58 +11890,48 @@
     <w:p/>
     <w:p>
       <w:pPr>
+        <w:pStyle w:val="Heading1"/>
+      </w:pPr>
+      <w:r>
+        <w:t>Lab 22 — CoreDNS: Corefile Inspection, Service DNS, Headless Services, Stub Zones</w:t>
+      </w:r>
+    </w:p>
+    <w:p>
+      <w:r>
+        <w:rPr>
+          <w:b/>
+        </w:rPr>
+        <w:t>Domain: Services &amp; Networking  ·  Topic: CoreDNS  ·  Duration: 30 min  ·  Killercoda: https://killercoda.com/playgrounds/scenario/kubernetes</w:t>
+      </w:r>
+      <w:r/>
+      <w:r>
+        <w:rPr>
+          <w:b/>
+        </w:rPr>
+      </w:r>
+      <w:r/>
+      <w:r>
+        <w:rPr>
+          <w:b/>
+        </w:rPr>
+      </w:r>
+      <w:r/>
+      <w:r>
+        <w:rPr>
+          <w:b/>
+        </w:rPr>
+      </w:r>
+      <w:r>
+        <w:rPr>
+          <w:color w:val="1F6FEB"/>
+        </w:rPr>
+      </w:r>
+    </w:p>
+    <w:p>
+      <w:pPr>
         <w:pStyle w:val="Heading2"/>
       </w:pPr>
       <w:r>
-        <w:t>Lab 22 — CoreDNS: Corefile Inspection, Service DNS, Headless Services, Stub Zones</w:t>
-      </w:r>
-    </w:p>
-    <w:p>
-      <w:r>
-        <w:rPr>
-          <w:b/>
-        </w:rPr>
-        <w:t xml:space="preserve">Domain: </w:t>
-      </w:r>
-      <w:r>
-        <w:t xml:space="preserve">Services &amp; Networking   </w:t>
-      </w:r>
-      <w:r>
-        <w:rPr>
-          <w:b/>
-        </w:rPr>
-        <w:t xml:space="preserve">Topic: </w:t>
-      </w:r>
-      <w:r>
-        <w:t xml:space="preserve">CoreDNS   </w:t>
-      </w:r>
-      <w:r>
-        <w:rPr>
-          <w:b/>
-        </w:rPr>
-        <w:t xml:space="preserve">Duration: </w:t>
-      </w:r>
-      <w:r>
-        <w:t xml:space="preserve">30 min   </w:t>
-      </w:r>
-      <w:r>
-        <w:rPr>
-          <w:b/>
-        </w:rPr>
-        <w:t xml:space="preserve">Killercoda: </w:t>
-      </w:r>
-      <w:r>
-        <w:rPr>
-          <w:color w:val="1F6FEB"/>
-        </w:rPr>
-        <w:t>https://killercoda.com/playgrounds/scenario/kubernetes</w:t>
-      </w:r>
-    </w:p>
-    <w:p>
-      <w:pPr>
-        <w:pStyle w:val="Heading3"/>
-      </w:pPr>
-      <w:r>
         <w:t>Goal</w:t>
       </w:r>
     </w:p>
@@ -12166,7 +11942,7 @@
     </w:p>
     <w:p>
       <w:pPr>
-        <w:pStyle w:val="Heading3"/>
+        <w:pStyle w:val="Heading2"/>
       </w:pPr>
       <w:r>
         <w:t>What you'll build</w:t>
@@ -12179,7 +11955,7 @@
     </w:p>
     <w:p>
       <w:pPr>
-        <w:pStyle w:val="Heading3"/>
+        <w:pStyle w:val="Heading2"/>
       </w:pPr>
       <w:r>
         <w:t>Step 1 — Inspect CoreDNS</w:t>
@@ -12233,7 +12009,7 @@
     <w:p/>
     <w:p>
       <w:pPr>
-        <w:pStyle w:val="Heading3"/>
+        <w:pStyle w:val="Heading2"/>
       </w:pPr>
       <w:r>
         <w:t>Step 2 — Query DNS from debug pod</w:t>
@@ -12302,7 +12078,7 @@
     <w:p/>
     <w:p>
       <w:pPr>
-        <w:pStyle w:val="Heading3"/>
+        <w:pStyle w:val="Heading2"/>
       </w:pPr>
       <w:r>
         <w:t>Step 3 — Headless service: per-pod A records</w:t>
@@ -12356,7 +12132,7 @@
     <w:p/>
     <w:p>
       <w:pPr>
-        <w:pStyle w:val="Heading3"/>
+        <w:pStyle w:val="Heading2"/>
       </w:pPr>
       <w:r>
         <w:t>Step 4 — Add stub zone to Corefile</w:t>
@@ -12465,58 +12241,48 @@
     <w:p/>
     <w:p>
       <w:pPr>
+        <w:pStyle w:val="Heading1"/>
+      </w:pPr>
+      <w:r>
+        <w:t>Lab 23 — PersistentVolume and PVC: Static Provisioning, Access Modes, Reclaim Policies</w:t>
+      </w:r>
+    </w:p>
+    <w:p>
+      <w:r>
+        <w:rPr>
+          <w:b/>
+        </w:rPr>
+        <w:t>Domain: Storage  ·  Topic: PersistentVolumes and PersistentVolumeClaims  ·  Duration: 45 min  ·  Killercoda: https://killercoda.com/playgrounds/scenario/kubernetes</w:t>
+      </w:r>
+      <w:r/>
+      <w:r>
+        <w:rPr>
+          <w:b/>
+        </w:rPr>
+      </w:r>
+      <w:r/>
+      <w:r>
+        <w:rPr>
+          <w:b/>
+        </w:rPr>
+      </w:r>
+      <w:r/>
+      <w:r>
+        <w:rPr>
+          <w:b/>
+        </w:rPr>
+      </w:r>
+      <w:r>
+        <w:rPr>
+          <w:color w:val="1F6FEB"/>
+        </w:rPr>
+      </w:r>
+    </w:p>
+    <w:p>
+      <w:pPr>
         <w:pStyle w:val="Heading2"/>
       </w:pPr>
       <w:r>
-        <w:t>Lab 23 — PersistentVolume and PVC: Static Provisioning, Access Modes, Reclaim Policies</w:t>
-      </w:r>
-    </w:p>
-    <w:p>
-      <w:r>
-        <w:rPr>
-          <w:b/>
-        </w:rPr>
-        <w:t xml:space="preserve">Domain: </w:t>
-      </w:r>
-      <w:r>
-        <w:t xml:space="preserve">Storage   </w:t>
-      </w:r>
-      <w:r>
-        <w:rPr>
-          <w:b/>
-        </w:rPr>
-        <w:t xml:space="preserve">Topic: </w:t>
-      </w:r>
-      <w:r>
-        <w:t xml:space="preserve">PersistentVolumes and PersistentVolumeClaims   </w:t>
-      </w:r>
-      <w:r>
-        <w:rPr>
-          <w:b/>
-        </w:rPr>
-        <w:t xml:space="preserve">Duration: </w:t>
-      </w:r>
-      <w:r>
-        <w:t xml:space="preserve">45 min   </w:t>
-      </w:r>
-      <w:r>
-        <w:rPr>
-          <w:b/>
-        </w:rPr>
-        <w:t xml:space="preserve">Killercoda: </w:t>
-      </w:r>
-      <w:r>
-        <w:rPr>
-          <w:color w:val="1F6FEB"/>
-        </w:rPr>
-        <w:t>https://killercoda.com/playgrounds/scenario/kubernetes</w:t>
-      </w:r>
-    </w:p>
-    <w:p>
-      <w:pPr>
-        <w:pStyle w:val="Heading3"/>
-      </w:pPr>
-      <w:r>
         <w:t>Goal</w:t>
       </w:r>
     </w:p>
@@ -12527,7 +12293,7 @@
     </w:p>
     <w:p>
       <w:pPr>
-        <w:pStyle w:val="Heading3"/>
+        <w:pStyle w:val="Heading2"/>
       </w:pPr>
       <w:r>
         <w:t>What you'll build</w:t>
@@ -12540,7 +12306,7 @@
     </w:p>
     <w:p>
       <w:pPr>
-        <w:pStyle w:val="Heading3"/>
+        <w:pStyle w:val="Heading2"/>
       </w:pPr>
       <w:r>
         <w:t>Step 1 — Create a PersistentVolume</w:t>
@@ -12774,7 +12540,7 @@
     <w:p/>
     <w:p>
       <w:pPr>
-        <w:pStyle w:val="Heading3"/>
+        <w:pStyle w:val="Heading2"/>
       </w:pPr>
       <w:r>
         <w:t>Step 2 — Create a PVC that binds to the PV</w:t>
@@ -12978,7 +12744,7 @@
     <w:p/>
     <w:p>
       <w:pPr>
-        <w:pStyle w:val="Heading3"/>
+        <w:pStyle w:val="Heading2"/>
       </w:pPr>
       <w:r>
         <w:t>Step 3 — Mount PVC in a pod</w:t>
@@ -13282,58 +13048,48 @@
     <w:p/>
     <w:p>
       <w:pPr>
+        <w:pStyle w:val="Heading1"/>
+      </w:pPr>
+      <w:r>
+        <w:t>Lab 24 — StorageClass: Dynamic Provisioning, Default Class, StatefulSet volumeClaimTemplates</w:t>
+      </w:r>
+    </w:p>
+    <w:p>
+      <w:r>
+        <w:rPr>
+          <w:b/>
+        </w:rPr>
+        <w:t>Domain: Storage  ·  Topic: StorageClass and dynamic provisioning  ·  Duration: 45 min  ·  Killercoda: https://killercoda.com/playgrounds/scenario/kubernetes</w:t>
+      </w:r>
+      <w:r/>
+      <w:r>
+        <w:rPr>
+          <w:b/>
+        </w:rPr>
+      </w:r>
+      <w:r/>
+      <w:r>
+        <w:rPr>
+          <w:b/>
+        </w:rPr>
+      </w:r>
+      <w:r/>
+      <w:r>
+        <w:rPr>
+          <w:b/>
+        </w:rPr>
+      </w:r>
+      <w:r>
+        <w:rPr>
+          <w:color w:val="1F6FEB"/>
+        </w:rPr>
+      </w:r>
+    </w:p>
+    <w:p>
+      <w:pPr>
         <w:pStyle w:val="Heading2"/>
       </w:pPr>
       <w:r>
-        <w:t>Lab 24 — StorageClass: Dynamic Provisioning, Default Class, StatefulSet volumeClaimTemplates</w:t>
-      </w:r>
-    </w:p>
-    <w:p>
-      <w:r>
-        <w:rPr>
-          <w:b/>
-        </w:rPr>
-        <w:t xml:space="preserve">Domain: </w:t>
-      </w:r>
-      <w:r>
-        <w:t xml:space="preserve">Storage   </w:t>
-      </w:r>
-      <w:r>
-        <w:rPr>
-          <w:b/>
-        </w:rPr>
-        <w:t xml:space="preserve">Topic: </w:t>
-      </w:r>
-      <w:r>
-        <w:t xml:space="preserve">StorageClass and dynamic provisioning   </w:t>
-      </w:r>
-      <w:r>
-        <w:rPr>
-          <w:b/>
-        </w:rPr>
-        <w:t xml:space="preserve">Duration: </w:t>
-      </w:r>
-      <w:r>
-        <w:t xml:space="preserve">45 min   </w:t>
-      </w:r>
-      <w:r>
-        <w:rPr>
-          <w:b/>
-        </w:rPr>
-        <w:t xml:space="preserve">Killercoda: </w:t>
-      </w:r>
-      <w:r>
-        <w:rPr>
-          <w:color w:val="1F6FEB"/>
-        </w:rPr>
-        <w:t>https://killercoda.com/playgrounds/scenario/kubernetes</w:t>
-      </w:r>
-    </w:p>
-    <w:p>
-      <w:pPr>
-        <w:pStyle w:val="Heading3"/>
-      </w:pPr>
-      <w:r>
         <w:t>Goal</w:t>
       </w:r>
     </w:p>
@@ -13344,7 +13100,7 @@
     </w:p>
     <w:p>
       <w:pPr>
-        <w:pStyle w:val="Heading3"/>
+        <w:pStyle w:val="Heading2"/>
       </w:pPr>
       <w:r>
         <w:t>What you'll build</w:t>
@@ -13357,7 +13113,7 @@
     </w:p>
     <w:p>
       <w:pPr>
-        <w:pStyle w:val="Heading3"/>
+        <w:pStyle w:val="Heading2"/>
       </w:pPr>
       <w:r>
         <w:t>Step 1 — Install local-path-provisioner</w:t>
@@ -13411,7 +13167,7 @@
     <w:p/>
     <w:p>
       <w:pPr>
-        <w:pStyle w:val="Heading3"/>
+        <w:pStyle w:val="Heading2"/>
       </w:pPr>
       <w:r>
         <w:t>Step 2 — Mark StorageClass as default</w:t>
@@ -13450,7 +13206,7 @@
     <w:p/>
     <w:p>
       <w:pPr>
-        <w:pStyle w:val="Heading3"/>
+        <w:pStyle w:val="Heading2"/>
       </w:pPr>
       <w:r>
         <w:t>Step 3 — Dynamic PVC provisioning</w:t>
@@ -13654,7 +13410,7 @@
     <w:p/>
     <w:p>
       <w:pPr>
-        <w:pStyle w:val="Heading3"/>
+        <w:pStyle w:val="Heading2"/>
       </w:pPr>
       <w:r>
         <w:t>Step 4 — StatefulSet with volumeClaimTemplates</w:t>
@@ -14213,58 +13969,48 @@
     <w:p/>
     <w:p>
       <w:pPr>
+        <w:pStyle w:val="Heading1"/>
+      </w:pPr>
+      <w:r>
+        <w:t>Lab 25 — Volume Types: emptyDir, hostPath, projected, downwardAPI</w:t>
+      </w:r>
+    </w:p>
+    <w:p>
+      <w:r>
+        <w:rPr>
+          <w:b/>
+        </w:rPr>
+        <w:t>Domain: Storage  ·  Topic: Pod volume types  ·  Duration: 45 min  ·  Killercoda: https://killercoda.com/playgrounds/scenario/kubernetes</w:t>
+      </w:r>
+      <w:r/>
+      <w:r>
+        <w:rPr>
+          <w:b/>
+        </w:rPr>
+      </w:r>
+      <w:r/>
+      <w:r>
+        <w:rPr>
+          <w:b/>
+        </w:rPr>
+      </w:r>
+      <w:r/>
+      <w:r>
+        <w:rPr>
+          <w:b/>
+        </w:rPr>
+      </w:r>
+      <w:r>
+        <w:rPr>
+          <w:color w:val="1F6FEB"/>
+        </w:rPr>
+      </w:r>
+    </w:p>
+    <w:p>
+      <w:pPr>
         <w:pStyle w:val="Heading2"/>
       </w:pPr>
       <w:r>
-        <w:t>Lab 25 — Volume Types: emptyDir, hostPath, projected, downwardAPI</w:t>
-      </w:r>
-    </w:p>
-    <w:p>
-      <w:r>
-        <w:rPr>
-          <w:b/>
-        </w:rPr>
-        <w:t xml:space="preserve">Domain: </w:t>
-      </w:r>
-      <w:r>
-        <w:t xml:space="preserve">Storage   </w:t>
-      </w:r>
-      <w:r>
-        <w:rPr>
-          <w:b/>
-        </w:rPr>
-        <w:t xml:space="preserve">Topic: </w:t>
-      </w:r>
-      <w:r>
-        <w:t xml:space="preserve">Pod volume types   </w:t>
-      </w:r>
-      <w:r>
-        <w:rPr>
-          <w:b/>
-        </w:rPr>
-        <w:t xml:space="preserve">Duration: </w:t>
-      </w:r>
-      <w:r>
-        <w:t xml:space="preserve">45 min   </w:t>
-      </w:r>
-      <w:r>
-        <w:rPr>
-          <w:b/>
-        </w:rPr>
-        <w:t xml:space="preserve">Killercoda: </w:t>
-      </w:r>
-      <w:r>
-        <w:rPr>
-          <w:color w:val="1F6FEB"/>
-        </w:rPr>
-        <w:t>https://killercoda.com/playgrounds/scenario/kubernetes</w:t>
-      </w:r>
-    </w:p>
-    <w:p>
-      <w:pPr>
-        <w:pStyle w:val="Heading3"/>
-      </w:pPr>
-      <w:r>
         <w:t>Goal</w:t>
       </w:r>
     </w:p>
@@ -14275,7 +14021,7 @@
     </w:p>
     <w:p>
       <w:pPr>
-        <w:pStyle w:val="Heading3"/>
+        <w:pStyle w:val="Heading2"/>
       </w:pPr>
       <w:r>
         <w:t>What you'll build</w:t>
@@ -14288,7 +14034,7 @@
     </w:p>
     <w:p>
       <w:pPr>
-        <w:pStyle w:val="Heading3"/>
+        <w:pStyle w:val="Heading2"/>
       </w:pPr>
       <w:r>
         <w:t>Step 1 — emptyDir: shared scratch space</w:t>
@@ -14657,7 +14403,7 @@
     <w:p/>
     <w:p>
       <w:pPr>
-        <w:pStyle w:val="Heading3"/>
+        <w:pStyle w:val="Heading2"/>
       </w:pPr>
       <w:r>
         <w:t>Step 2 — projected volume (ConfigMap + Secret)</w:t>
@@ -14786,7 +14532,7 @@
     <w:p/>
     <w:p>
       <w:pPr>
-        <w:pStyle w:val="Heading3"/>
+        <w:pStyle w:val="Heading2"/>
       </w:pPr>
       <w:r>
         <w:t>Step 3 — downwardAPI: pod metadata as files</w:t>
@@ -14985,58 +14731,48 @@
     <w:p/>
     <w:p>
       <w:pPr>
+        <w:pStyle w:val="Heading1"/>
+      </w:pPr>
+      <w:r>
+        <w:t>Lab 26 — Troubleshoot Cluster Components: API Server, Controller Manager, Scheduler, etcd</w:t>
+      </w:r>
+    </w:p>
+    <w:p>
+      <w:r>
+        <w:rPr>
+          <w:b/>
+        </w:rPr>
+        <w:t>Domain: Troubleshooting  ·  Topic: Control plane troubleshooting  ·  Duration: 60 min  ·  Killercoda: https://killercoda.com/playgrounds/scenario/kubeadm</w:t>
+      </w:r>
+      <w:r/>
+      <w:r>
+        <w:rPr>
+          <w:b/>
+        </w:rPr>
+      </w:r>
+      <w:r/>
+      <w:r>
+        <w:rPr>
+          <w:b/>
+        </w:rPr>
+      </w:r>
+      <w:r/>
+      <w:r>
+        <w:rPr>
+          <w:b/>
+        </w:rPr>
+      </w:r>
+      <w:r>
+        <w:rPr>
+          <w:color w:val="1F6FEB"/>
+        </w:rPr>
+      </w:r>
+    </w:p>
+    <w:p>
+      <w:pPr>
         <w:pStyle w:val="Heading2"/>
       </w:pPr>
       <w:r>
-        <w:t>Lab 26 — Troubleshoot Cluster Components: API Server, Controller Manager, Scheduler, etcd</w:t>
-      </w:r>
-    </w:p>
-    <w:p>
-      <w:r>
-        <w:rPr>
-          <w:b/>
-        </w:rPr>
-        <w:t xml:space="preserve">Domain: </w:t>
-      </w:r>
-      <w:r>
-        <w:t xml:space="preserve">Troubleshooting   </w:t>
-      </w:r>
-      <w:r>
-        <w:rPr>
-          <w:b/>
-        </w:rPr>
-        <w:t xml:space="preserve">Topic: </w:t>
-      </w:r>
-      <w:r>
-        <w:t xml:space="preserve">Control plane troubleshooting   </w:t>
-      </w:r>
-      <w:r>
-        <w:rPr>
-          <w:b/>
-        </w:rPr>
-        <w:t xml:space="preserve">Duration: </w:t>
-      </w:r>
-      <w:r>
-        <w:t xml:space="preserve">60 min   </w:t>
-      </w:r>
-      <w:r>
-        <w:rPr>
-          <w:b/>
-        </w:rPr>
-        <w:t xml:space="preserve">Killercoda: </w:t>
-      </w:r>
-      <w:r>
-        <w:rPr>
-          <w:color w:val="1F6FEB"/>
-        </w:rPr>
-        <w:t>https://killercoda.com/playgrounds/scenario/kubeadm</w:t>
-      </w:r>
-    </w:p>
-    <w:p>
-      <w:pPr>
-        <w:pStyle w:val="Heading3"/>
-      </w:pPr>
-      <w:r>
         <w:t>Goal</w:t>
       </w:r>
     </w:p>
@@ -15047,7 +14783,7 @@
     </w:p>
     <w:p>
       <w:pPr>
-        <w:pStyle w:val="Heading3"/>
+        <w:pStyle w:val="Heading2"/>
       </w:pPr>
       <w:r>
         <w:t>What you'll build</w:t>
@@ -15060,7 +14796,7 @@
     </w:p>
     <w:p>
       <w:pPr>
-        <w:pStyle w:val="Heading3"/>
+        <w:pStyle w:val="Heading2"/>
       </w:pPr>
       <w:r>
         <w:t>Step 1 — Know where control plane components live</w:t>
@@ -15114,7 +14850,7 @@
     <w:p/>
     <w:p>
       <w:pPr>
-        <w:pStyle w:val="Heading3"/>
+        <w:pStyle w:val="Heading2"/>
       </w:pPr>
       <w:r>
         <w:t>Step 2 — Diagnose API server failure</w:t>
@@ -15213,7 +14949,7 @@
     <w:p/>
     <w:p>
       <w:pPr>
-        <w:pStyle w:val="Heading3"/>
+        <w:pStyle w:val="Heading2"/>
       </w:pPr>
       <w:r>
         <w:t>Step 3 — Fix static pod manifest</w:t>
@@ -15312,7 +15048,7 @@
     <w:p/>
     <w:p>
       <w:pPr>
-        <w:pStyle w:val="Heading3"/>
+        <w:pStyle w:val="Heading2"/>
       </w:pPr>
       <w:r>
         <w:t>Step 4 — Diagnose controller manager and scheduler</w:t>
@@ -15391,58 +15127,48 @@
     <w:p/>
     <w:p>
       <w:pPr>
+        <w:pStyle w:val="Heading1"/>
+      </w:pPr>
+      <w:r>
+        <w:t>Lab 27 — Troubleshoot Nodes: NotReady, kubelet Failure, cgroup Driver Mismatch, Drain</w:t>
+      </w:r>
+    </w:p>
+    <w:p>
+      <w:r>
+        <w:rPr>
+          <w:b/>
+        </w:rPr>
+        <w:t>Domain: Troubleshooting  ·  Topic: Node troubleshooting  ·  Duration: 60 min  ·  Killercoda: https://killercoda.com/playgrounds/scenario/kubeadm</w:t>
+      </w:r>
+      <w:r/>
+      <w:r>
+        <w:rPr>
+          <w:b/>
+        </w:rPr>
+      </w:r>
+      <w:r/>
+      <w:r>
+        <w:rPr>
+          <w:b/>
+        </w:rPr>
+      </w:r>
+      <w:r/>
+      <w:r>
+        <w:rPr>
+          <w:b/>
+        </w:rPr>
+      </w:r>
+      <w:r>
+        <w:rPr>
+          <w:color w:val="1F6FEB"/>
+        </w:rPr>
+      </w:r>
+    </w:p>
+    <w:p>
+      <w:pPr>
         <w:pStyle w:val="Heading2"/>
       </w:pPr>
       <w:r>
-        <w:t>Lab 27 — Troubleshoot Nodes: NotReady, kubelet Failure, cgroup Driver Mismatch, Drain</w:t>
-      </w:r>
-    </w:p>
-    <w:p>
-      <w:r>
-        <w:rPr>
-          <w:b/>
-        </w:rPr>
-        <w:t xml:space="preserve">Domain: </w:t>
-      </w:r>
-      <w:r>
-        <w:t xml:space="preserve">Troubleshooting   </w:t>
-      </w:r>
-      <w:r>
-        <w:rPr>
-          <w:b/>
-        </w:rPr>
-        <w:t xml:space="preserve">Topic: </w:t>
-      </w:r>
-      <w:r>
-        <w:t xml:space="preserve">Node troubleshooting   </w:t>
-      </w:r>
-      <w:r>
-        <w:rPr>
-          <w:b/>
-        </w:rPr>
-        <w:t xml:space="preserve">Duration: </w:t>
-      </w:r>
-      <w:r>
-        <w:t xml:space="preserve">60 min   </w:t>
-      </w:r>
-      <w:r>
-        <w:rPr>
-          <w:b/>
-        </w:rPr>
-        <w:t xml:space="preserve">Killercoda: </w:t>
-      </w:r>
-      <w:r>
-        <w:rPr>
-          <w:color w:val="1F6FEB"/>
-        </w:rPr>
-        <w:t>https://killercoda.com/playgrounds/scenario/kubeadm</w:t>
-      </w:r>
-    </w:p>
-    <w:p>
-      <w:pPr>
-        <w:pStyle w:val="Heading3"/>
-      </w:pPr>
-      <w:r>
         <w:t>Goal</w:t>
       </w:r>
     </w:p>
@@ -15453,7 +15179,7 @@
     </w:p>
     <w:p>
       <w:pPr>
-        <w:pStyle w:val="Heading3"/>
+        <w:pStyle w:val="Heading2"/>
       </w:pPr>
       <w:r>
         <w:t>What you'll build</w:t>
@@ -15466,7 +15192,7 @@
     </w:p>
     <w:p>
       <w:pPr>
-        <w:pStyle w:val="Heading3"/>
+        <w:pStyle w:val="Heading2"/>
       </w:pPr>
       <w:r>
         <w:t>Step 1 — Check node status baseline</w:t>
@@ -15505,7 +15231,7 @@
     <w:p/>
     <w:p>
       <w:pPr>
-        <w:pStyle w:val="Heading3"/>
+        <w:pStyle w:val="Heading2"/>
       </w:pPr>
       <w:r>
         <w:t>Step 2 — Scenario: kubelet service stops</w:t>
@@ -15619,7 +15345,7 @@
     <w:p/>
     <w:p>
       <w:pPr>
-        <w:pStyle w:val="Heading3"/>
+        <w:pStyle w:val="Heading2"/>
       </w:pPr>
       <w:r>
         <w:t>Step 3 — Scenario: cgroup driver mismatch</w:t>
@@ -15718,7 +15444,7 @@
     <w:p/>
     <w:p>
       <w:pPr>
-        <w:pStyle w:val="Heading3"/>
+        <w:pStyle w:val="Heading2"/>
       </w:pPr>
       <w:r>
         <w:t>Step 4 — Drain node for maintenance</w:t>
@@ -15827,58 +15553,48 @@
     <w:p/>
     <w:p>
       <w:pPr>
+        <w:pStyle w:val="Heading1"/>
+      </w:pPr>
+      <w:r>
+        <w:t>Lab 28 — Application Logs: kubectl logs, --previous, Multi-Container, Raw Log Files on Disk</w:t>
+      </w:r>
+    </w:p>
+    <w:p>
+      <w:r>
+        <w:rPr>
+          <w:b/>
+        </w:rPr>
+        <w:t>Domain: Troubleshooting  ·  Topic: Application logs  ·  Duration: 30 min  ·  Killercoda: https://killercoda.com/playgrounds/scenario/kubernetes</w:t>
+      </w:r>
+      <w:r/>
+      <w:r>
+        <w:rPr>
+          <w:b/>
+        </w:rPr>
+      </w:r>
+      <w:r/>
+      <w:r>
+        <w:rPr>
+          <w:b/>
+        </w:rPr>
+      </w:r>
+      <w:r/>
+      <w:r>
+        <w:rPr>
+          <w:b/>
+        </w:rPr>
+      </w:r>
+      <w:r>
+        <w:rPr>
+          <w:color w:val="1F6FEB"/>
+        </w:rPr>
+      </w:r>
+    </w:p>
+    <w:p>
+      <w:pPr>
         <w:pStyle w:val="Heading2"/>
       </w:pPr>
       <w:r>
-        <w:t>Lab 28 — Application Logs: kubectl logs, --previous, Multi-Container, Raw Log Files on Disk</w:t>
-      </w:r>
-    </w:p>
-    <w:p>
-      <w:r>
-        <w:rPr>
-          <w:b/>
-        </w:rPr>
-        <w:t xml:space="preserve">Domain: </w:t>
-      </w:r>
-      <w:r>
-        <w:t xml:space="preserve">Troubleshooting   </w:t>
-      </w:r>
-      <w:r>
-        <w:rPr>
-          <w:b/>
-        </w:rPr>
-        <w:t xml:space="preserve">Topic: </w:t>
-      </w:r>
-      <w:r>
-        <w:t xml:space="preserve">Application logs   </w:t>
-      </w:r>
-      <w:r>
-        <w:rPr>
-          <w:b/>
-        </w:rPr>
-        <w:t xml:space="preserve">Duration: </w:t>
-      </w:r>
-      <w:r>
-        <w:t xml:space="preserve">30 min   </w:t>
-      </w:r>
-      <w:r>
-        <w:rPr>
-          <w:b/>
-        </w:rPr>
-        <w:t xml:space="preserve">Killercoda: </w:t>
-      </w:r>
-      <w:r>
-        <w:rPr>
-          <w:color w:val="1F6FEB"/>
-        </w:rPr>
-        <w:t>https://killercoda.com/playgrounds/scenario/kubernetes</w:t>
-      </w:r>
-    </w:p>
-    <w:p>
-      <w:pPr>
-        <w:pStyle w:val="Heading3"/>
-      </w:pPr>
-      <w:r>
         <w:t>Goal</w:t>
       </w:r>
     </w:p>
@@ -15889,7 +15605,7 @@
     </w:p>
     <w:p>
       <w:pPr>
-        <w:pStyle w:val="Heading3"/>
+        <w:pStyle w:val="Heading2"/>
       </w:pPr>
       <w:r>
         <w:t>What you'll build</w:t>
@@ -15902,7 +15618,7 @@
     </w:p>
     <w:p>
       <w:pPr>
-        <w:pStyle w:val="Heading3"/>
+        <w:pStyle w:val="Heading2"/>
       </w:pPr>
       <w:r>
         <w:t>Step 1 — Basic log commands</w:t>
@@ -15971,7 +15687,7 @@
     <w:p/>
     <w:p>
       <w:pPr>
-        <w:pStyle w:val="Heading3"/>
+        <w:pStyle w:val="Heading2"/>
       </w:pPr>
       <w:r>
         <w:t>Step 2 — Crashed container logs with --previous</w:t>
@@ -16055,7 +15771,7 @@
     <w:p/>
     <w:p>
       <w:pPr>
-        <w:pStyle w:val="Heading3"/>
+        <w:pStyle w:val="Heading2"/>
       </w:pPr>
       <w:r>
         <w:t>Step 3 — Multi-container pod logs</w:t>
@@ -16109,7 +15825,7 @@
     <w:p/>
     <w:p>
       <w:pPr>
-        <w:pStyle w:val="Heading3"/>
+        <w:pStyle w:val="Heading2"/>
       </w:pPr>
       <w:r>
         <w:t>Step 4 — Raw log files on disk</w:t>
@@ -16196,58 +15912,48 @@
     </w:p>
     <w:p>
       <w:pPr>
+        <w:pStyle w:val="Heading1"/>
+      </w:pPr>
+      <w:r>
+        <w:t>Lab 29 — Monitor Cluster and Application Usage: kubectl top, Events, Metrics Pipeline</w:t>
+      </w:r>
+    </w:p>
+    <w:p>
+      <w:r>
+        <w:rPr>
+          <w:b/>
+        </w:rPr>
+        <w:t>Domain: Troubleshooting  ·  Topic: Monitoring and observability  ·  Duration: 45 min  ·  Killercoda: https://killercoda.com/playgrounds/scenario/kubernetes</w:t>
+      </w:r>
+      <w:r/>
+      <w:r>
+        <w:rPr>
+          <w:b/>
+        </w:rPr>
+      </w:r>
+      <w:r/>
+      <w:r>
+        <w:rPr>
+          <w:b/>
+        </w:rPr>
+      </w:r>
+      <w:r/>
+      <w:r>
+        <w:rPr>
+          <w:b/>
+        </w:rPr>
+      </w:r>
+      <w:r>
+        <w:rPr>
+          <w:color w:val="1F6FEB"/>
+        </w:rPr>
+      </w:r>
+    </w:p>
+    <w:p>
+      <w:pPr>
         <w:pStyle w:val="Heading2"/>
       </w:pPr>
       <w:r>
-        <w:t>Lab 29 — Monitor Cluster and Application Usage: kubectl top, Events, Metrics Pipeline</w:t>
-      </w:r>
-    </w:p>
-    <w:p>
-      <w:r>
-        <w:rPr>
-          <w:b/>
-        </w:rPr>
-        <w:t xml:space="preserve">Domain: </w:t>
-      </w:r>
-      <w:r>
-        <w:t xml:space="preserve">Troubleshooting   </w:t>
-      </w:r>
-      <w:r>
-        <w:rPr>
-          <w:b/>
-        </w:rPr>
-        <w:t xml:space="preserve">Topic: </w:t>
-      </w:r>
-      <w:r>
-        <w:t xml:space="preserve">Monitoring and observability   </w:t>
-      </w:r>
-      <w:r>
-        <w:rPr>
-          <w:b/>
-        </w:rPr>
-        <w:t xml:space="preserve">Duration: </w:t>
-      </w:r>
-      <w:r>
-        <w:t xml:space="preserve">45 min   </w:t>
-      </w:r>
-      <w:r>
-        <w:rPr>
-          <w:b/>
-        </w:rPr>
-        <w:t xml:space="preserve">Killercoda: </w:t>
-      </w:r>
-      <w:r>
-        <w:rPr>
-          <w:color w:val="1F6FEB"/>
-        </w:rPr>
-        <w:t>https://killercoda.com/playgrounds/scenario/kubernetes</w:t>
-      </w:r>
-    </w:p>
-    <w:p>
-      <w:pPr>
-        <w:pStyle w:val="Heading3"/>
-      </w:pPr>
-      <w:r>
         <w:t>Goal</w:t>
       </w:r>
     </w:p>
@@ -16258,7 +15964,7 @@
     </w:p>
     <w:p>
       <w:pPr>
-        <w:pStyle w:val="Heading3"/>
+        <w:pStyle w:val="Heading2"/>
       </w:pPr>
       <w:r>
         <w:t>What you'll build</w:t>
@@ -16271,7 +15977,7 @@
     </w:p>
     <w:p>
       <w:pPr>
-        <w:pStyle w:val="Heading3"/>
+        <w:pStyle w:val="Heading2"/>
       </w:pPr>
       <w:r>
         <w:t>Step 1 — Install metrics-server</w:t>
@@ -16340,7 +16046,7 @@
     <w:p/>
     <w:p>
       <w:pPr>
-        <w:pStyle w:val="Heading3"/>
+        <w:pStyle w:val="Heading2"/>
       </w:pPr>
       <w:r>
         <w:t>Step 2 — Resource usage</w:t>
@@ -16409,7 +16115,7 @@
     <w:p/>
     <w:p>
       <w:pPr>
-        <w:pStyle w:val="Heading3"/>
+        <w:pStyle w:val="Heading2"/>
       </w:pPr>
       <w:r>
         <w:t>Step 3 — Cluster events</w:t>
@@ -16463,7 +16169,7 @@
     <w:p/>
     <w:p>
       <w:pPr>
-        <w:pStyle w:val="Heading3"/>
+        <w:pStyle w:val="Heading2"/>
       </w:pPr>
       <w:r>
         <w:t>Step 4 — Metrics pipeline raw API</w:t>
@@ -16512,58 +16218,48 @@
     <w:p/>
     <w:p>
       <w:pPr>
+        <w:pStyle w:val="Heading1"/>
+      </w:pPr>
+      <w:r>
+        <w:t>Lab 30 — Troubleshoot Networking: DNS, Service Selector, Endpoints, CNI, NetworkPolicy</w:t>
+      </w:r>
+    </w:p>
+    <w:p>
+      <w:r>
+        <w:rPr>
+          <w:b/>
+        </w:rPr>
+        <w:t>Domain: Troubleshooting  ·  Topic: Network troubleshooting  ·  Duration: 45 min  ·  Killercoda: https://killercoda.com/playgrounds/scenario/kubernetes</w:t>
+      </w:r>
+      <w:r/>
+      <w:r>
+        <w:rPr>
+          <w:b/>
+        </w:rPr>
+      </w:r>
+      <w:r/>
+      <w:r>
+        <w:rPr>
+          <w:b/>
+        </w:rPr>
+      </w:r>
+      <w:r/>
+      <w:r>
+        <w:rPr>
+          <w:b/>
+        </w:rPr>
+      </w:r>
+      <w:r>
+        <w:rPr>
+          <w:color w:val="1F6FEB"/>
+        </w:rPr>
+      </w:r>
+    </w:p>
+    <w:p>
+      <w:pPr>
         <w:pStyle w:val="Heading2"/>
       </w:pPr>
       <w:r>
-        <w:t>Lab 30 — Troubleshoot Networking: DNS, Service Selector, Endpoints, CNI, NetworkPolicy</w:t>
-      </w:r>
-    </w:p>
-    <w:p>
-      <w:r>
-        <w:rPr>
-          <w:b/>
-        </w:rPr>
-        <w:t xml:space="preserve">Domain: </w:t>
-      </w:r>
-      <w:r>
-        <w:t xml:space="preserve">Troubleshooting   </w:t>
-      </w:r>
-      <w:r>
-        <w:rPr>
-          <w:b/>
-        </w:rPr>
-        <w:t xml:space="preserve">Topic: </w:t>
-      </w:r>
-      <w:r>
-        <w:t xml:space="preserve">Network troubleshooting   </w:t>
-      </w:r>
-      <w:r>
-        <w:rPr>
-          <w:b/>
-        </w:rPr>
-        <w:t xml:space="preserve">Duration: </w:t>
-      </w:r>
-      <w:r>
-        <w:t xml:space="preserve">45 min   </w:t>
-      </w:r>
-      <w:r>
-        <w:rPr>
-          <w:b/>
-        </w:rPr>
-        <w:t xml:space="preserve">Killercoda: </w:t>
-      </w:r>
-      <w:r>
-        <w:rPr>
-          <w:color w:val="1F6FEB"/>
-        </w:rPr>
-        <w:t>https://killercoda.com/playgrounds/scenario/kubernetes</w:t>
-      </w:r>
-    </w:p>
-    <w:p>
-      <w:pPr>
-        <w:pStyle w:val="Heading3"/>
-      </w:pPr>
-      <w:r>
         <w:t>Goal</w:t>
       </w:r>
     </w:p>
@@ -16574,7 +16270,7 @@
     </w:p>
     <w:p>
       <w:pPr>
-        <w:pStyle w:val="Heading3"/>
+        <w:pStyle w:val="Heading2"/>
       </w:pPr>
       <w:r>
         <w:t>What you'll build</w:t>
@@ -16587,7 +16283,7 @@
     </w:p>
     <w:p>
       <w:pPr>
-        <w:pStyle w:val="Heading3"/>
+        <w:pStyle w:val="Heading2"/>
       </w:pPr>
       <w:r>
         <w:t>Step 1 — Deploy baseline</w:t>
@@ -16656,7 +16352,7 @@
     <w:p/>
     <w:p>
       <w:pPr>
-        <w:pStyle w:val="Heading3"/>
+        <w:pStyle w:val="Heading2"/>
       </w:pPr>
       <w:r>
         <w:t>Step 2 — Layer 1: DNS check</w:t>
@@ -16710,7 +16406,7 @@
     <w:p/>
     <w:p>
       <w:pPr>
-        <w:pStyle w:val="Heading3"/>
+        <w:pStyle w:val="Heading2"/>
       </w:pPr>
       <w:r>
         <w:t>Step 3 — Layer 2: Service and Endpoints</w:t>
@@ -16779,7 +16475,7 @@
     <w:p/>
     <w:p>
       <w:pPr>
-        <w:pStyle w:val="Heading3"/>
+        <w:pStyle w:val="Heading2"/>
       </w:pPr>
       <w:r>
         <w:t>Step 4 — Layers 3-7: CNI, NetworkPolicy, kube-proxy</w:t>
@@ -16888,58 +16584,48 @@
     <w:p/>
     <w:p>
       <w:pPr>
+        <w:pStyle w:val="Heading1"/>
+      </w:pPr>
+      <w:r>
+        <w:t>Lab 31 — Troubleshoot RBAC (403 Forbidden) and Scheduling Failures (Pending Pod)</w:t>
+      </w:r>
+    </w:p>
+    <w:p>
+      <w:r>
+        <w:rPr>
+          <w:b/>
+        </w:rPr>
+        <w:t>Domain: Troubleshooting  ·  Topic: RBAC and scheduling troubleshooting  ·  Duration: 45 min  ·  Killercoda: https://killercoda.com/playgrounds/scenario/kubernetes</w:t>
+      </w:r>
+      <w:r/>
+      <w:r>
+        <w:rPr>
+          <w:b/>
+        </w:rPr>
+      </w:r>
+      <w:r/>
+      <w:r>
+        <w:rPr>
+          <w:b/>
+        </w:rPr>
+      </w:r>
+      <w:r/>
+      <w:r>
+        <w:rPr>
+          <w:b/>
+        </w:rPr>
+      </w:r>
+      <w:r>
+        <w:rPr>
+          <w:color w:val="1F6FEB"/>
+        </w:rPr>
+      </w:r>
+    </w:p>
+    <w:p>
+      <w:pPr>
         <w:pStyle w:val="Heading2"/>
       </w:pPr>
       <w:r>
-        <w:t>Lab 31 — Troubleshoot RBAC (403 Forbidden) and Scheduling Failures (Pending Pod)</w:t>
-      </w:r>
-    </w:p>
-    <w:p>
-      <w:r>
-        <w:rPr>
-          <w:b/>
-        </w:rPr>
-        <w:t xml:space="preserve">Domain: </w:t>
-      </w:r>
-      <w:r>
-        <w:t xml:space="preserve">Troubleshooting   </w:t>
-      </w:r>
-      <w:r>
-        <w:rPr>
-          <w:b/>
-        </w:rPr>
-        <w:t xml:space="preserve">Topic: </w:t>
-      </w:r>
-      <w:r>
-        <w:t xml:space="preserve">RBAC and scheduling troubleshooting   </w:t>
-      </w:r>
-      <w:r>
-        <w:rPr>
-          <w:b/>
-        </w:rPr>
-        <w:t xml:space="preserve">Duration: </w:t>
-      </w:r>
-      <w:r>
-        <w:t xml:space="preserve">45 min   </w:t>
-      </w:r>
-      <w:r>
-        <w:rPr>
-          <w:b/>
-        </w:rPr>
-        <w:t xml:space="preserve">Killercoda: </w:t>
-      </w:r>
-      <w:r>
-        <w:rPr>
-          <w:color w:val="1F6FEB"/>
-        </w:rPr>
-        <w:t>https://killercoda.com/playgrounds/scenario/kubernetes</w:t>
-      </w:r>
-    </w:p>
-    <w:p>
-      <w:pPr>
-        <w:pStyle w:val="Heading3"/>
-      </w:pPr>
-      <w:r>
         <w:t>Goal</w:t>
       </w:r>
     </w:p>
@@ -16950,7 +16636,7 @@
     </w:p>
     <w:p>
       <w:pPr>
-        <w:pStyle w:val="Heading3"/>
+        <w:pStyle w:val="Heading2"/>
       </w:pPr>
       <w:r>
         <w:t>What you'll build</w:t>
@@ -16963,7 +16649,7 @@
     </w:p>
     <w:p>
       <w:pPr>
-        <w:pStyle w:val="Heading3"/>
+        <w:pStyle w:val="Heading2"/>
       </w:pPr>
       <w:r>
         <w:t>Part A — RBAC: diagnose 403 Forbidden</w:t>
@@ -17062,7 +16748,7 @@
     <w:p/>
     <w:p>
       <w:pPr>
-        <w:pStyle w:val="Heading3"/>
+        <w:pStyle w:val="Heading2"/>
       </w:pPr>
       <w:r>
         <w:t>Part A — Fix: create RoleBinding</w:t>
@@ -17161,7 +16847,7 @@
     <w:p/>
     <w:p>
       <w:pPr>
-        <w:pStyle w:val="Heading3"/>
+        <w:pStyle w:val="Heading2"/>
       </w:pPr>
       <w:r>
         <w:t>Part B — Scheduling: diagnose Pending pod</w:t>
@@ -17245,7 +16931,7 @@
     <w:p/>
     <w:p>
       <w:pPr>
-        <w:pStyle w:val="Heading3"/>
+        <w:pStyle w:val="Heading2"/>
       </w:pPr>
       <w:r>
         <w:t>Part B — Fix scheduling constraints</w:t>

</xml_diff>

<commit_message>
Fix courseware cover versions
</commit_message>
<xml_diff>
--- a/courseware/LG-Certified-Kubernetes-Administrator-CKA.docx
+++ b/courseware/LG-Certified-Kubernetes-Administrator-CKA.docx
@@ -2,19 +2,63 @@
 <file path=word/document.xml><?xml version="1.0" encoding="utf-8"?>
 <w:document xmlns:wpc="http://schemas.microsoft.com/office/word/2010/wordprocessingCanvas" xmlns:mo="http://schemas.microsoft.com/office/mac/office/2008/main" xmlns:mc="http://schemas.openxmlformats.org/markup-compatibility/2006" xmlns:mv="urn:schemas-microsoft-com:mac:vml" xmlns:o="urn:schemas-microsoft-com:office:office" xmlns:r="http://schemas.openxmlformats.org/officeDocument/2006/relationships" xmlns:m="http://schemas.openxmlformats.org/officeDocument/2006/math" xmlns:v="urn:schemas-microsoft-com:vml" xmlns:wp14="http://schemas.microsoft.com/office/word/2010/wordprocessingDrawing" xmlns:wp="http://schemas.openxmlformats.org/drawingml/2006/wordprocessingDrawing" xmlns:w10="urn:schemas-microsoft-com:office:word" xmlns:w="http://schemas.openxmlformats.org/wordprocessingml/2006/main" xmlns:w14="http://schemas.microsoft.com/office/word/2010/wordml" xmlns:wpg="http://schemas.microsoft.com/office/word/2010/wordprocessingGroup" xmlns:wpi="http://schemas.microsoft.com/office/word/2010/wordprocessingInk" xmlns:wne="http://schemas.microsoft.com/office/word/2006/wordml" xmlns:wps="http://schemas.microsoft.com/office/word/2010/wordprocessingShape" mc:Ignorable="w14 wp14">
   <w:body>
-    <w:p/>
-    <w:p>
-      <w:pPr>
-        <w:spacing w:before="40" w:after="20"/>
+    <w:p>
+      <w:pPr>
+        <w:spacing w:before="0" w:after="1280"/>
         <w:jc w:val="center"/>
       </w:pPr>
       <w:r>
         <w:rPr>
+          <w:rFonts w:ascii="Arial" w:hAnsi="Arial"/>
+          <w:b w:val="0"/>
+          <w:color w:val="111827"/>
+          <w:sz w:val="2"/>
+        </w:rPr>
+      </w:r>
+    </w:p>
+    <w:p>
+      <w:pPr>
+        <w:spacing w:before="0" w:after="40"/>
+        <w:jc w:val="center"/>
+      </w:pPr>
+      <w:r>
+        <w:rPr>
+          <w:rFonts w:ascii="Arial" w:hAnsi="Arial"/>
           <w:b/>
           <w:color w:val="111827"/>
-          <w:sz w:val="26"/>
+          <w:sz w:val="30"/>
         </w:rPr>
         <w:t>Tertiary Infotech Academy Pte Ltd</w:t>
+      </w:r>
+    </w:p>
+    <w:p>
+      <w:pPr>
+        <w:spacing w:before="0" w:after="480"/>
+        <w:jc w:val="center"/>
+      </w:pPr>
+      <w:r>
+        <w:rPr>
+          <w:rFonts w:ascii="Arial" w:hAnsi="Arial"/>
+          <w:b w:val="0"/>
+          <w:color w:val="525B6B"/>
+          <w:sz w:val="22"/>
+        </w:rPr>
+        <w:t>UEN: 201200696W</w:t>
+      </w:r>
+    </w:p>
+    <w:p>
+      <w:pPr>
+        <w:spacing w:before="0" w:after="240"/>
+        <w:jc w:val="center"/>
+      </w:pPr>
+      <w:r>
+        <w:rPr>
+          <w:rFonts w:ascii="Arial" w:hAnsi="Arial"/>
+          <w:b/>
+          <w:color w:val="2563EB"/>
+          <w:sz w:val="60"/>
+        </w:rPr>
+        <w:t>LEARNER GUIDE</w:t>
       </w:r>
     </w:p>
     <w:p>
@@ -24,11 +68,42 @@
       </w:pPr>
       <w:r>
         <w:rPr>
+          <w:rFonts w:ascii="Arial" w:hAnsi="Arial"/>
           <w:b w:val="0"/>
-          <w:color w:val="555B66"/>
-          <w:sz w:val="20"/>
-        </w:rPr>
-        <w:t>UEN: 201200696W</w:t>
+          <w:color w:val="525B6B"/>
+          <w:sz w:val="24"/>
+        </w:rPr>
+        <w:t>For</w:t>
+      </w:r>
+    </w:p>
+    <w:p>
+      <w:pPr>
+        <w:spacing w:before="0" w:after="200"/>
+        <w:jc w:val="center"/>
+      </w:pPr>
+      <w:r>
+        <w:rPr>
+          <w:rFonts w:ascii="Arial" w:hAnsi="Arial"/>
+          <w:b/>
+          <w:color w:val="111827"/>
+          <w:sz w:val="44"/>
+        </w:rPr>
+        <w:t>Certified Kubernetes Administrator (CKA) Training</w:t>
+      </w:r>
+    </w:p>
+    <w:p>
+      <w:pPr>
+        <w:spacing w:before="0" w:after="560"/>
+        <w:jc w:val="center"/>
+      </w:pPr>
+      <w:r>
+        <w:rPr>
+          <w:rFonts w:ascii="Arial" w:hAnsi="Arial"/>
+          <w:b w:val="0"/>
+          <w:color w:val="111827"/>
+          <w:sz w:val="26"/>
+        </w:rPr>
+        <w:t>TGS Ref No: TGS-2025054612</w:t>
       </w:r>
     </w:p>
     <w:p>
@@ -38,53 +113,12 @@
       </w:pPr>
       <w:r>
         <w:rPr>
-          <w:b/>
-          <w:color w:val="1F6FEB"/>
-          <w:sz w:val="52"/>
-        </w:rPr>
-        <w:t>LEARNER GUIDE</w:t>
-      </w:r>
-    </w:p>
-    <w:p>
-      <w:pPr>
-        <w:spacing w:before="80" w:after="160"/>
-        <w:jc w:val="center"/>
-      </w:pPr>
-      <w:r>
-        <w:rPr>
+          <w:rFonts w:ascii="Arial" w:hAnsi="Arial"/>
           <w:b w:val="0"/>
-          <w:color w:val="555B66"/>
-          <w:sz w:val="24"/>
-        </w:rPr>
-        <w:t>For</w:t>
-      </w:r>
-    </w:p>
-    <w:p>
-      <w:pPr>
-        <w:spacing w:before="80" w:after="40"/>
-        <w:jc w:val="center"/>
-      </w:pPr>
-      <w:r>
-        <w:rPr>
-          <w:b/>
-          <w:color w:val="111827"/>
-          <w:sz w:val="40"/>
-        </w:rPr>
-        <w:t>Certified Kubernetes Administrator (CKA)</w:t>
-      </w:r>
-    </w:p>
-    <w:p>
-      <w:pPr>
-        <w:spacing w:before="80" w:after="280"/>
-        <w:jc w:val="center"/>
-      </w:pPr>
-      <w:r>
-        <w:rPr>
-          <w:b w:val="0"/>
-          <w:color w:val="111827"/>
-          <w:sz w:val="24"/>
-        </w:rPr>
-        <w:t>TGS Ref No: TGS-2025054612</w:t>
+          <w:color w:val="525B6B"/>
+          <w:sz w:val="22"/>
+        </w:rPr>
+        <w:t>Conducted by</w:t>
       </w:r>
     </w:p>
     <w:p>
@@ -94,51 +128,40 @@
       </w:pPr>
       <w:r>
         <w:rPr>
+          <w:rFonts w:ascii="Arial" w:hAnsi="Arial"/>
+          <w:b/>
+          <w:color w:val="111827"/>
+          <w:sz w:val="28"/>
+        </w:rPr>
+        <w:t>Tertiary Infotech Academy Pte Ltd</w:t>
+      </w:r>
+    </w:p>
+    <w:p>
+      <w:pPr>
+        <w:spacing w:before="0" w:after="360"/>
+        <w:jc w:val="center"/>
+      </w:pPr>
+      <w:r>
+        <w:rPr>
+          <w:rFonts w:ascii="Arial" w:hAnsi="Arial"/>
           <w:b w:val="0"/>
-          <w:color w:val="555B66"/>
+          <w:color w:val="525B6B"/>
           <w:sz w:val="22"/>
         </w:rPr>
-        <w:t>Conducted by</w:t>
-      </w:r>
-    </w:p>
-    <w:p>
-      <w:pPr>
-        <w:spacing w:before="0" w:after="40"/>
+        <w:t>UEN: 201200696W</w:t>
+      </w:r>
+    </w:p>
+    <w:p>
+      <w:pPr>
+        <w:spacing w:before="0" w:after="0"/>
         <w:jc w:val="center"/>
       </w:pPr>
       <w:r>
         <w:rPr>
+          <w:rFonts w:ascii="Arial" w:hAnsi="Arial"/>
           <w:b/>
-          <w:color w:val="111827"/>
+          <w:color w:val="2563EB"/>
           <w:sz w:val="26"/>
-        </w:rPr>
-        <w:t>Tertiary Infotech Academy Pte Ltd</w:t>
-      </w:r>
-    </w:p>
-    <w:p>
-      <w:pPr>
-        <w:spacing w:before="0" w:after="240"/>
-        <w:jc w:val="center"/>
-      </w:pPr>
-      <w:r>
-        <w:rPr>
-          <w:b w:val="0"/>
-          <w:color w:val="555B66"/>
-          <w:sz w:val="22"/>
-        </w:rPr>
-        <w:t>UEN: 201200696W</w:t>
-      </w:r>
-    </w:p>
-    <w:p>
-      <w:pPr>
-        <w:spacing w:before="0" w:after="80"/>
-        <w:jc w:val="center"/>
-      </w:pPr>
-      <w:r>
-        <w:rPr>
-          <w:b/>
-          <w:color w:val="1F6FEB"/>
-          <w:sz w:val="24"/>
         </w:rPr>
         <w:t>Version 1.0</w:t>
       </w:r>

</xml_diff>

<commit_message>
Add logo to courseware covers
</commit_message>
<xml_diff>
--- a/courseware/LG-Certified-Kubernetes-Administrator-CKA.docx
+++ b/courseware/LG-Certified-Kubernetes-Administrator-CKA.docx
@@ -4,16 +4,42 @@
   <w:body>
     <w:p>
       <w:pPr>
-        <w:spacing w:before="0" w:after="1280"/>
+        <w:spacing w:before="680" w:after="240"/>
         <w:jc w:val="center"/>
       </w:pPr>
       <w:r>
-        <w:rPr>
-          <w:rFonts w:ascii="Arial" w:hAnsi="Arial"/>
-          <w:b w:val="0"/>
-          <w:color w:val="111827"/>
-          <w:sz w:val="2"/>
-        </w:rPr>
+        <w:drawing>
+          <wp:inline xmlns:a="http://schemas.openxmlformats.org/drawingml/2006/main" xmlns:pic="http://schemas.openxmlformats.org/drawingml/2006/picture">
+            <wp:extent cx="566928" cy="566928"/>
+            <wp:docPr id="1" name="Picture 1"/>
+            <wp:cNvGraphicFramePr>
+              <a:graphicFrameLocks noChangeAspect="1"/>
+            </wp:cNvGraphicFramePr>
+            <a:graphic>
+              <a:graphicData uri="http://schemas.openxmlformats.org/drawingml/2006/picture">
+                <pic:pic>
+                  <pic:nvPicPr>
+                    <pic:cNvPr id="0" name="tertiary-infotech-logo.png"/>
+                    <pic:cNvPicPr/>
+                  </pic:nvPicPr>
+                  <pic:blipFill>
+                    <a:blip r:embed="rId10"/>
+                    <a:stretch>
+                      <a:fillRect/>
+                    </a:stretch>
+                  </pic:blipFill>
+                  <pic:spPr>
+                    <a:xfrm>
+                      <a:off x="0" y="0"/>
+                      <a:ext cx="566928" cy="566928"/>
+                    </a:xfrm>
+                    <a:prstGeom prst="rect"/>
+                  </pic:spPr>
+                </pic:pic>
+              </a:graphicData>
+            </a:graphic>
+          </wp:inline>
+        </w:drawing>
       </w:r>
     </w:p>
     <w:p>

</xml_diff>

<commit_message>
Match courseware cover style
</commit_message>
<xml_diff>
--- a/courseware/LG-Certified-Kubernetes-Administrator-CKA.docx
+++ b/courseware/LG-Certified-Kubernetes-Administrator-CKA.docx
@@ -4,13 +4,13 @@
   <w:body>
     <w:p>
       <w:pPr>
-        <w:spacing w:before="680" w:after="240"/>
+        <w:spacing w:before="360" w:after="60"/>
         <w:jc w:val="center"/>
       </w:pPr>
       <w:r>
         <w:drawing>
           <wp:inline xmlns:a="http://schemas.openxmlformats.org/drawingml/2006/main" xmlns:pic="http://schemas.openxmlformats.org/drawingml/2006/picture">
-            <wp:extent cx="566928" cy="566928"/>
+            <wp:extent cx="804672" cy="804672"/>
             <wp:docPr id="1" name="Picture 1"/>
             <wp:cNvGraphicFramePr>
               <a:graphicFrameLocks noChangeAspect="1"/>
@@ -19,7 +19,7 @@
               <a:graphicData uri="http://schemas.openxmlformats.org/drawingml/2006/picture">
                 <pic:pic>
                   <pic:nvPicPr>
-                    <pic:cNvPr id="0" name="tertiary-infotech-logo.png"/>
+                    <pic:cNvPr id="0" name="image.png"/>
                     <pic:cNvPicPr/>
                   </pic:nvPicPr>
                   <pic:blipFill>
@@ -31,7 +31,7 @@
                   <pic:spPr>
                     <a:xfrm>
                       <a:off x="0" y="0"/>
-                      <a:ext cx="566928" cy="566928"/>
+                      <a:ext cx="804672" cy="804672"/>
                     </a:xfrm>
                     <a:prstGeom prst="rect"/>
                   </pic:spPr>
@@ -44,22 +44,22 @@
     </w:p>
     <w:p>
       <w:pPr>
-        <w:spacing w:before="0" w:after="40"/>
+        <w:spacing w:before="0" w:after="0"/>
         <w:jc w:val="center"/>
       </w:pPr>
       <w:r>
         <w:rPr>
           <w:rFonts w:ascii="Arial" w:hAnsi="Arial"/>
           <w:b/>
-          <w:color w:val="111827"/>
-          <w:sz w:val="30"/>
+          <w:color w:val="000000"/>
+          <w:sz w:val="13"/>
         </w:rPr>
         <w:t>Tertiary Infotech Academy Pte Ltd</w:t>
       </w:r>
     </w:p>
     <w:p>
       <w:pPr>
-        <w:spacing w:before="0" w:after="480"/>
+        <w:spacing w:before="0" w:after="180"/>
         <w:jc w:val="center"/>
       </w:pPr>
       <w:r>
@@ -67,14 +67,14 @@
           <w:rFonts w:ascii="Arial" w:hAnsi="Arial"/>
           <w:b w:val="0"/>
           <w:color w:val="525B6B"/>
-          <w:sz w:val="22"/>
+          <w:sz w:val="9"/>
         </w:rPr>
         <w:t>UEN: 201200696W</w:t>
       </w:r>
     </w:p>
     <w:p>
       <w:pPr>
-        <w:spacing w:before="0" w:after="240"/>
+        <w:spacing w:before="0" w:after="100"/>
         <w:jc w:val="center"/>
       </w:pPr>
       <w:r>
@@ -82,14 +82,14 @@
           <w:rFonts w:ascii="Arial" w:hAnsi="Arial"/>
           <w:b/>
           <w:color w:val="2563EB"/>
-          <w:sz w:val="60"/>
+          <w:sz w:val="27"/>
         </w:rPr>
         <w:t>LEARNER GUIDE</w:t>
       </w:r>
     </w:p>
     <w:p>
       <w:pPr>
-        <w:spacing w:before="0" w:after="200"/>
+        <w:spacing w:before="0" w:after="160"/>
         <w:jc w:val="center"/>
       </w:pPr>
       <w:r>
@@ -97,44 +97,56 @@
           <w:rFonts w:ascii="Arial" w:hAnsi="Arial"/>
           <w:b w:val="0"/>
           <w:color w:val="525B6B"/>
-          <w:sz w:val="24"/>
+          <w:sz w:val="12"/>
         </w:rPr>
         <w:t>For</w:t>
       </w:r>
     </w:p>
     <w:p>
       <w:pPr>
-        <w:spacing w:before="0" w:after="200"/>
+        <w:spacing w:before="0" w:after="80"/>
         <w:jc w:val="center"/>
       </w:pPr>
       <w:r>
         <w:rPr>
           <w:rFonts w:ascii="Arial" w:hAnsi="Arial"/>
           <w:b/>
-          <w:color w:val="111827"/>
-          <w:sz w:val="44"/>
-        </w:rPr>
-        <w:t>Certified Kubernetes Administrator (CKA) Training</w:t>
-      </w:r>
-    </w:p>
-    <w:p>
-      <w:pPr>
-        <w:spacing w:before="0" w:after="560"/>
+          <w:color w:val="000000"/>
+          <w:sz w:val="22"/>
+        </w:rPr>
+        <w:t>Certified Kubernetes Administrator (CKA)</w:t>
+      </w:r>
+      <w:r>
+        <w:br/>
+      </w:r>
+      <w:r>
+        <w:rPr>
+          <w:rFonts w:ascii="Arial" w:hAnsi="Arial"/>
+          <w:b/>
+          <w:color w:val="000000"/>
+          <w:sz w:val="22"/>
+        </w:rPr>
+        <w:t>Training</w:t>
+      </w:r>
+    </w:p>
+    <w:p>
+      <w:pPr>
+        <w:spacing w:before="0" w:after="160"/>
         <w:jc w:val="center"/>
       </w:pPr>
       <w:r>
         <w:rPr>
           <w:rFonts w:ascii="Arial" w:hAnsi="Arial"/>
           <w:b w:val="0"/>
-          <w:color w:val="111827"/>
-          <w:sz w:val="26"/>
+          <w:color w:val="000000"/>
+          <w:sz w:val="12"/>
         </w:rPr>
         <w:t>TGS Ref No: TGS-2025054612</w:t>
       </w:r>
     </w:p>
     <w:p>
       <w:pPr>
-        <w:spacing w:before="0" w:after="80"/>
+        <w:spacing w:before="0" w:after="20"/>
         <w:jc w:val="center"/>
       </w:pPr>
       <w:r>
@@ -142,29 +154,29 @@
           <w:rFonts w:ascii="Arial" w:hAnsi="Arial"/>
           <w:b w:val="0"/>
           <w:color w:val="525B6B"/>
-          <w:sz w:val="22"/>
+          <w:sz w:val="12"/>
         </w:rPr>
         <w:t>Conducted by</w:t>
       </w:r>
     </w:p>
     <w:p>
       <w:pPr>
-        <w:spacing w:before="0" w:after="40"/>
+        <w:spacing w:before="0" w:after="20"/>
         <w:jc w:val="center"/>
       </w:pPr>
       <w:r>
         <w:rPr>
           <w:rFonts w:ascii="Arial" w:hAnsi="Arial"/>
           <w:b/>
-          <w:color w:val="111827"/>
-          <w:sz w:val="28"/>
+          <w:color w:val="000000"/>
+          <w:sz w:val="14"/>
         </w:rPr>
         <w:t>Tertiary Infotech Academy Pte Ltd</w:t>
       </w:r>
     </w:p>
     <w:p>
       <w:pPr>
-        <w:spacing w:before="0" w:after="360"/>
+        <w:spacing w:before="0" w:after="140"/>
         <w:jc w:val="center"/>
       </w:pPr>
       <w:r>
@@ -172,7 +184,7 @@
           <w:rFonts w:ascii="Arial" w:hAnsi="Arial"/>
           <w:b w:val="0"/>
           <w:color w:val="525B6B"/>
-          <w:sz w:val="22"/>
+          <w:sz w:val="9"/>
         </w:rPr>
         <w:t>UEN: 201200696W</w:t>
       </w:r>
@@ -187,7 +199,7 @@
           <w:rFonts w:ascii="Arial" w:hAnsi="Arial"/>
           <w:b/>
           <w:color w:val="2563EB"/>
-          <w:sz w:val="26"/>
+          <w:sz w:val="12"/>
         </w:rPr>
         <w:t>Version 1.0</w:t>
       </w:r>

</xml_diff>

<commit_message>
Update CKA courseware documents
</commit_message>
<xml_diff>
--- a/courseware/LG-Certified-Kubernetes-Administrator-CKA.docx
+++ b/courseware/LG-Certified-Kubernetes-Administrator-CKA.docx
@@ -4,13 +4,13 @@
   <w:body>
     <w:p>
       <w:pPr>
-        <w:spacing w:before="360" w:after="60"/>
+        <w:spacing w:before="520" w:after="160" w:line="240" w:lineRule="auto"/>
         <w:jc w:val="center"/>
       </w:pPr>
       <w:r>
         <w:drawing>
           <wp:inline xmlns:a="http://schemas.openxmlformats.org/drawingml/2006/main" xmlns:pic="http://schemas.openxmlformats.org/drawingml/2006/picture">
-            <wp:extent cx="804672" cy="804672"/>
+            <wp:extent cx="1170432" cy="1170432"/>
             <wp:docPr id="1" name="Picture 1"/>
             <wp:cNvGraphicFramePr>
               <a:graphicFrameLocks noChangeAspect="1"/>
@@ -31,7 +31,7 @@
                   <pic:spPr>
                     <a:xfrm>
                       <a:off x="0" y="0"/>
-                      <a:ext cx="804672" cy="804672"/>
+                      <a:ext cx="1170432" cy="1170432"/>
                     </a:xfrm>
                     <a:prstGeom prst="rect"/>
                   </pic:spPr>
@@ -44,37 +44,37 @@
     </w:p>
     <w:p>
       <w:pPr>
-        <w:spacing w:before="0" w:after="0"/>
+        <w:spacing w:before="0" w:after="0" w:line="240" w:lineRule="auto"/>
         <w:jc w:val="center"/>
       </w:pPr>
       <w:r>
         <w:rPr>
           <w:rFonts w:ascii="Arial" w:hAnsi="Arial"/>
           <w:b/>
-          <w:color w:val="000000"/>
-          <w:sz w:val="13"/>
+          <w:color w:val="111827"/>
+          <w:sz w:val="22"/>
         </w:rPr>
         <w:t>Tertiary Infotech Academy Pte Ltd</w:t>
       </w:r>
     </w:p>
     <w:p>
       <w:pPr>
-        <w:spacing w:before="0" w:after="180"/>
+        <w:spacing w:before="0" w:after="440" w:line="240" w:lineRule="auto"/>
         <w:jc w:val="center"/>
       </w:pPr>
       <w:r>
         <w:rPr>
           <w:rFonts w:ascii="Arial" w:hAnsi="Arial"/>
           <w:b w:val="0"/>
-          <w:color w:val="525B6B"/>
-          <w:sz w:val="9"/>
+          <w:color w:val="4B5563"/>
+          <w:sz w:val="16"/>
         </w:rPr>
         <w:t>UEN: 201200696W</w:t>
       </w:r>
     </w:p>
     <w:p>
       <w:pPr>
-        <w:spacing w:before="0" w:after="100"/>
+        <w:spacing w:before="0" w:after="400" w:line="240" w:lineRule="auto"/>
         <w:jc w:val="center"/>
       </w:pPr>
       <w:r>
@@ -82,116 +82,122 @@
           <w:rFonts w:ascii="Arial" w:hAnsi="Arial"/>
           <w:b/>
           <w:color w:val="2563EB"/>
-          <w:sz w:val="27"/>
+          <w:sz w:val="48"/>
         </w:rPr>
         <w:t>LEARNER GUIDE</w:t>
       </w:r>
     </w:p>
     <w:p>
       <w:pPr>
-        <w:spacing w:before="0" w:after="160"/>
+        <w:spacing w:before="0" w:after="280" w:line="240" w:lineRule="auto"/>
         <w:jc w:val="center"/>
       </w:pPr>
       <w:r>
         <w:rPr>
           <w:rFonts w:ascii="Arial" w:hAnsi="Arial"/>
           <w:b w:val="0"/>
-          <w:color w:val="525B6B"/>
-          <w:sz w:val="12"/>
+          <w:color w:val="4B5563"/>
+          <w:sz w:val="22"/>
         </w:rPr>
         <w:t>For</w:t>
       </w:r>
     </w:p>
     <w:p>
       <w:pPr>
-        <w:spacing w:before="0" w:after="80"/>
+        <w:spacing w:before="0" w:after="320" w:line="252" w:lineRule="auto"/>
         <w:jc w:val="center"/>
       </w:pPr>
       <w:r>
         <w:rPr>
           <w:rFonts w:ascii="Arial" w:hAnsi="Arial"/>
           <w:b/>
-          <w:color w:val="000000"/>
-          <w:sz w:val="22"/>
+          <w:color w:val="111827"/>
+          <w:sz w:val="36"/>
         </w:rPr>
         <w:t>Certified Kubernetes Administrator (CKA)</w:t>
-      </w:r>
-      <w:r>
-        <w:br/>
       </w:r>
       <w:r>
         <w:rPr>
           <w:rFonts w:ascii="Arial" w:hAnsi="Arial"/>
           <w:b/>
-          <w:color w:val="000000"/>
-          <w:sz w:val="22"/>
+          <w:color w:val="111827"/>
+          <w:sz w:val="36"/>
+        </w:rPr>
+        <w:br/>
+      </w:r>
+      <w:r>
+        <w:rPr>
+          <w:rFonts w:ascii="Arial" w:hAnsi="Arial"/>
+          <w:b/>
+          <w:color w:val="111827"/>
+          <w:sz w:val="36"/>
         </w:rPr>
         <w:t>Training</w:t>
       </w:r>
     </w:p>
     <w:p>
       <w:pPr>
-        <w:spacing w:before="0" w:after="160"/>
+        <w:spacing w:before="0" w:after="360" w:line="240" w:lineRule="auto"/>
         <w:jc w:val="center"/>
       </w:pPr>
       <w:r>
         <w:rPr>
           <w:rFonts w:ascii="Arial" w:hAnsi="Arial"/>
           <w:b w:val="0"/>
-          <w:color w:val="000000"/>
-          <w:sz w:val="12"/>
+          <w:color w:val="111827"/>
+          <w:sz w:val="21"/>
         </w:rPr>
         <w:t>TGS Ref No: TGS-2025054612</w:t>
       </w:r>
     </w:p>
     <w:p>
       <w:pPr>
-        <w:spacing w:before="0" w:after="20"/>
+        <w:spacing w:before="0" w:after="80" w:line="240" w:lineRule="auto"/>
         <w:jc w:val="center"/>
       </w:pPr>
       <w:r>
         <w:rPr>
           <w:rFonts w:ascii="Arial" w:hAnsi="Arial"/>
           <w:b w:val="0"/>
-          <w:color w:val="525B6B"/>
-          <w:sz w:val="12"/>
+          <w:color w:val="4B5563"/>
+          <w:sz w:val="21"/>
         </w:rPr>
         <w:t>Conducted by</w:t>
       </w:r>
     </w:p>
     <w:p>
       <w:pPr>
-        <w:spacing w:before="0" w:after="20"/>
+        <w:spacing w:before="0" w:after="0" w:line="240" w:lineRule="auto"/>
         <w:jc w:val="center"/>
       </w:pPr>
       <w:r>
         <w:rPr>
           <w:rFonts w:ascii="Arial" w:hAnsi="Arial"/>
           <w:b/>
-          <w:color w:val="000000"/>
-          <w:sz w:val="14"/>
+          <w:color w:val="111827"/>
+          <w:sz w:val="22"/>
         </w:rPr>
         <w:t>Tertiary Infotech Academy Pte Ltd</w:t>
       </w:r>
     </w:p>
     <w:p>
       <w:pPr>
-        <w:spacing w:before="0" w:after="140"/>
+        <w:spacing w:before="0" w:after="360" w:line="240" w:lineRule="auto"/>
         <w:jc w:val="center"/>
       </w:pPr>
       <w:r>
         <w:rPr>
           <w:rFonts w:ascii="Arial" w:hAnsi="Arial"/>
           <w:b w:val="0"/>
-          <w:color w:val="525B6B"/>
-          <w:sz w:val="9"/>
+          <w:color w:val="4B5563"/>
+          <w:sz w:val="17"/>
         </w:rPr>
         <w:t>UEN: 201200696W</w:t>
       </w:r>
     </w:p>
     <w:p>
       <w:pPr>
-        <w:spacing w:before="0" w:after="0"/>
+        <w:spacing w:before="0" w:after="0" w:line="240" w:lineRule="auto"/>
         <w:jc w:val="center"/>
       </w:pPr>
       <w:r>
@@ -199,7 +205,7 @@
           <w:rFonts w:ascii="Arial" w:hAnsi="Arial"/>
           <w:b/>
           <w:color w:val="2563EB"/>
-          <w:sz w:val="12"/>
+          <w:sz w:val="21"/>
         </w:rPr>
         <w:t>Version 1.0</w:t>
       </w:r>
@@ -383,26 +389,192 @@
       </w:r>
     </w:p>
     <w:p>
-      <w:r>
-        <w:fldChar w:fldCharType="begin"/>
-        <w:instrText xml:space="preserve">TOC \o "1-2" \h \z \u</w:instrText>
-        <w:fldChar w:fldCharType="separate"/>
-        <w:t>Right-click and choose “Update Field”, or press F9, to build the table of contents.</w:t>
-        <w:fldChar w:fldCharType="end"/>
+      <w:pPr>
+        <w:tabs>
+          <w:tab w:pos="8928" w:val="right" w:leader="dot"/>
+        </w:tabs>
+        <w:spacing w:after="60" w:line="252" w:lineRule="auto"/>
+      </w:pPr>
+      <w:r>
+        <w:rPr>
+          <w:rFonts w:ascii="Arial" w:hAnsi="Arial"/>
+          <w:sz w:val="21"/>
+        </w:rPr>
+        <w:t>CKA Exam Domains</w:t>
+      </w:r>
+      <w:r>
+        <w:rPr>
+          <w:rFonts w:ascii="Arial" w:hAnsi="Arial"/>
+          <w:sz w:val="21"/>
+        </w:rPr>
+        <w:tab/>
+        <w:t>4</w:t>
+      </w:r>
+    </w:p>
+    <w:p>
+      <w:pPr>
+        <w:tabs>
+          <w:tab w:pos="8928" w:val="right" w:leader="dot"/>
+        </w:tabs>
+        <w:spacing w:after="60" w:line="252" w:lineRule="auto"/>
+      </w:pPr>
+      <w:r>
+        <w:rPr>
+          <w:rFonts w:ascii="Arial" w:hAnsi="Arial"/>
+          <w:sz w:val="21"/>
+        </w:rPr>
+        <w:t>Before You Start - Setup &amp; Prerequisites</w:t>
+      </w:r>
+      <w:r>
+        <w:rPr>
+          <w:rFonts w:ascii="Arial" w:hAnsi="Arial"/>
+          <w:sz w:val="21"/>
+        </w:rPr>
+        <w:tab/>
+        <w:t>4</w:t>
+      </w:r>
+    </w:p>
+    <w:p>
+      <w:pPr>
+        <w:tabs>
+          <w:tab w:pos="8928" w:val="right" w:leader="dot"/>
+        </w:tabs>
+        <w:spacing w:after="60" w:line="252" w:lineRule="auto"/>
+      </w:pPr>
+      <w:r>
+        <w:rPr>
+          <w:rFonts w:ascii="Arial" w:hAnsi="Arial"/>
+          <w:sz w:val="21"/>
+        </w:rPr>
+        <w:t>Day 1 - Domain 1: Cluster Architecture, Installation &amp; Configuration (Labs 1-8)</w:t>
+      </w:r>
+      <w:r>
+        <w:rPr>
+          <w:rFonts w:ascii="Arial" w:hAnsi="Arial"/>
+          <w:sz w:val="21"/>
+        </w:rPr>
+        <w:tab/>
+        <w:t>5</w:t>
+      </w:r>
+    </w:p>
+    <w:p>
+      <w:pPr>
+        <w:tabs>
+          <w:tab w:pos="8928" w:val="right" w:leader="dot"/>
+        </w:tabs>
+        <w:spacing w:after="60" w:line="252" w:lineRule="auto"/>
+      </w:pPr>
+      <w:r>
+        <w:rPr>
+          <w:rFonts w:ascii="Arial" w:hAnsi="Arial"/>
+          <w:sz w:val="21"/>
+        </w:rPr>
+        <w:t>Day 2 - Domains 1+2+3: Workloads, Scheduling &amp; Services (Labs 9-18)</w:t>
+      </w:r>
+      <w:r>
+        <w:rPr>
+          <w:rFonts w:ascii="Arial" w:hAnsi="Arial"/>
+          <w:sz w:val="21"/>
+        </w:rPr>
+        <w:tab/>
+        <w:t>15</w:t>
+      </w:r>
+    </w:p>
+    <w:p>
+      <w:pPr>
+        <w:tabs>
+          <w:tab w:pos="8928" w:val="right" w:leader="dot"/>
+        </w:tabs>
+        <w:spacing w:after="60" w:line="252" w:lineRule="auto"/>
+      </w:pPr>
+      <w:r>
+        <w:rPr>
+          <w:rFonts w:ascii="Arial" w:hAnsi="Arial"/>
+          <w:sz w:val="21"/>
+        </w:rPr>
+        <w:t>Day 3 - Domains 3+4+5: Networking, Storage &amp; Troubleshooting (Labs 19-28)</w:t>
+      </w:r>
+      <w:r>
+        <w:rPr>
+          <w:rFonts w:ascii="Arial" w:hAnsi="Arial"/>
+          <w:sz w:val="21"/>
+        </w:rPr>
+        <w:tab/>
+        <w:t>28</w:t>
+      </w:r>
+    </w:p>
+    <w:p>
+      <w:pPr>
+        <w:tabs>
+          <w:tab w:pos="8928" w:val="right" w:leader="dot"/>
+        </w:tabs>
+        <w:spacing w:after="60" w:line="252" w:lineRule="auto"/>
+      </w:pPr>
+      <w:r>
+        <w:rPr>
+          <w:rFonts w:ascii="Arial" w:hAnsi="Arial"/>
+          <w:sz w:val="21"/>
+        </w:rPr>
+        <w:t>Day 4 - Domain 5: Monitoring &amp; Troubleshooting (Labs 29-31)</w:t>
+      </w:r>
+      <w:r>
+        <w:rPr>
+          <w:rFonts w:ascii="Arial" w:hAnsi="Arial"/>
+          <w:sz w:val="21"/>
+        </w:rPr>
+        <w:tab/>
+        <w:t>42</w:t>
+      </w:r>
+    </w:p>
+    <w:p>
+      <w:pPr>
+        <w:tabs>
+          <w:tab w:pos="8928" w:val="right" w:leader="dot"/>
+        </w:tabs>
+        <w:spacing w:after="60" w:line="252" w:lineRule="auto"/>
+      </w:pPr>
+      <w:r>
+        <w:rPr>
+          <w:rFonts w:ascii="Arial" w:hAnsi="Arial"/>
+          <w:sz w:val="21"/>
+        </w:rPr>
+        <w:t>Troubleshooting Cheat-Sheet</w:t>
+      </w:r>
+      <w:r>
+        <w:rPr>
+          <w:rFonts w:ascii="Arial" w:hAnsi="Arial"/>
+          <w:sz w:val="21"/>
+        </w:rPr>
+        <w:tab/>
+        <w:t>46</w:t>
+      </w:r>
+    </w:p>
+    <w:p>
+      <w:pPr>
+        <w:tabs>
+          <w:tab w:pos="8928" w:val="right" w:leader="dot"/>
+        </w:tabs>
+        <w:spacing w:after="60" w:line="252" w:lineRule="auto"/>
+      </w:pPr>
+      <w:r>
+        <w:rPr>
+          <w:rFonts w:ascii="Arial" w:hAnsi="Arial"/>
+          <w:sz w:val="21"/>
+        </w:rPr>
+        <w:t>Glossary</w:t>
+      </w:r>
+      <w:r>
+        <w:rPr>
+          <w:rFonts w:ascii="Arial" w:hAnsi="Arial"/>
+          <w:sz w:val="21"/>
+        </w:rPr>
+        <w:tab/>
+        <w:t>47</w:t>
       </w:r>
     </w:p>
     <w:p>
       <w:r>
         <w:br w:type="page"/>
-      </w:r>
-    </w:p>
-    <w:p>
-      <w:pPr/>
-      <w:r/>
-    </w:p>
-    <w:p>
-      <w:r>
-        <w:t>This Learner Guide accompanies the WSQ Certified Kubernetes Administrator (CKA) course (TGS-2025054612). It contains step-by-step lab instructions for all 31 hands-on labs covering the five CKA exam domains. Labs run in the browser on Killercoda — no local installation required.</w:t>
       </w:r>
     </w:p>
     <w:p>

</xml_diff>

<commit_message>
Update CKA courseware to v6
</commit_message>
<xml_diff>
--- a/courseware/LG-Certified-Kubernetes-Administrator-CKA.docx
+++ b/courseware/LG-Certified-Kubernetes-Administrator-CKA.docx
@@ -204,10 +204,8 @@
         <w:rPr>
           <w:rFonts w:ascii="Arial" w:hAnsi="Arial"/>
           <w:b/>
-          <w:color w:val="2563EB"/>
-          <w:sz w:val="21"/>
-        </w:rPr>
-        <w:t>Version 1.0</w:t>
+        </w:rPr>
+        <w:t>Version 1.1</w:t>
       </w:r>
     </w:p>
     <w:p>
@@ -231,8 +229,9 @@
     <w:tbl>
       <w:tblPr>
         <w:tblStyle w:val="TableGrid"/>
-        <w:tblW w:type="auto" w:w="0"/>
+        <w:tblW w:type="dxa" w:w="8698"/>
         <w:jc w:val="center"/>
+        <w:tblLayout w:type="fixed"/>
         <w:tblLook w:firstColumn="1" w:firstRow="1" w:lastColumn="0" w:lastRow="0" w:noHBand="0" w:noVBand="1" w:val="04A0"/>
       </w:tblPr>
       <w:tblGrid>
@@ -242,18 +241,31 @@
         <w:gridCol w:w="2160"/>
       </w:tblGrid>
       <w:tr>
+        <w:trPr>
+          <w:tblHeader w:val="true"/>
+          <w:cantSplit/>
+        </w:trPr>
         <w:tc>
           <w:tcPr>
-            <w:tcW w:type="dxa" w:w="2160"/>
+            <w:tcW w:type="dxa" w:w="1037"/>
             <w:shd w:val="clear" w:color="auto" w:fill="1F6FEB"/>
           </w:tcPr>
           <w:p>
-            <w:r/>
+            <w:pPr>
+              <w:spacing w:after="30" w:line="240" w:lineRule="auto"/>
+            </w:pPr>
             <w:r>
               <w:rPr>
+                <w:rFonts w:ascii="Arial" w:hAnsi="Arial"/>
+                <w:sz w:val="17"/>
+              </w:rPr>
+            </w:r>
+            <w:r>
+              <w:rPr>
+                <w:rFonts w:ascii="Arial" w:hAnsi="Arial"/>
                 <w:b/>
                 <w:color w:val="FFFFFF"/>
-                <w:sz w:val="19"/>
+                <w:sz w:val="17"/>
               </w:rPr>
               <w:t>Version Number</w:t>
             </w:r>
@@ -261,16 +273,25 @@
         </w:tc>
         <w:tc>
           <w:tcPr>
-            <w:tcW w:type="dxa" w:w="2160"/>
+            <w:tcW w:type="dxa" w:w="1613"/>
             <w:shd w:val="clear" w:color="auto" w:fill="1F6FEB"/>
           </w:tcPr>
           <w:p>
-            <w:r/>
+            <w:pPr>
+              <w:spacing w:after="30" w:line="240" w:lineRule="auto"/>
+            </w:pPr>
             <w:r>
               <w:rPr>
+                <w:rFonts w:ascii="Arial" w:hAnsi="Arial"/>
+                <w:sz w:val="17"/>
+              </w:rPr>
+            </w:r>
+            <w:r>
+              <w:rPr>
+                <w:rFonts w:ascii="Arial" w:hAnsi="Arial"/>
                 <w:b/>
                 <w:color w:val="FFFFFF"/>
-                <w:sz w:val="19"/>
+                <w:sz w:val="17"/>
               </w:rPr>
               <w:t>Effective Date of Release</w:t>
             </w:r>
@@ -278,16 +299,25 @@
         </w:tc>
         <w:tc>
           <w:tcPr>
-            <w:tcW w:type="dxa" w:w="2160"/>
+            <w:tcW w:type="dxa" w:w="4349"/>
             <w:shd w:val="clear" w:color="auto" w:fill="1F6FEB"/>
           </w:tcPr>
           <w:p>
-            <w:r/>
+            <w:pPr>
+              <w:spacing w:after="30" w:line="240" w:lineRule="auto"/>
+            </w:pPr>
             <w:r>
               <w:rPr>
+                <w:rFonts w:ascii="Arial" w:hAnsi="Arial"/>
+                <w:sz w:val="17"/>
+              </w:rPr>
+            </w:r>
+            <w:r>
+              <w:rPr>
+                <w:rFonts w:ascii="Arial" w:hAnsi="Arial"/>
                 <w:b/>
                 <w:color w:val="FFFFFF"/>
-                <w:sz w:val="19"/>
+                <w:sz w:val="17"/>
               </w:rPr>
               <w:t>Summary of Included Changes</w:t>
             </w:r>
@@ -295,16 +325,25 @@
         </w:tc>
         <w:tc>
           <w:tcPr>
-            <w:tcW w:type="dxa" w:w="2160"/>
+            <w:tcW w:type="dxa" w:w="1699"/>
             <w:shd w:val="clear" w:color="auto" w:fill="1F6FEB"/>
           </w:tcPr>
           <w:p>
-            <w:r/>
+            <w:pPr>
+              <w:spacing w:after="30" w:line="240" w:lineRule="auto"/>
+            </w:pPr>
             <w:r>
               <w:rPr>
+                <w:rFonts w:ascii="Arial" w:hAnsi="Arial"/>
+                <w:sz w:val="17"/>
+              </w:rPr>
+            </w:r>
+            <w:r>
+              <w:rPr>
+                <w:rFonts w:ascii="Arial" w:hAnsi="Arial"/>
                 <w:b/>
                 <w:color w:val="FFFFFF"/>
-                <w:sz w:val="19"/>
+                <w:sz w:val="17"/>
               </w:rPr>
               <w:t>Author</w:t>
             </w:r>
@@ -312,15 +351,27 @@
         </w:tc>
       </w:tr>
       <w:tr>
+        <w:trPr>
+          <w:cantSplit/>
+        </w:trPr>
         <w:tc>
           <w:tcPr>
-            <w:tcW w:type="dxa" w:w="2160"/>
+            <w:tcW w:type="dxa" w:w="1037"/>
           </w:tcPr>
           <w:p>
-            <w:r/>
+            <w:pPr>
+              <w:spacing w:after="30" w:line="240" w:lineRule="auto"/>
+            </w:pPr>
             <w:r>
               <w:rPr>
-                <w:sz w:val="19"/>
+                <w:rFonts w:ascii="Arial" w:hAnsi="Arial"/>
+                <w:sz w:val="17"/>
+              </w:rPr>
+            </w:r>
+            <w:r>
+              <w:rPr>
+                <w:rFonts w:ascii="Arial" w:hAnsi="Arial"/>
+                <w:sz w:val="17"/>
               </w:rPr>
               <w:t>1.0</w:t>
             </w:r>
@@ -328,13 +379,22 @@
         </w:tc>
         <w:tc>
           <w:tcPr>
-            <w:tcW w:type="dxa" w:w="2160"/>
+            <w:tcW w:type="dxa" w:w="1613"/>
           </w:tcPr>
           <w:p>
-            <w:r/>
+            <w:pPr>
+              <w:spacing w:after="30" w:line="240" w:lineRule="auto"/>
+            </w:pPr>
             <w:r>
               <w:rPr>
-                <w:sz w:val="19"/>
+                <w:rFonts w:ascii="Arial" w:hAnsi="Arial"/>
+                <w:sz w:val="17"/>
+              </w:rPr>
+            </w:r>
+            <w:r>
+              <w:rPr>
+                <w:rFonts w:ascii="Arial" w:hAnsi="Arial"/>
+                <w:sz w:val="17"/>
               </w:rPr>
               <w:t>02 July 2026</w:t>
             </w:r>
@@ -342,13 +402,22 @@
         </w:tc>
         <w:tc>
           <w:tcPr>
-            <w:tcW w:type="dxa" w:w="2160"/>
+            <w:tcW w:type="dxa" w:w="4349"/>
           </w:tcPr>
           <w:p>
-            <w:r/>
+            <w:pPr>
+              <w:spacing w:after="30" w:line="240" w:lineRule="auto"/>
+            </w:pPr>
             <w:r>
               <w:rPr>
-                <w:sz w:val="19"/>
+                <w:rFonts w:ascii="Arial" w:hAnsi="Arial"/>
+                <w:sz w:val="17"/>
+              </w:rPr>
+            </w:r>
+            <w:r>
+              <w:rPr>
+                <w:rFonts w:ascii="Arial" w:hAnsi="Arial"/>
+                <w:sz w:val="17"/>
               </w:rPr>
               <w:t>First version — step-by-step guide to all 31 CKA labs across five domains (Cluster Architecture &amp; Installation, Workloads &amp; Scheduling, Services &amp; Networking, Storage, Troubleshooting); MD and DOCX generated from one source</w:t>
             </w:r>
@@ -356,13 +425,95 @@
         </w:tc>
         <w:tc>
           <w:tcPr>
-            <w:tcW w:type="dxa" w:w="2160"/>
+            <w:tcW w:type="dxa" w:w="1699"/>
           </w:tcPr>
           <w:p>
-            <w:r/>
+            <w:pPr>
+              <w:spacing w:after="30" w:line="240" w:lineRule="auto"/>
+            </w:pPr>
             <w:r>
               <w:rPr>
-                <w:sz w:val="19"/>
+                <w:rFonts w:ascii="Arial" w:hAnsi="Arial"/>
+                <w:sz w:val="17"/>
+              </w:rPr>
+            </w:r>
+            <w:r>
+              <w:rPr>
+                <w:rFonts w:ascii="Arial" w:hAnsi="Arial"/>
+                <w:sz w:val="17"/>
+              </w:rPr>
+              <w:t>Tertiary Infotech Academy Pte Ltd</w:t>
+            </w:r>
+          </w:p>
+        </w:tc>
+      </w:tr>
+      <w:tr>
+        <w:trPr>
+          <w:cantSplit/>
+        </w:trPr>
+        <w:tc>
+          <w:tcPr>
+            <w:tcW w:type="dxa" w:w="1037"/>
+          </w:tcPr>
+          <w:p>
+            <w:pPr>
+              <w:spacing w:after="30" w:line="240" w:lineRule="auto"/>
+            </w:pPr>
+            <w:r>
+              <w:rPr>
+                <w:rFonts w:ascii="Arial" w:hAnsi="Arial"/>
+                <w:sz w:val="17"/>
+              </w:rPr>
+              <w:t>1.1</w:t>
+            </w:r>
+          </w:p>
+        </w:tc>
+        <w:tc>
+          <w:tcPr>
+            <w:tcW w:type="dxa" w:w="1613"/>
+          </w:tcPr>
+          <w:p>
+            <w:pPr>
+              <w:spacing w:after="30" w:line="240" w:lineRule="auto"/>
+            </w:pPr>
+            <w:r>
+              <w:rPr>
+                <w:rFonts w:ascii="Arial" w:hAnsi="Arial"/>
+                <w:sz w:val="17"/>
+              </w:rPr>
+              <w:t>14 July 2026</w:t>
+            </w:r>
+          </w:p>
+        </w:tc>
+        <w:tc>
+          <w:tcPr>
+            <w:tcW w:type="dxa" w:w="4349"/>
+          </w:tcPr>
+          <w:p>
+            <w:pPr>
+              <w:spacing w:after="30" w:line="240" w:lineRule="auto"/>
+            </w:pPr>
+            <w:r>
+              <w:rPr>
+                <w:rFonts w:ascii="Arial" w:hAnsi="Arial"/>
+                <w:sz w:val="17"/>
+              </w:rPr>
+              <w:t>WSQ tooling refresh; revalidated all 31 labs, TOC, cover layout, and practice exam.</w:t>
+            </w:r>
+          </w:p>
+        </w:tc>
+        <w:tc>
+          <w:tcPr>
+            <w:tcW w:type="dxa" w:w="1699"/>
+          </w:tcPr>
+          <w:p>
+            <w:pPr>
+              <w:spacing w:after="30" w:line="240" w:lineRule="auto"/>
+            </w:pPr>
+            <w:r>
+              <w:rPr>
+                <w:rFonts w:ascii="Arial" w:hAnsi="Arial"/>
+                <w:sz w:val="17"/>
               </w:rPr>
               <w:t>Tertiary Infotech Academy Pte Ltd</w:t>
             </w:r>
@@ -597,6 +748,10 @@
         <w:gridCol w:w="2880"/>
       </w:tblGrid>
       <w:tr>
+        <w:trPr>
+          <w:tblHeader w:val="true"/>
+          <w:cantSplit/>
+        </w:trPr>
         <w:tc>
           <w:tcPr>
             <w:tcW w:type="dxa" w:w="2880"/>
@@ -650,6 +805,9 @@
         </w:tc>
       </w:tr>
       <w:tr>
+        <w:trPr>
+          <w:cantSplit/>
+        </w:trPr>
         <w:tc>
           <w:tcPr>
             <w:tcW w:type="dxa" w:w="2880"/>
@@ -694,6 +852,9 @@
         </w:tc>
       </w:tr>
       <w:tr>
+        <w:trPr>
+          <w:cantSplit/>
+        </w:trPr>
         <w:tc>
           <w:tcPr>
             <w:tcW w:type="dxa" w:w="2880"/>
@@ -738,6 +899,9 @@
         </w:tc>
       </w:tr>
       <w:tr>
+        <w:trPr>
+          <w:cantSplit/>
+        </w:trPr>
         <w:tc>
           <w:tcPr>
             <w:tcW w:type="dxa" w:w="2880"/>
@@ -782,6 +946,9 @@
         </w:tc>
       </w:tr>
       <w:tr>
+        <w:trPr>
+          <w:cantSplit/>
+        </w:trPr>
         <w:tc>
           <w:tcPr>
             <w:tcW w:type="dxa" w:w="2880"/>
@@ -826,6 +993,9 @@
         </w:tc>
       </w:tr>
       <w:tr>
+        <w:trPr>
+          <w:cantSplit/>
+        </w:trPr>
         <w:tc>
           <w:tcPr>
             <w:tcW w:type="dxa" w:w="2880"/>
@@ -899,6 +1069,10 @@
         <w:gridCol w:w="2880"/>
       </w:tblGrid>
       <w:tr>
+        <w:trPr>
+          <w:tblHeader w:val="true"/>
+          <w:cantSplit/>
+        </w:trPr>
         <w:tc>
           <w:tcPr>
             <w:tcW w:type="dxa" w:w="2880"/>
@@ -952,6 +1126,9 @@
         </w:tc>
       </w:tr>
       <w:tr>
+        <w:trPr>
+          <w:cantSplit/>
+        </w:trPr>
         <w:tc>
           <w:tcPr>
             <w:tcW w:type="dxa" w:w="2880"/>
@@ -996,6 +1173,9 @@
         </w:tc>
       </w:tr>
       <w:tr>
+        <w:trPr>
+          <w:cantSplit/>
+        </w:trPr>
         <w:tc>
           <w:tcPr>
             <w:tcW w:type="dxa" w:w="2880"/>
@@ -1040,6 +1220,9 @@
         </w:tc>
       </w:tr>
       <w:tr>
+        <w:trPr>
+          <w:cantSplit/>
+        </w:trPr>
         <w:tc>
           <w:tcPr>
             <w:tcW w:type="dxa" w:w="2880"/>
@@ -1084,6 +1267,9 @@
         </w:tc>
       </w:tr>
       <w:tr>
+        <w:trPr>
+          <w:cantSplit/>
+        </w:trPr>
         <w:tc>
           <w:tcPr>
             <w:tcW w:type="dxa" w:w="2880"/>
@@ -1128,6 +1314,9 @@
         </w:tc>
       </w:tr>
       <w:tr>
+        <w:trPr>
+          <w:cantSplit/>
+        </w:trPr>
         <w:tc>
           <w:tcPr>
             <w:tcW w:type="dxa" w:w="2880"/>
@@ -1172,6 +1361,9 @@
         </w:tc>
       </w:tr>
       <w:tr>
+        <w:trPr>
+          <w:cantSplit/>
+        </w:trPr>
         <w:tc>
           <w:tcPr>
             <w:tcW w:type="dxa" w:w="2880"/>
@@ -1216,6 +1408,9 @@
         </w:tc>
       </w:tr>
       <w:tr>
+        <w:trPr>
+          <w:cantSplit/>
+        </w:trPr>
         <w:tc>
           <w:tcPr>
             <w:tcW w:type="dxa" w:w="2880"/>
@@ -1804,7 +1999,7 @@
           <w:color w:val="111827"/>
           <w:sz w:val="18"/>
         </w:rPr>
-        <w:t>curl -fsSL https://pkgs.k8s.io/core:/stable:/v1.31/deb/Release.key | \</w:t>
+        <w:t>curl -fsSL https://pkgs.k8s.io/core:/stable:/v1.35/deb/Release.key | \</w:t>
       </w:r>
     </w:p>
     <w:p>
@@ -1834,7 +2029,7 @@
           <w:color w:val="111827"/>
           <w:sz w:val="18"/>
         </w:rPr>
-        <w:t>echo 'deb [signed-by=/etc/apt/keyrings/kubernetes-apt-keyring.gpg] https://pkgs.k8s.io/core:/stable:/v1.31/deb/ /' | \</w:t>
+        <w:t>echo 'deb [signed-by=/etc/apt/keyrings/kubernetes-apt-keyring.gpg] https://pkgs.k8s.io/core:/stable:/v1.35/deb/ /' | \</w:t>
       </w:r>
     </w:p>
     <w:p>
@@ -1946,7 +2141,7 @@
         <w:t xml:space="preserve">Test it: </w:t>
       </w:r>
       <w:r>
-        <w:t>kubeadm version shows v1.31.x, containerd is active, and crictl reports the runtime version.</w:t>
+        <w:t>kubeadm version shows v1.35.x, containerd is active, and crictl reports the runtime version.</w:t>
       </w:r>
     </w:p>
     <w:p/>
@@ -17380,6 +17575,10 @@
         <w:gridCol w:w="4320"/>
       </w:tblGrid>
       <w:tr>
+        <w:trPr>
+          <w:tblHeader w:val="true"/>
+          <w:cantSplit/>
+        </w:trPr>
         <w:tc>
           <w:tcPr>
             <w:tcW w:type="dxa" w:w="2880"/>
@@ -17416,6 +17615,9 @@
         </w:tc>
       </w:tr>
       <w:tr>
+        <w:trPr>
+          <w:cantSplit/>
+        </w:trPr>
         <w:tc>
           <w:tcPr>
             <w:tcW w:type="dxa" w:w="2880"/>
@@ -17446,6 +17648,9 @@
         </w:tc>
       </w:tr>
       <w:tr>
+        <w:trPr>
+          <w:cantSplit/>
+        </w:trPr>
         <w:tc>
           <w:tcPr>
             <w:tcW w:type="dxa" w:w="2880"/>
@@ -17476,6 +17681,9 @@
         </w:tc>
       </w:tr>
       <w:tr>
+        <w:trPr>
+          <w:cantSplit/>
+        </w:trPr>
         <w:tc>
           <w:tcPr>
             <w:tcW w:type="dxa" w:w="2880"/>
@@ -17506,6 +17714,9 @@
         </w:tc>
       </w:tr>
       <w:tr>
+        <w:trPr>
+          <w:cantSplit/>
+        </w:trPr>
         <w:tc>
           <w:tcPr>
             <w:tcW w:type="dxa" w:w="2880"/>
@@ -17536,6 +17747,9 @@
         </w:tc>
       </w:tr>
       <w:tr>
+        <w:trPr>
+          <w:cantSplit/>
+        </w:trPr>
         <w:tc>
           <w:tcPr>
             <w:tcW w:type="dxa" w:w="2880"/>
@@ -17566,6 +17780,9 @@
         </w:tc>
       </w:tr>
       <w:tr>
+        <w:trPr>
+          <w:cantSplit/>
+        </w:trPr>
         <w:tc>
           <w:tcPr>
             <w:tcW w:type="dxa" w:w="2880"/>
@@ -17596,6 +17813,9 @@
         </w:tc>
       </w:tr>
       <w:tr>
+        <w:trPr>
+          <w:cantSplit/>
+        </w:trPr>
         <w:tc>
           <w:tcPr>
             <w:tcW w:type="dxa" w:w="2880"/>
@@ -17626,6 +17846,9 @@
         </w:tc>
       </w:tr>
       <w:tr>
+        <w:trPr>
+          <w:cantSplit/>
+        </w:trPr>
         <w:tc>
           <w:tcPr>
             <w:tcW w:type="dxa" w:w="2880"/>
@@ -17656,6 +17879,9 @@
         </w:tc>
       </w:tr>
       <w:tr>
+        <w:trPr>
+          <w:cantSplit/>
+        </w:trPr>
         <w:tc>
           <w:tcPr>
             <w:tcW w:type="dxa" w:w="2880"/>
@@ -17686,6 +17912,9 @@
         </w:tc>
       </w:tr>
       <w:tr>
+        <w:trPr>
+          <w:cantSplit/>
+        </w:trPr>
         <w:tc>
           <w:tcPr>
             <w:tcW w:type="dxa" w:w="2880"/>
@@ -17716,6 +17945,9 @@
         </w:tc>
       </w:tr>
       <w:tr>
+        <w:trPr>
+          <w:cantSplit/>
+        </w:trPr>
         <w:tc>
           <w:tcPr>
             <w:tcW w:type="dxa" w:w="2880"/>
@@ -17746,6 +17978,9 @@
         </w:tc>
       </w:tr>
       <w:tr>
+        <w:trPr>
+          <w:cantSplit/>
+        </w:trPr>
         <w:tc>
           <w:tcPr>
             <w:tcW w:type="dxa" w:w="2880"/>
@@ -17776,6 +18011,9 @@
         </w:tc>
       </w:tr>
       <w:tr>
+        <w:trPr>
+          <w:cantSplit/>
+        </w:trPr>
         <w:tc>
           <w:tcPr>
             <w:tcW w:type="dxa" w:w="2880"/>
@@ -17806,6 +18044,9 @@
         </w:tc>
       </w:tr>
       <w:tr>
+        <w:trPr>
+          <w:cantSplit/>
+        </w:trPr>
         <w:tc>
           <w:tcPr>
             <w:tcW w:type="dxa" w:w="2880"/>
@@ -17856,6 +18097,10 @@
         <w:gridCol w:w="4320"/>
       </w:tblGrid>
       <w:tr>
+        <w:trPr>
+          <w:tblHeader w:val="true"/>
+          <w:cantSplit/>
+        </w:trPr>
         <w:tc>
           <w:tcPr>
             <w:tcW w:type="dxa" w:w="2880"/>
@@ -17892,6 +18137,9 @@
         </w:tc>
       </w:tr>
       <w:tr>
+        <w:trPr>
+          <w:cantSplit/>
+        </w:trPr>
         <w:tc>
           <w:tcPr>
             <w:tcW w:type="dxa" w:w="2880"/>
@@ -17922,6 +18170,9 @@
         </w:tc>
       </w:tr>
       <w:tr>
+        <w:trPr>
+          <w:cantSplit/>
+        </w:trPr>
         <w:tc>
           <w:tcPr>
             <w:tcW w:type="dxa" w:w="2880"/>
@@ -17952,6 +18203,9 @@
         </w:tc>
       </w:tr>
       <w:tr>
+        <w:trPr>
+          <w:cantSplit/>
+        </w:trPr>
         <w:tc>
           <w:tcPr>
             <w:tcW w:type="dxa" w:w="2880"/>
@@ -17982,6 +18236,9 @@
         </w:tc>
       </w:tr>
       <w:tr>
+        <w:trPr>
+          <w:cantSplit/>
+        </w:trPr>
         <w:tc>
           <w:tcPr>
             <w:tcW w:type="dxa" w:w="2880"/>
@@ -18012,6 +18269,9 @@
         </w:tc>
       </w:tr>
       <w:tr>
+        <w:trPr>
+          <w:cantSplit/>
+        </w:trPr>
         <w:tc>
           <w:tcPr>
             <w:tcW w:type="dxa" w:w="2880"/>
@@ -18042,6 +18302,9 @@
         </w:tc>
       </w:tr>
       <w:tr>
+        <w:trPr>
+          <w:cantSplit/>
+        </w:trPr>
         <w:tc>
           <w:tcPr>
             <w:tcW w:type="dxa" w:w="2880"/>
@@ -18072,6 +18335,9 @@
         </w:tc>
       </w:tr>
       <w:tr>
+        <w:trPr>
+          <w:cantSplit/>
+        </w:trPr>
         <w:tc>
           <w:tcPr>
             <w:tcW w:type="dxa" w:w="2880"/>
@@ -18102,6 +18368,9 @@
         </w:tc>
       </w:tr>
       <w:tr>
+        <w:trPr>
+          <w:cantSplit/>
+        </w:trPr>
         <w:tc>
           <w:tcPr>
             <w:tcW w:type="dxa" w:w="2880"/>
@@ -18132,6 +18401,9 @@
         </w:tc>
       </w:tr>
       <w:tr>
+        <w:trPr>
+          <w:cantSplit/>
+        </w:trPr>
         <w:tc>
           <w:tcPr>
             <w:tcW w:type="dxa" w:w="2880"/>
@@ -18162,6 +18434,9 @@
         </w:tc>
       </w:tr>
       <w:tr>
+        <w:trPr>
+          <w:cantSplit/>
+        </w:trPr>
         <w:tc>
           <w:tcPr>
             <w:tcW w:type="dxa" w:w="2880"/>
@@ -18192,6 +18467,9 @@
         </w:tc>
       </w:tr>
       <w:tr>
+        <w:trPr>
+          <w:cantSplit/>
+        </w:trPr>
         <w:tc>
           <w:tcPr>
             <w:tcW w:type="dxa" w:w="2880"/>
@@ -18222,6 +18500,9 @@
         </w:tc>
       </w:tr>
       <w:tr>
+        <w:trPr>
+          <w:cantSplit/>
+        </w:trPr>
         <w:tc>
           <w:tcPr>
             <w:tcW w:type="dxa" w:w="2880"/>
@@ -18252,6 +18533,9 @@
         </w:tc>
       </w:tr>
       <w:tr>
+        <w:trPr>
+          <w:cantSplit/>
+        </w:trPr>
         <w:tc>
           <w:tcPr>
             <w:tcW w:type="dxa" w:w="2880"/>
@@ -18282,6 +18566,9 @@
         </w:tc>
       </w:tr>
       <w:tr>
+        <w:trPr>
+          <w:cantSplit/>
+        </w:trPr>
         <w:tc>
           <w:tcPr>
             <w:tcW w:type="dxa" w:w="2880"/>
@@ -18312,6 +18599,9 @@
         </w:tc>
       </w:tr>
       <w:tr>
+        <w:trPr>
+          <w:cantSplit/>
+        </w:trPr>
         <w:tc>
           <w:tcPr>
             <w:tcW w:type="dxa" w:w="2880"/>
@@ -18342,6 +18632,9 @@
         </w:tc>
       </w:tr>
       <w:tr>
+        <w:trPr>
+          <w:cantSplit/>
+        </w:trPr>
         <w:tc>
           <w:tcPr>
             <w:tcW w:type="dxa" w:w="2880"/>
@@ -18372,6 +18665,9 @@
         </w:tc>
       </w:tr>
       <w:tr>
+        <w:trPr>
+          <w:cantSplit/>
+        </w:trPr>
         <w:tc>
           <w:tcPr>
             <w:tcW w:type="dxa" w:w="2880"/>
@@ -18402,6 +18698,9 @@
         </w:tc>
       </w:tr>
       <w:tr>
+        <w:trPr>
+          <w:cantSplit/>
+        </w:trPr>
         <w:tc>
           <w:tcPr>
             <w:tcW w:type="dxa" w:w="2880"/>
@@ -18432,6 +18731,9 @@
         </w:tc>
       </w:tr>
       <w:tr>
+        <w:trPr>
+          <w:cantSplit/>
+        </w:trPr>
         <w:tc>
           <w:tcPr>
             <w:tcW w:type="dxa" w:w="2880"/>
@@ -18462,6 +18764,9 @@
         </w:tc>
       </w:tr>
       <w:tr>
+        <w:trPr>
+          <w:cantSplit/>
+        </w:trPr>
         <w:tc>
           <w:tcPr>
             <w:tcW w:type="dxa" w:w="2880"/>
@@ -18492,6 +18797,9 @@
         </w:tc>
       </w:tr>
       <w:tr>
+        <w:trPr>
+          <w:cantSplit/>
+        </w:trPr>
         <w:tc>
           <w:tcPr>
             <w:tcW w:type="dxa" w:w="2880"/>
@@ -18522,6 +18830,9 @@
         </w:tc>
       </w:tr>
       <w:tr>
+        <w:trPr>
+          <w:cantSplit/>
+        </w:trPr>
         <w:tc>
           <w:tcPr>
             <w:tcW w:type="dxa" w:w="2880"/>
@@ -18552,6 +18863,9 @@
         </w:tc>
       </w:tr>
       <w:tr>
+        <w:trPr>
+          <w:cantSplit/>
+        </w:trPr>
         <w:tc>
           <w:tcPr>
             <w:tcW w:type="dxa" w:w="2880"/>
@@ -18582,6 +18896,9 @@
         </w:tc>
       </w:tr>
       <w:tr>
+        <w:trPr>
+          <w:cantSplit/>
+        </w:trPr>
         <w:tc>
           <w:tcPr>
             <w:tcW w:type="dxa" w:w="2880"/>
@@ -18612,6 +18929,9 @@
         </w:tc>
       </w:tr>
       <w:tr>
+        <w:trPr>
+          <w:cantSplit/>
+        </w:trPr>
         <w:tc>
           <w:tcPr>
             <w:tcW w:type="dxa" w:w="2880"/>
@@ -18642,6 +18962,9 @@
         </w:tc>
       </w:tr>
       <w:tr>
+        <w:trPr>
+          <w:cantSplit/>
+        </w:trPr>
         <w:tc>
           <w:tcPr>
             <w:tcW w:type="dxa" w:w="2880"/>
@@ -18672,6 +18995,9 @@
         </w:tc>
       </w:tr>
       <w:tr>
+        <w:trPr>
+          <w:cantSplit/>
+        </w:trPr>
         <w:tc>
           <w:tcPr>
             <w:tcW w:type="dxa" w:w="2880"/>
@@ -18702,6 +19028,9 @@
         </w:tc>
       </w:tr>
       <w:tr>
+        <w:trPr>
+          <w:cantSplit/>
+        </w:trPr>
         <w:tc>
           <w:tcPr>
             <w:tcW w:type="dxa" w:w="2880"/>
@@ -18732,6 +19061,9 @@
         </w:tc>
       </w:tr>
       <w:tr>
+        <w:trPr>
+          <w:cantSplit/>
+        </w:trPr>
         <w:tc>
           <w:tcPr>
             <w:tcW w:type="dxa" w:w="2880"/>
@@ -18762,6 +19094,9 @@
         </w:tc>
       </w:tr>
       <w:tr>
+        <w:trPr>
+          <w:cantSplit/>
+        </w:trPr>
         <w:tc>
           <w:tcPr>
             <w:tcW w:type="dxa" w:w="2880"/>
@@ -18792,6 +19127,9 @@
         </w:tc>
       </w:tr>
       <w:tr>
+        <w:trPr>
+          <w:cantSplit/>
+        </w:trPr>
         <w:tc>
           <w:tcPr>
             <w:tcW w:type="dxa" w:w="2880"/>
@@ -18822,6 +19160,9 @@
         </w:tc>
       </w:tr>
       <w:tr>
+        <w:trPr>
+          <w:cantSplit/>
+        </w:trPr>
         <w:tc>
           <w:tcPr>
             <w:tcW w:type="dxa" w:w="2880"/>
@@ -18852,6 +19193,9 @@
         </w:tc>
       </w:tr>
       <w:tr>
+        <w:trPr>
+          <w:cantSplit/>
+        </w:trPr>
         <w:tc>
           <w:tcPr>
             <w:tcW w:type="dxa" w:w="2880"/>
@@ -18882,6 +19226,9 @@
         </w:tc>
       </w:tr>
       <w:tr>
+        <w:trPr>
+          <w:cantSplit/>
+        </w:trPr>
         <w:tc>
           <w:tcPr>
             <w:tcW w:type="dxa" w:w="2880"/>
@@ -18912,6 +19259,9 @@
         </w:tc>
       </w:tr>
       <w:tr>
+        <w:trPr>
+          <w:cantSplit/>
+        </w:trPr>
         <w:tc>
           <w:tcPr>
             <w:tcW w:type="dxa" w:w="2880"/>
@@ -18942,6 +19292,9 @@
         </w:tc>
       </w:tr>
       <w:tr>
+        <w:trPr>
+          <w:cantSplit/>
+        </w:trPr>
         <w:tc>
           <w:tcPr>
             <w:tcW w:type="dxa" w:w="2880"/>
@@ -18972,6 +19325,9 @@
         </w:tc>
       </w:tr>
       <w:tr>
+        <w:trPr>
+          <w:cantSplit/>
+        </w:trPr>
         <w:tc>
           <w:tcPr>
             <w:tcW w:type="dxa" w:w="2880"/>

</xml_diff>